<commit_message>
Make the AWS setup guide easier to read without dropping the commands.
Co-authored-by: Cursor <cursoragent@cursor.com>
</commit_message>
<xml_diff>
--- a/PlacementHub_AWS_First_Time_Setup_Guide.docx
+++ b/PlacementHub_AWS_First_Time_Setup_Guide.docx
@@ -243,15 +243,8 @@
             <w:vAlign w:val="top"/>
           </w:tcPr>
           <w:p>
-            <w:pPr>
-              <w:spacing w:after="0" w:line="276" w:lineRule="auto"/>
-              <w:rPr/>
-            </w:pPr>
-            <w:r>
-              <w:rPr>
-                <w:rtl w:val="0"/>
-              </w:rPr>
-              <w:t xml:space="preserve">1. What this guide is</w:t>
+            <w:r>
+              <w:t>Background</w:t>
             </w:r>
           </w:p>
         </w:tc>
@@ -272,15 +265,8 @@
             <w:vAlign w:val="top"/>
           </w:tcPr>
           <w:p>
-            <w:pPr>
-              <w:spacing w:after="0" w:line="276" w:lineRule="auto"/>
-              <w:rPr/>
-            </w:pPr>
-            <w:r>
-              <w:rPr>
-                <w:rtl w:val="0"/>
-              </w:rPr>
-              <w:t xml:space="preserve">Part F — DNS, Nginx second site, HTTPS</w:t>
+            <w:r>
+              <w:t>DNS, Nginx, and HTTPS</w:t>
             </w:r>
           </w:p>
         </w:tc>
@@ -308,15 +294,8 @@
             <w:vAlign w:val="top"/>
           </w:tcPr>
           <w:p>
-            <w:pPr>
-              <w:spacing w:after="0" w:line="276" w:lineRule="auto"/>
-              <w:rPr/>
-            </w:pPr>
-            <w:r>
-              <w:rPr>
-                <w:rtl w:val="0"/>
-              </w:rPr>
-              <w:t xml:space="preserve">2. Summary — the first-time setup flow</w:t>
+            <w:r>
+              <w:t>The shared database</w:t>
             </w:r>
           </w:p>
         </w:tc>
@@ -337,15 +316,8 @@
             <w:vAlign w:val="top"/>
           </w:tcPr>
           <w:p>
-            <w:pPr>
-              <w:spacing w:after="0" w:line="276" w:lineRule="auto"/>
-              <w:rPr/>
-            </w:pPr>
-            <w:r>
-              <w:rPr>
-                <w:rtl w:val="0"/>
-              </w:rPr>
-              <w:t xml:space="preserve">Part G — Restart after reboot</w:t>
+            <w:r>
+              <w:t>Restart after reboot</w:t>
             </w:r>
           </w:p>
         </w:tc>
@@ -374,7 +346,7 @@
           </w:tcPr>
           <w:p>
             <w:r>
-              <w:t>3. Where PlacementHub runs</w:t>
+              <w:t>PlacementHub folder structure</w:t>
             </w:r>
           </w:p>
         </w:tc>
@@ -395,15 +367,8 @@
             <w:vAlign w:val="top"/>
           </w:tcPr>
           <w:p>
-            <w:pPr>
-              <w:spacing w:after="0" w:line="276" w:lineRule="auto"/>
-              <w:rPr/>
-            </w:pPr>
-            <w:r>
-              <w:rPr>
-                <w:rtl w:val="0"/>
-              </w:rPr>
-              <w:t xml:space="preserve">Part H — Scheduled semester rollover</w:t>
+            <w:r>
+              <w:t>Scheduled semester rollover</w:t>
             </w:r>
           </w:p>
         </w:tc>
@@ -431,15 +396,8 @@
             <w:vAlign w:val="top"/>
           </w:tcPr>
           <w:p>
-            <w:pPr>
-              <w:spacing w:after="0" w:line="276" w:lineRule="auto"/>
-              <w:rPr/>
-            </w:pPr>
-            <w:r>
-              <w:rPr>
-                <w:rtl w:val="0"/>
-              </w:rPr>
-              <w:t xml:space="preserve">4. PlacementHub folder structure</w:t>
+            <w:r>
+              <w:t>Compared with InternSafar's first-time setup</w:t>
             </w:r>
           </w:p>
         </w:tc>
@@ -460,15 +418,8 @@
             <w:vAlign w:val="top"/>
           </w:tcPr>
           <w:p>
-            <w:pPr>
-              <w:spacing w:after="0" w:line="276" w:lineRule="auto"/>
-              <w:rPr/>
-            </w:pPr>
-            <w:r>
-              <w:rPr>
-                <w:rtl w:val="0"/>
-              </w:rPr>
-              <w:t xml:space="preserve">Part I — Conditional fixes</w:t>
+            <w:r>
+              <w:t>Conditional fixes</w:t>
             </w:r>
           </w:p>
         </w:tc>
@@ -496,15 +447,8 @@
             <w:vAlign w:val="top"/>
           </w:tcPr>
           <w:p>
-            <w:pPr>
-              <w:spacing w:after="0" w:line="276" w:lineRule="auto"/>
-              <w:rPr/>
-            </w:pPr>
-            <w:r>
-              <w:rPr>
-                <w:rtl w:val="0"/>
-              </w:rPr>
-              <w:t xml:space="preserve">5. Compared with InternSafar's first-time setup</w:t>
+            <w:r>
+              <w:t>Decisions still open</w:t>
             </w:r>
           </w:p>
         </w:tc>
@@ -525,15 +469,8 @@
             <w:vAlign w:val="top"/>
           </w:tcPr>
           <w:p>
-            <w:pPr>
-              <w:spacing w:after="0" w:line="276" w:lineRule="auto"/>
-              <w:rPr/>
-            </w:pPr>
-            <w:r>
-              <w:rPr>
-                <w:rtl w:val="0"/>
-              </w:rPr>
-              <w:t xml:space="preserve">Part J — Backups and recovery</w:t>
+            <w:r>
+              <w:t>Backups and recovery</w:t>
             </w:r>
           </w:p>
         </w:tc>
@@ -561,15 +498,8 @@
             <w:vAlign w:val="top"/>
           </w:tcPr>
           <w:p>
-            <w:pPr>
-              <w:spacing w:after="0" w:line="276" w:lineRule="auto"/>
-              <w:rPr/>
-            </w:pPr>
-            <w:r>
-              <w:rPr>
-                <w:rtl w:val="0"/>
-              </w:rPr>
-              <w:t xml:space="preserve">6. Decisions to confirm before starting</w:t>
+            <w:r>
+              <w:t>Values to fill in</w:t>
             </w:r>
           </w:p>
         </w:tc>
@@ -590,15 +520,8 @@
             <w:vAlign w:val="top"/>
           </w:tcPr>
           <w:p>
-            <w:pPr>
-              <w:spacing w:after="0" w:line="276" w:lineRule="auto"/>
-              <w:rPr/>
-            </w:pPr>
-            <w:r>
-              <w:rPr>
-                <w:rtl w:val="0"/>
-              </w:rPr>
-              <w:t xml:space="preserve">Part K — Final verification</w:t>
+            <w:r>
+              <w:t>Final verification</w:t>
             </w:r>
           </w:p>
         </w:tc>
@@ -626,15 +549,8 @@
             <w:vAlign w:val="top"/>
           </w:tcPr>
           <w:p>
-            <w:pPr>
-              <w:spacing w:after="0" w:line="276" w:lineRule="auto"/>
-              <w:rPr/>
-            </w:pPr>
-            <w:r>
-              <w:rPr>
-                <w:rtl w:val="0"/>
-              </w:rPr>
-              <w:t xml:space="preserve">7. Values to fill in</w:t>
+            <w:r>
+              <w:t>Before you start</w:t>
             </w:r>
           </w:p>
         </w:tc>
@@ -655,15 +571,8 @@
             <w:vAlign w:val="top"/>
           </w:tcPr>
           <w:p>
-            <w:pPr>
-              <w:spacing w:after="0" w:line="276" w:lineRule="auto"/>
-              <w:rPr/>
-            </w:pPr>
-            <w:r>
-              <w:rPr>
-                <w:rtl w:val="0"/>
-              </w:rPr>
-              <w:t xml:space="preserve">Quick checklist</w:t>
+            <w:r>
+              <w:t>Quick checklist</w:t>
             </w:r>
           </w:p>
         </w:tc>
@@ -692,7 +601,7 @@
           </w:tcPr>
           <w:p>
             <w:r>
-              <w:t>Before you start — website stays up; guide stays on GitHub</w:t>
+              <w:t>Check the server</w:t>
             </w:r>
           </w:p>
         </w:tc>
@@ -713,15 +622,8 @@
             <w:vAlign w:val="top"/>
           </w:tcPr>
           <w:p>
-            <w:pPr>
-              <w:spacing w:after="0" w:line="276" w:lineRule="auto"/>
-              <w:rPr/>
-            </w:pPr>
-            <w:r>
-              <w:rPr>
-                <w:rtl w:val="0"/>
-              </w:rPr>
-              <w:t xml:space="preserve">Appendix A — PlacementHub table notes (86 tables)</w:t>
+            <w:r>
+              <w:t>PlacementHub table notes (86 tables)</w:t>
             </w:r>
           </w:p>
         </w:tc>
@@ -749,15 +651,8 @@
             <w:vAlign w:val="top"/>
           </w:tcPr>
           <w:p>
-            <w:pPr>
-              <w:spacing w:after="0" w:line="276" w:lineRule="auto"/>
-              <w:rPr/>
-            </w:pPr>
-            <w:r>
-              <w:rPr>
-                <w:rtl w:val="0"/>
-              </w:rPr>
-              <w:t xml:space="preserve">Part A — Check the server</w:t>
+            <w:r>
+              <w:t>Upload and install the PlacementHub code</w:t>
             </w:r>
           </w:p>
         </w:tc>
@@ -778,15 +673,8 @@
             <w:vAlign w:val="top"/>
           </w:tcPr>
           <w:p>
-            <w:pPr>
-              <w:spacing w:after="0" w:line="276" w:lineRule="auto"/>
-              <w:rPr/>
-            </w:pPr>
-            <w:r>
-              <w:rPr>
-                <w:rtl w:val="0"/>
-              </w:rPr>
-              <w:t xml:space="preserve">Appendix B — Migration files (reference only — do not run on RDS)</w:t>
+            <w:r>
+              <w:t>Migration files (reference only — do not run on RDS)</w:t>
             </w:r>
           </w:p>
         </w:tc>
@@ -814,15 +702,8 @@
             <w:vAlign w:val="top"/>
           </w:tcPr>
           <w:p>
-            <w:pPr>
-              <w:spacing w:after="0" w:line="276" w:lineRule="auto"/>
-              <w:rPr/>
-            </w:pPr>
-            <w:r>
-              <w:rPr>
-                <w:rtl w:val="0"/>
-              </w:rPr>
-              <w:t xml:space="preserve">Part B — Upload and install the PlacementHub code</w:t>
+            <w:r>
+              <w:t>Production .env and connection test</w:t>
             </w:r>
           </w:p>
         </w:tc>
@@ -843,15 +724,8 @@
             <w:vAlign w:val="top"/>
           </w:tcPr>
           <w:p>
-            <w:pPr>
-              <w:spacing w:after="0" w:line="276" w:lineRule="auto"/>
-              <w:rPr/>
-            </w:pPr>
-            <w:r>
-              <w:rPr>
-                <w:rtl w:val="0"/>
-              </w:rPr>
-              <w:t xml:space="preserve">Appendix C — Findings from the source check</w:t>
+            <w:r>
+              <w:t>Findings from the source check</w:t>
             </w:r>
           </w:p>
         </w:tc>
@@ -879,15 +753,8 @@
             <w:vAlign w:val="top"/>
           </w:tcPr>
           <w:p>
-            <w:pPr>
-              <w:spacing w:after="0" w:line="276" w:lineRule="auto"/>
-              <w:rPr/>
-            </w:pPr>
-            <w:r>
-              <w:rPr>
-                <w:rtl w:val="0"/>
-              </w:rPr>
-              <w:t xml:space="preserve">Part C — Production .env and connection test</w:t>
+            <w:r>
+              <w:t>Database (PlacementHub tables only)</w:t>
             </w:r>
           </w:p>
         </w:tc>
@@ -908,15 +775,8 @@
             <w:vAlign w:val="top"/>
           </w:tcPr>
           <w:p>
-            <w:pPr>
-              <w:spacing w:after="0" w:line="276" w:lineRule="auto"/>
-              <w:rPr/>
-            </w:pPr>
-            <w:r>
-              <w:rPr>
-                <w:rtl w:val="0"/>
-              </w:rPr>
-              <w:t xml:space="preserve">Appendix D — Lessons from the earlier InternSafar deployment</w:t>
+            <w:r>
+              <w:t>Lessons from the earlier InternSafar deployment</w:t>
             </w:r>
           </w:p>
         </w:tc>
@@ -944,15 +804,8 @@
             <w:vAlign w:val="top"/>
           </w:tcPr>
           <w:p>
-            <w:pPr>
-              <w:spacing w:after="0" w:line="276" w:lineRule="auto"/>
-              <w:rPr/>
-            </w:pPr>
-            <w:r>
-              <w:rPr>
-                <w:rtl w:val="0"/>
-              </w:rPr>
-              <w:t xml:space="preserve">Part D — Database (PlacementHub tables only)</w:t>
+            <w:r>
+              <w:t>Build and start on port 3001</w:t>
             </w:r>
           </w:p>
         </w:tc>
@@ -973,15 +826,8 @@
             <w:vAlign w:val="top"/>
           </w:tcPr>
           <w:p>
-            <w:pPr>
-              <w:spacing w:after="0" w:line="276" w:lineRule="auto"/>
-              <w:rPr/>
-            </w:pPr>
-            <w:r>
-              <w:rPr>
-                <w:rtl w:val="0"/>
-              </w:rPr>
-              <w:t xml:space="preserve">Appendix E — Documents this guide is based on</w:t>
+            <w:r>
+              <w:t>Documents this guide is based on</w:t>
             </w:r>
           </w:p>
         </w:tc>
@@ -1009,16 +855,7 @@
             <w:vAlign w:val="top"/>
           </w:tcPr>
           <w:p>
-            <w:pPr>
-              <w:spacing w:after="0" w:line="276" w:lineRule="auto"/>
-              <w:rPr/>
-            </w:pPr>
-            <w:r>
-              <w:rPr>
-                <w:rtl w:val="0"/>
-              </w:rPr>
-              <w:t xml:space="preserve">Part E — Build and start on port 3001</w:t>
-            </w:r>
+            <w:r/>
           </w:p>
         </w:tc>
         <w:tc>
@@ -1038,16 +875,7 @@
             <w:vAlign w:val="top"/>
           </w:tcPr>
           <w:p>
-            <w:pPr>
-              <w:spacing w:after="60" w:lineRule="auto"/>
-              <w:rPr/>
-            </w:pPr>
-            <w:r>
-              <w:rPr>
-                <w:rtl w:val="0"/>
-              </w:rPr>
-              <w:t xml:space="preserve"> </w:t>
-            </w:r>
+            <w:r/>
           </w:p>
         </w:tc>
       </w:tr>
@@ -1088,7 +916,7 @@
           <w:szCs w:val="46"/>
           <w:rtl w:val="0"/>
         </w:rPr>
-        <w:t xml:space="preserve">1. What this guide is</w:t>
+        <w:t>Background</w:t>
       </w:r>
     </w:p>
     <w:p>
@@ -1101,18 +929,6 @@
           <w:rtl w:val="0"/>
         </w:rPr>
         <w:t xml:space="preserve">It puts PlacementHub — the campus placement platform in the campus-placement-multiuser repo, running today on Vercel with a Supabase database — into production on AWS for the first time.</w:t>
-      </w:r>
-    </w:p>
-    <w:p>
-      <w:pPr>
-        <w:spacing w:after="60" w:lineRule="auto"/>
-        <w:rPr/>
-      </w:pPr>
-      <w:r>
-        <w:rPr>
-          <w:rtl w:val="0"/>
-        </w:rPr>
-        <w:t>A different app, InternSafar (internsafar.com), already runs on an AWS EC2 server with an RDS PostgreSQL database. PlacementHub is added next to it on that same server and that same database. No new EC2, database, or Elastic IP is created. The only new public name is the subdomain.</w:t>
       </w:r>
     </w:p>
     <w:p>
@@ -1454,6 +1270,120 @@
     </w:p>
     <w:p>
       <w:pPr>
+        <w:spacing w:after="0" w:line="130.9090909090909" w:lineRule="auto"/>
+        <w:rPr/>
+      </w:pPr>
+      <w:r>
+        <w:rPr>
+          <w:rtl w:val="0"/>
+        </w:rPr>
+        <w:t xml:space="preserve"> </w:t>
+      </w:r>
+    </w:p>
+    <w:p>
+      <w:pPr>
+        <w:spacing w:after="0" w:line="130.9090909090909" w:lineRule="auto"/>
+        <w:rPr/>
+      </w:pPr>
+      <w:r>
+        <w:rPr>
+          <w:rtl w:val="0"/>
+        </w:rPr>
+        <w:t xml:space="preserve"> </w:t>
+      </w:r>
+    </w:p>
+    <w:p>
+      <w:pPr>
+        <w:spacing w:after="60" w:lineRule="auto"/>
+        <w:rPr/>
+      </w:pPr>
+      <w:r>
+        <w:rPr>
+          <w:rtl w:val="0"/>
+        </w:rPr>
+        <w:t>The commands below all use that existing database. The name-clash check and the InternSafar before-and-after check are what keep the two apps apart.</w:t>
+      </w:r>
+    </w:p>
+    <w:p>
+      <w:pPr>
+        <w:pStyle w:val="Heading1"/>
+        <w:keepNext w:val="0"/>
+        <w:keepLines w:val="0"/>
+        <w:spacing w:after="80" w:before="360" w:lineRule="auto"/>
+        <w:ind w:left="288" w:firstLine="0"/>
+        <w:rPr>
+          <w:rFonts w:ascii="Open Sans" w:cs="Open Sans" w:eastAsia="Open Sans" w:hAnsi="Open Sans"/>
+          <w:color w:val="000000"/>
+          <w:sz w:val="34"/>
+          <w:szCs w:val="34"/>
+        </w:rPr>
+      </w:pPr>
+      <w:bookmarkStart w:colFirst="0" w:colLast="0" w:name="_oj1j4sh3acpw" w:id="3"/>
+      <w:bookmarkEnd w:id="3"/>
+      <w:r>
+        <w:rPr>
+          <w:rFonts w:ascii="Open Sans" w:cs="Open Sans" w:eastAsia="Open Sans" w:hAnsi="Open Sans"/>
+          <w:color w:val="000000"/>
+          <w:sz w:val="34"/>
+          <w:szCs w:val="34"/>
+          <w:rtl w:val="0"/>
+        </w:rPr>
+        <w:t>The shared database</w:t>
+      </w:r>
+    </w:p>
+    <w:p>
+      <w:pPr>
+        <w:spacing w:after="60" w:lineRule="auto"/>
+        <w:rPr/>
+      </w:pPr>
+      <w:r>
+        <w:rPr>
+          <w:rtl w:val="0"/>
+        </w:rPr>
+        <w:t>PlacementHub’s tables go into the database InternSafar already uses. The database name is read from InternSafar’s settings later in this guide.</w:t>
+      </w:r>
+    </w:p>
+    <w:p>
+      <w:pPr>
+        <w:spacing w:after="20" w:lineRule="auto"/>
+        <w:ind w:left="660" w:hanging="220"/>
+        <w:rPr/>
+      </w:pPr>
+      <w:r>
+        <w:rPr>
+          <w:rtl w:val="0"/>
+        </w:rPr>
+        <w:t xml:space="preserve">•  Why it works: PlacementHub tables have plain names (users, tenants, job_postings …); every InternSafar table starts with ip_ or ism_. Both sets already coexist in PlacementHub's Supabase database.</w:t>
+      </w:r>
+    </w:p>
+    <w:p>
+      <w:pPr>
+        <w:spacing w:after="20" w:lineRule="auto"/>
+        <w:ind w:left="660" w:hanging="220"/>
+        <w:rPr/>
+      </w:pPr>
+      <w:r>
+        <w:rPr>
+          <w:rtl w:val="0"/>
+        </w:rPr>
+        <w:t>•  How it stays safe: before any table is created, a name-clash check must print nothing. After the tables exist, InternSafar’s table list and user count must match the baseline taken at the start.</w:t>
+      </w:r>
+    </w:p>
+    <w:p>
+      <w:pPr>
+        <w:spacing w:after="20" w:lineRule="auto"/>
+        <w:ind w:left="660" w:hanging="220"/>
+        <w:rPr/>
+      </w:pPr>
+      <w:r>
+        <w:rPr>
+          <w:rtl w:val="0"/>
+        </w:rPr>
+        <w:t xml:space="preserve">•  Trade-off: a wrong hand-typed SQL command could reach InternSafar tables, and a database restore affects both apps.</w:t>
+      </w:r>
+    </w:p>
+    <w:p>
+      <w:pPr>
         <w:pStyle w:val="Heading1"/>
         <w:keepNext w:val="0"/>
         <w:keepLines w:val="0"/>
@@ -1466,8 +1396,8 @@
           <w:szCs w:val="46"/>
         </w:rPr>
       </w:pPr>
-      <w:bookmarkStart w:colFirst="0" w:colLast="0" w:name="_rfvrhl55b2gf" w:id="1"/>
-      <w:bookmarkEnd w:id="1"/>
+      <w:bookmarkStart w:colFirst="0" w:colLast="0" w:name="_gfflww74nnmh" w:id="6"/>
+      <w:bookmarkEnd w:id="6"/>
       <w:r>
         <w:rPr>
           <w:rFonts w:ascii="Open Sans" w:cs="Open Sans" w:eastAsia="Open Sans" w:hAnsi="Open Sans"/>
@@ -1476,2353 +1406,7 @@
           <w:szCs w:val="46"/>
           <w:rtl w:val="0"/>
         </w:rPr>
-        <w:t xml:space="preserve">2. Summary — the first-time setup flow</w:t>
-      </w:r>
-    </w:p>
-    <w:p>
-      <w:pPr>
-        <w:spacing w:after="60" w:lineRule="auto"/>
-        <w:rPr/>
-      </w:pPr>
-      <w:r>
-        <w:rPr>
-          <w:rtl w:val="0"/>
-        </w:rPr>
-        <w:t>Ten stages, in this order. They are the ten steps at the start, written out with the commands.</w:t>
-      </w:r>
-    </w:p>
-    <w:tbl>
-      <w:tblPr>
-        <w:tblStyle w:val="Table3"/>
-        <w:tblW w:w="8639.999999999998" w:type="dxa"/>
-        <w:jc w:val="left"/>
-        <w:tblBorders>
-          <w:top w:color="000000" w:space="0" w:sz="0" w:val="nil"/>
-          <w:left w:color="000000" w:space="0" w:sz="0" w:val="nil"/>
-          <w:bottom w:color="000000" w:space="0" w:sz="0" w:val="nil"/>
-          <w:right w:color="000000" w:space="0" w:sz="0" w:val="nil"/>
-          <w:insideH w:color="000000" w:space="0" w:sz="0" w:val="nil"/>
-          <w:insideV w:color="000000" w:space="0" w:sz="0" w:val="nil"/>
-        </w:tblBorders>
-        <w:tblLayout w:type="fixed"/>
-        <w:tblLook w:val="0600"/>
-      </w:tblPr>
-      <w:tblGrid>
-        <w:gridCol w:w="573.0612244897959"/>
-        <w:gridCol w:w="2027.7551020408164"/>
-        <w:gridCol w:w="5186.938775510203"/>
-        <w:gridCol w:w="852.2448979591836"/>
-        <w:tblGridChange w:id="0">
-          <w:tblGrid>
-            <w:gridCol w:w="573.0612244897959"/>
-            <w:gridCol w:w="2027.7551020408164"/>
-            <w:gridCol w:w="5186.938775510203"/>
-            <w:gridCol w:w="852.2448979591836"/>
-          </w:tblGrid>
-        </w:tblGridChange>
-      </w:tblGrid>
-      <w:tr>
-        <w:trPr>
-          <w:cantSplit w:val="0"/>
-          <w:trHeight w:val="270" w:hRule="atLeast"/>
-          <w:tblHeader w:val="0"/>
-        </w:trPr>
-        <w:tc>
-          <w:tcPr>
-            <w:tcBorders>
-              <w:top w:color="bfbfbf" w:space="0" w:sz="8" w:val="single"/>
-              <w:left w:color="bfbfbf" w:space="0" w:sz="8" w:val="single"/>
-              <w:bottom w:color="bfbfbf" w:space="0" w:sz="8" w:val="single"/>
-              <w:right w:color="bfbfbf" w:space="0" w:sz="8" w:val="single"/>
-            </w:tcBorders>
-            <w:shd w:fill="ede7f6" w:val="clear"/>
-            <w:tcMar>
-              <w:top w:w="20.0" w:type="dxa"/>
-              <w:left w:w="80.0" w:type="dxa"/>
-              <w:bottom w:w="20.0" w:type="dxa"/>
-              <w:right w:w="80.0" w:type="dxa"/>
-            </w:tcMar>
-            <w:vAlign w:val="top"/>
-          </w:tcPr>
-          <w:p>
-            <w:pPr>
-              <w:spacing w:after="0" w:line="276" w:lineRule="auto"/>
-              <w:rPr>
-                <w:b w:val="1"/>
-                <w:bCs w:val="1"/>
-                <w:sz w:val="17"/>
-                <w:szCs w:val="17"/>
-              </w:rPr>
-            </w:pPr>
-            <w:r>
-              <w:rPr>
-                <w:b w:val="1"/>
-                <w:bCs w:val="1"/>
-                <w:sz w:val="17"/>
-                <w:szCs w:val="17"/>
-                <w:rtl w:val="0"/>
-              </w:rPr>
-              <w:t xml:space="preserve">#</w:t>
-            </w:r>
-          </w:p>
-        </w:tc>
-        <w:tc>
-          <w:tcPr>
-            <w:tcBorders>
-              <w:top w:color="bfbfbf" w:space="0" w:sz="8" w:val="single"/>
-              <w:left w:color="000000" w:space="0" w:sz="0" w:val="nil"/>
-              <w:bottom w:color="bfbfbf" w:space="0" w:sz="8" w:val="single"/>
-              <w:right w:color="bfbfbf" w:space="0" w:sz="8" w:val="single"/>
-            </w:tcBorders>
-            <w:shd w:fill="ede7f6" w:val="clear"/>
-            <w:tcMar>
-              <w:top w:w="20.0" w:type="dxa"/>
-              <w:left w:w="80.0" w:type="dxa"/>
-              <w:bottom w:w="20.0" w:type="dxa"/>
-              <w:right w:w="80.0" w:type="dxa"/>
-            </w:tcMar>
-            <w:vAlign w:val="top"/>
-          </w:tcPr>
-          <w:p>
-            <w:pPr>
-              <w:spacing w:after="0" w:line="276" w:lineRule="auto"/>
-              <w:rPr>
-                <w:b w:val="1"/>
-                <w:bCs w:val="1"/>
-                <w:sz w:val="17"/>
-                <w:szCs w:val="17"/>
-              </w:rPr>
-            </w:pPr>
-            <w:r>
-              <w:rPr>
-                <w:b w:val="1"/>
-                <w:bCs w:val="1"/>
-                <w:sz w:val="17"/>
-                <w:szCs w:val="17"/>
-                <w:rtl w:val="0"/>
-              </w:rPr>
-              <w:t xml:space="preserve">Stage</w:t>
-            </w:r>
-          </w:p>
-        </w:tc>
-        <w:tc>
-          <w:tcPr>
-            <w:tcBorders>
-              <w:top w:color="bfbfbf" w:space="0" w:sz="8" w:val="single"/>
-              <w:left w:color="000000" w:space="0" w:sz="0" w:val="nil"/>
-              <w:bottom w:color="bfbfbf" w:space="0" w:sz="8" w:val="single"/>
-              <w:right w:color="bfbfbf" w:space="0" w:sz="8" w:val="single"/>
-            </w:tcBorders>
-            <w:shd w:fill="ede7f6" w:val="clear"/>
-            <w:tcMar>
-              <w:top w:w="20.0" w:type="dxa"/>
-              <w:left w:w="80.0" w:type="dxa"/>
-              <w:bottom w:w="20.0" w:type="dxa"/>
-              <w:right w:w="80.0" w:type="dxa"/>
-            </w:tcMar>
-            <w:vAlign w:val="top"/>
-          </w:tcPr>
-          <w:p>
-            <w:pPr>
-              <w:spacing w:after="0" w:line="276" w:lineRule="auto"/>
-              <w:rPr>
-                <w:b w:val="1"/>
-                <w:bCs w:val="1"/>
-                <w:sz w:val="17"/>
-                <w:szCs w:val="17"/>
-              </w:rPr>
-            </w:pPr>
-            <w:r>
-              <w:rPr>
-                <w:b w:val="1"/>
-                <w:bCs w:val="1"/>
-                <w:sz w:val="17"/>
-                <w:szCs w:val="17"/>
-                <w:rtl w:val="0"/>
-              </w:rPr>
-              <w:t xml:space="preserve">What happens</w:t>
-            </w:r>
-          </w:p>
-        </w:tc>
-        <w:tc>
-          <w:tcPr>
-            <w:tcBorders>
-              <w:top w:color="bfbfbf" w:space="0" w:sz="8" w:val="single"/>
-              <w:left w:color="000000" w:space="0" w:sz="0" w:val="nil"/>
-              <w:bottom w:color="bfbfbf" w:space="0" w:sz="8" w:val="single"/>
-              <w:right w:color="bfbfbf" w:space="0" w:sz="8" w:val="single"/>
-            </w:tcBorders>
-            <w:shd w:fill="ede7f6" w:val="clear"/>
-            <w:tcMar>
-              <w:top w:w="20.0" w:type="dxa"/>
-              <w:left w:w="80.0" w:type="dxa"/>
-              <w:bottom w:w="20.0" w:type="dxa"/>
-              <w:right w:w="80.0" w:type="dxa"/>
-            </w:tcMar>
-            <w:vAlign w:val="top"/>
-          </w:tcPr>
-          <w:p>
-            <w:r>
-              <w:t>Where</w:t>
-            </w:r>
-          </w:p>
-        </w:tc>
-      </w:tr>
-      <w:tr>
-        <w:trPr>
-          <w:cantSplit w:val="0"/>
-          <w:trHeight w:val="675" w:hRule="atLeast"/>
-          <w:tblHeader w:val="0"/>
-        </w:trPr>
-        <w:tc>
-          <w:tcPr>
-            <w:tcBorders>
-              <w:top w:color="000000" w:space="0" w:sz="0" w:val="nil"/>
-              <w:left w:color="bfbfbf" w:space="0" w:sz="8" w:val="single"/>
-              <w:bottom w:color="bfbfbf" w:space="0" w:sz="8" w:val="single"/>
-              <w:right w:color="bfbfbf" w:space="0" w:sz="8" w:val="single"/>
-            </w:tcBorders>
-            <w:tcMar>
-              <w:top w:w="20.0" w:type="dxa"/>
-              <w:left w:w="80.0" w:type="dxa"/>
-              <w:bottom w:w="20.0" w:type="dxa"/>
-              <w:right w:w="80.0" w:type="dxa"/>
-            </w:tcMar>
-            <w:vAlign w:val="top"/>
-          </w:tcPr>
-          <w:p>
-            <w:pPr>
-              <w:spacing w:after="0" w:line="276" w:lineRule="auto"/>
-              <w:rPr>
-                <w:sz w:val="17"/>
-                <w:szCs w:val="17"/>
-              </w:rPr>
-            </w:pPr>
-            <w:r>
-              <w:rPr>
-                <w:sz w:val="17"/>
-                <w:szCs w:val="17"/>
-                <w:rtl w:val="0"/>
-              </w:rPr>
-              <w:t xml:space="preserve">1</w:t>
-            </w:r>
-          </w:p>
-        </w:tc>
-        <w:tc>
-          <w:tcPr>
-            <w:tcBorders>
-              <w:top w:color="000000" w:space="0" w:sz="0" w:val="nil"/>
-              <w:left w:color="000000" w:space="0" w:sz="0" w:val="nil"/>
-              <w:bottom w:color="bfbfbf" w:space="0" w:sz="8" w:val="single"/>
-              <w:right w:color="bfbfbf" w:space="0" w:sz="8" w:val="single"/>
-            </w:tcBorders>
-            <w:tcMar>
-              <w:top w:w="20.0" w:type="dxa"/>
-              <w:left w:w="80.0" w:type="dxa"/>
-              <w:bottom w:w="20.0" w:type="dxa"/>
-              <w:right w:w="80.0" w:type="dxa"/>
-            </w:tcMar>
-            <w:vAlign w:val="top"/>
-          </w:tcPr>
-          <w:p>
-            <w:pPr>
-              <w:spacing w:after="0" w:line="276" w:lineRule="auto"/>
-              <w:rPr>
-                <w:sz w:val="17"/>
-                <w:szCs w:val="17"/>
-              </w:rPr>
-            </w:pPr>
-            <w:r>
-              <w:rPr>
-                <w:sz w:val="17"/>
-                <w:szCs w:val="17"/>
-                <w:rtl w:val="0"/>
-              </w:rPr>
-              <w:t xml:space="preserve">Check the server</w:t>
-            </w:r>
-          </w:p>
-        </w:tc>
-        <w:tc>
-          <w:tcPr>
-            <w:tcBorders>
-              <w:top w:color="000000" w:space="0" w:sz="0" w:val="nil"/>
-              <w:left w:color="000000" w:space="0" w:sz="0" w:val="nil"/>
-              <w:bottom w:color="bfbfbf" w:space="0" w:sz="8" w:val="single"/>
-              <w:right w:color="bfbfbf" w:space="0" w:sz="8" w:val="single"/>
-            </w:tcBorders>
-            <w:tcMar>
-              <w:top w:w="20.0" w:type="dxa"/>
-              <w:left w:w="80.0" w:type="dxa"/>
-              <w:bottom w:w="20.0" w:type="dxa"/>
-              <w:right w:w="80.0" w:type="dxa"/>
-            </w:tcMar>
-            <w:vAlign w:val="top"/>
-          </w:tcPr>
-          <w:p>
-            <w:pPr>
-              <w:spacing w:after="0" w:line="276" w:lineRule="auto"/>
-              <w:rPr>
-                <w:sz w:val="17"/>
-                <w:szCs w:val="17"/>
-              </w:rPr>
-            </w:pPr>
-            <w:r>
-              <w:rPr>
-                <w:sz w:val="17"/>
-                <w:szCs w:val="17"/>
-                <w:rtl w:val="0"/>
-              </w:rPr>
-              <w:t xml:space="preserve">InternSafar healthy, tools present; add swap; install PostgreSQL client tools; read the database name. Swap and client tools are the only server changes.</w:t>
-            </w:r>
-          </w:p>
-        </w:tc>
-        <w:tc>
-          <w:tcPr>
-            <w:tcBorders>
-              <w:top w:color="000000" w:space="0" w:sz="0" w:val="nil"/>
-              <w:left w:color="000000" w:space="0" w:sz="0" w:val="nil"/>
-              <w:bottom w:color="bfbfbf" w:space="0" w:sz="8" w:val="single"/>
-              <w:right w:color="bfbfbf" w:space="0" w:sz="8" w:val="single"/>
-            </w:tcBorders>
-            <w:tcMar>
-              <w:top w:w="20.0" w:type="dxa"/>
-              <w:left w:w="80.0" w:type="dxa"/>
-              <w:bottom w:w="20.0" w:type="dxa"/>
-              <w:right w:w="80.0" w:type="dxa"/>
-            </w:tcMar>
-            <w:vAlign w:val="top"/>
-          </w:tcPr>
-          <w:p>
-            <w:r>
-              <w:t>Check the server</w:t>
-            </w:r>
-          </w:p>
-        </w:tc>
-      </w:tr>
-      <w:tr>
-        <w:trPr>
-          <w:cantSplit w:val="0"/>
-          <w:trHeight w:val="465" w:hRule="atLeast"/>
-          <w:tblHeader w:val="0"/>
-        </w:trPr>
-        <w:tc>
-          <w:tcPr>
-            <w:tcBorders>
-              <w:top w:color="000000" w:space="0" w:sz="0" w:val="nil"/>
-              <w:left w:color="bfbfbf" w:space="0" w:sz="8" w:val="single"/>
-              <w:bottom w:color="bfbfbf" w:space="0" w:sz="8" w:val="single"/>
-              <w:right w:color="bfbfbf" w:space="0" w:sz="8" w:val="single"/>
-            </w:tcBorders>
-            <w:tcMar>
-              <w:top w:w="20.0" w:type="dxa"/>
-              <w:left w:w="80.0" w:type="dxa"/>
-              <w:bottom w:w="20.0" w:type="dxa"/>
-              <w:right w:w="80.0" w:type="dxa"/>
-            </w:tcMar>
-            <w:vAlign w:val="top"/>
-          </w:tcPr>
-          <w:p>
-            <w:pPr>
-              <w:spacing w:after="0" w:line="276" w:lineRule="auto"/>
-              <w:rPr>
-                <w:sz w:val="17"/>
-                <w:szCs w:val="17"/>
-              </w:rPr>
-            </w:pPr>
-            <w:r>
-              <w:rPr>
-                <w:sz w:val="17"/>
-                <w:szCs w:val="17"/>
-                <w:rtl w:val="0"/>
-              </w:rPr>
-              <w:t xml:space="preserve">2</w:t>
-            </w:r>
-          </w:p>
-        </w:tc>
-        <w:tc>
-          <w:tcPr>
-            <w:tcBorders>
-              <w:top w:color="000000" w:space="0" w:sz="0" w:val="nil"/>
-              <w:left w:color="000000" w:space="0" w:sz="0" w:val="nil"/>
-              <w:bottom w:color="bfbfbf" w:space="0" w:sz="8" w:val="single"/>
-              <w:right w:color="bfbfbf" w:space="0" w:sz="8" w:val="single"/>
-            </w:tcBorders>
-            <w:tcMar>
-              <w:top w:w="20.0" w:type="dxa"/>
-              <w:left w:w="80.0" w:type="dxa"/>
-              <w:bottom w:w="20.0" w:type="dxa"/>
-              <w:right w:w="80.0" w:type="dxa"/>
-            </w:tcMar>
-            <w:vAlign w:val="top"/>
-          </w:tcPr>
-          <w:p>
-            <w:pPr>
-              <w:spacing w:after="0" w:line="276" w:lineRule="auto"/>
-              <w:rPr>
-                <w:sz w:val="17"/>
-                <w:szCs w:val="17"/>
-              </w:rPr>
-            </w:pPr>
-            <w:r>
-              <w:rPr>
-                <w:sz w:val="17"/>
-                <w:szCs w:val="17"/>
-                <w:rtl w:val="0"/>
-              </w:rPr>
-              <w:t xml:space="preserve">Upload the code</w:t>
-            </w:r>
-          </w:p>
-        </w:tc>
-        <w:tc>
-          <w:tcPr>
-            <w:tcBorders>
-              <w:top w:color="000000" w:space="0" w:sz="0" w:val="nil"/>
-              <w:left w:color="000000" w:space="0" w:sz="0" w:val="nil"/>
-              <w:bottom w:color="bfbfbf" w:space="0" w:sz="8" w:val="single"/>
-              <w:right w:color="bfbfbf" w:space="0" w:sz="8" w:val="single"/>
-            </w:tcBorders>
-            <w:tcMar>
-              <w:top w:w="20.0" w:type="dxa"/>
-              <w:left w:w="80.0" w:type="dxa"/>
-              <w:bottom w:w="20.0" w:type="dxa"/>
-              <w:right w:w="80.0" w:type="dxa"/>
-            </w:tcMar>
-            <w:vAlign w:val="top"/>
-          </w:tcPr>
-          <w:p>
-            <w:pPr>
-              <w:spacing w:after="0" w:line="276" w:lineRule="auto"/>
-              <w:rPr>
-                <w:sz w:val="17"/>
-                <w:szCs w:val="17"/>
-              </w:rPr>
-            </w:pPr>
-            <w:r>
-              <w:rPr>
-                <w:rFonts w:ascii="Arial Unicode MS" w:cs="Arial Unicode MS" w:eastAsia="Arial Unicode MS" w:hAnsi="Arial Unicode MS"/>
-                <w:sz w:val="17"/>
-                <w:szCs w:val="17"/>
-                <w:rtl w:val="0"/>
-              </w:rPr>
-              <w:t xml:space="preserve">git archive on Windows → copy → extract to /home/ubuntu/placementhub → npm ci.</w:t>
-            </w:r>
-          </w:p>
-        </w:tc>
-        <w:tc>
-          <w:tcPr>
-            <w:tcBorders>
-              <w:top w:color="000000" w:space="0" w:sz="0" w:val="nil"/>
-              <w:left w:color="000000" w:space="0" w:sz="0" w:val="nil"/>
-              <w:bottom w:color="bfbfbf" w:space="0" w:sz="8" w:val="single"/>
-              <w:right w:color="bfbfbf" w:space="0" w:sz="8" w:val="single"/>
-            </w:tcBorders>
-            <w:tcMar>
-              <w:top w:w="20.0" w:type="dxa"/>
-              <w:left w:w="80.0" w:type="dxa"/>
-              <w:bottom w:w="20.0" w:type="dxa"/>
-              <w:right w:w="80.0" w:type="dxa"/>
-            </w:tcMar>
-            <w:vAlign w:val="top"/>
-          </w:tcPr>
-          <w:p>
-            <w:r>
-              <w:t>Upload the code</w:t>
-            </w:r>
-          </w:p>
-        </w:tc>
-      </w:tr>
-      <w:tr>
-        <w:trPr>
-          <w:cantSplit w:val="0"/>
-          <w:trHeight w:val="270" w:hRule="atLeast"/>
-          <w:tblHeader w:val="0"/>
-        </w:trPr>
-        <w:tc>
-          <w:tcPr>
-            <w:tcBorders>
-              <w:top w:color="000000" w:space="0" w:sz="0" w:val="nil"/>
-              <w:left w:color="bfbfbf" w:space="0" w:sz="8" w:val="single"/>
-              <w:bottom w:color="bfbfbf" w:space="0" w:sz="8" w:val="single"/>
-              <w:right w:color="bfbfbf" w:space="0" w:sz="8" w:val="single"/>
-            </w:tcBorders>
-            <w:tcMar>
-              <w:top w:w="20.0" w:type="dxa"/>
-              <w:left w:w="80.0" w:type="dxa"/>
-              <w:bottom w:w="20.0" w:type="dxa"/>
-              <w:right w:w="80.0" w:type="dxa"/>
-            </w:tcMar>
-            <w:vAlign w:val="top"/>
-          </w:tcPr>
-          <w:p>
-            <w:pPr>
-              <w:spacing w:after="0" w:line="276" w:lineRule="auto"/>
-              <w:rPr>
-                <w:sz w:val="17"/>
-                <w:szCs w:val="17"/>
-              </w:rPr>
-            </w:pPr>
-            <w:r>
-              <w:rPr>
-                <w:sz w:val="17"/>
-                <w:szCs w:val="17"/>
-                <w:rtl w:val="0"/>
-              </w:rPr>
-              <w:t xml:space="preserve">3</w:t>
-            </w:r>
-          </w:p>
-        </w:tc>
-        <w:tc>
-          <w:tcPr>
-            <w:tcBorders>
-              <w:top w:color="000000" w:space="0" w:sz="0" w:val="nil"/>
-              <w:left w:color="000000" w:space="0" w:sz="0" w:val="nil"/>
-              <w:bottom w:color="bfbfbf" w:space="0" w:sz="8" w:val="single"/>
-              <w:right w:color="bfbfbf" w:space="0" w:sz="8" w:val="single"/>
-            </w:tcBorders>
-            <w:tcMar>
-              <w:top w:w="20.0" w:type="dxa"/>
-              <w:left w:w="80.0" w:type="dxa"/>
-              <w:bottom w:w="20.0" w:type="dxa"/>
-              <w:right w:w="80.0" w:type="dxa"/>
-            </w:tcMar>
-            <w:vAlign w:val="top"/>
-          </w:tcPr>
-          <w:p>
-            <w:pPr>
-              <w:spacing w:after="0" w:line="276" w:lineRule="auto"/>
-              <w:rPr>
-                <w:sz w:val="17"/>
-                <w:szCs w:val="17"/>
-              </w:rPr>
-            </w:pPr>
-            <w:r>
-              <w:rPr>
-                <w:sz w:val="17"/>
-                <w:szCs w:val="17"/>
-                <w:rtl w:val="0"/>
-              </w:rPr>
-              <w:t xml:space="preserve">Configure</w:t>
-            </w:r>
-          </w:p>
-        </w:tc>
-        <w:tc>
-          <w:tcPr>
-            <w:tcBorders>
-              <w:top w:color="000000" w:space="0" w:sz="0" w:val="nil"/>
-              <w:left w:color="000000" w:space="0" w:sz="0" w:val="nil"/>
-              <w:bottom w:color="bfbfbf" w:space="0" w:sz="8" w:val="single"/>
-              <w:right w:color="bfbfbf" w:space="0" w:sz="8" w:val="single"/>
-            </w:tcBorders>
-            <w:tcMar>
-              <w:top w:w="20.0" w:type="dxa"/>
-              <w:left w:w="80.0" w:type="dxa"/>
-              <w:bottom w:w="20.0" w:type="dxa"/>
-              <w:right w:w="80.0" w:type="dxa"/>
-            </w:tcMar>
-            <w:vAlign w:val="top"/>
-          </w:tcPr>
-          <w:p>
-            <w:pPr>
-              <w:spacing w:after="0" w:line="276" w:lineRule="auto"/>
-              <w:rPr>
-                <w:sz w:val="17"/>
-                <w:szCs w:val="17"/>
-              </w:rPr>
-            </w:pPr>
-            <w:r>
-              <w:rPr>
-                <w:sz w:val="17"/>
-                <w:szCs w:val="17"/>
-                <w:rtl w:val="0"/>
-              </w:rPr>
-              <w:t xml:space="preserve">Write the production .env; test the database connection over SSL.</w:t>
-            </w:r>
-          </w:p>
-        </w:tc>
-        <w:tc>
-          <w:tcPr>
-            <w:tcBorders>
-              <w:top w:color="000000" w:space="0" w:sz="0" w:val="nil"/>
-              <w:left w:color="000000" w:space="0" w:sz="0" w:val="nil"/>
-              <w:bottom w:color="bfbfbf" w:space="0" w:sz="8" w:val="single"/>
-              <w:right w:color="bfbfbf" w:space="0" w:sz="8" w:val="single"/>
-            </w:tcBorders>
-            <w:tcMar>
-              <w:top w:w="20.0" w:type="dxa"/>
-              <w:left w:w="80.0" w:type="dxa"/>
-              <w:bottom w:w="20.0" w:type="dxa"/>
-              <w:right w:w="80.0" w:type="dxa"/>
-            </w:tcMar>
-            <w:vAlign w:val="top"/>
-          </w:tcPr>
-          <w:p>
-            <w:r>
-              <w:t>Settings and connection</w:t>
-            </w:r>
-          </w:p>
-        </w:tc>
-      </w:tr>
-      <w:tr>
-        <w:trPr>
-          <w:cantSplit w:val="0"/>
-          <w:trHeight w:val="870" w:hRule="atLeast"/>
-          <w:tblHeader w:val="0"/>
-        </w:trPr>
-        <w:tc>
-          <w:tcPr>
-            <w:tcBorders>
-              <w:top w:color="000000" w:space="0" w:sz="0" w:val="nil"/>
-              <w:left w:color="bfbfbf" w:space="0" w:sz="8" w:val="single"/>
-              <w:bottom w:color="bfbfbf" w:space="0" w:sz="8" w:val="single"/>
-              <w:right w:color="bfbfbf" w:space="0" w:sz="8" w:val="single"/>
-            </w:tcBorders>
-            <w:tcMar>
-              <w:top w:w="20.0" w:type="dxa"/>
-              <w:left w:w="80.0" w:type="dxa"/>
-              <w:bottom w:w="20.0" w:type="dxa"/>
-              <w:right w:w="80.0" w:type="dxa"/>
-            </w:tcMar>
-            <w:vAlign w:val="top"/>
-          </w:tcPr>
-          <w:p>
-            <w:pPr>
-              <w:spacing w:after="0" w:line="276" w:lineRule="auto"/>
-              <w:rPr>
-                <w:sz w:val="17"/>
-                <w:szCs w:val="17"/>
-              </w:rPr>
-            </w:pPr>
-            <w:r>
-              <w:rPr>
-                <w:sz w:val="17"/>
-                <w:szCs w:val="17"/>
-                <w:rtl w:val="0"/>
-              </w:rPr>
-              <w:t xml:space="preserve">4</w:t>
-            </w:r>
-          </w:p>
-        </w:tc>
-        <w:tc>
-          <w:tcPr>
-            <w:tcBorders>
-              <w:top w:color="000000" w:space="0" w:sz="0" w:val="nil"/>
-              <w:left w:color="000000" w:space="0" w:sz="0" w:val="nil"/>
-              <w:bottom w:color="bfbfbf" w:space="0" w:sz="8" w:val="single"/>
-              <w:right w:color="bfbfbf" w:space="0" w:sz="8" w:val="single"/>
-            </w:tcBorders>
-            <w:tcMar>
-              <w:top w:w="20.0" w:type="dxa"/>
-              <w:left w:w="80.0" w:type="dxa"/>
-              <w:bottom w:w="20.0" w:type="dxa"/>
-              <w:right w:w="80.0" w:type="dxa"/>
-            </w:tcMar>
-            <w:vAlign w:val="top"/>
-          </w:tcPr>
-          <w:p>
-            <w:pPr>
-              <w:spacing w:after="0" w:line="276" w:lineRule="auto"/>
-              <w:rPr>
-                <w:sz w:val="17"/>
-                <w:szCs w:val="17"/>
-              </w:rPr>
-            </w:pPr>
-            <w:r>
-              <w:rPr>
-                <w:sz w:val="17"/>
-                <w:szCs w:val="17"/>
-                <w:rtl w:val="0"/>
-              </w:rPr>
-              <w:t xml:space="preserve">Create the database tables</w:t>
-            </w:r>
-          </w:p>
-        </w:tc>
-        <w:tc>
-          <w:tcPr>
-            <w:tcBorders>
-              <w:top w:color="000000" w:space="0" w:sz="0" w:val="nil"/>
-              <w:left w:color="000000" w:space="0" w:sz="0" w:val="nil"/>
-              <w:bottom w:color="bfbfbf" w:space="0" w:sz="8" w:val="single"/>
-              <w:right w:color="bfbfbf" w:space="0" w:sz="8" w:val="single"/>
-            </w:tcBorders>
-            <w:tcMar>
-              <w:top w:w="20.0" w:type="dxa"/>
-              <w:left w:w="80.0" w:type="dxa"/>
-              <w:bottom w:w="20.0" w:type="dxa"/>
-              <w:right w:w="80.0" w:type="dxa"/>
-            </w:tcMar>
-            <w:vAlign w:val="top"/>
-          </w:tcPr>
-          <w:p>
-            <w:pPr>
-              <w:spacing w:after="0" w:line="276" w:lineRule="auto"/>
-              <w:rPr>
-                <w:sz w:val="17"/>
-                <w:szCs w:val="17"/>
-              </w:rPr>
-            </w:pPr>
-            <w:r>
-              <w:rPr>
-                <w:sz w:val="17"/>
-                <w:szCs w:val="17"/>
-                <w:rtl w:val="0"/>
-              </w:rPr>
-              <w:t xml:space="preserve">Snapshot RDS; name-clash checks; copy PlacementHub's table structure (no rows) from the source database; first SuperAdmin; reference data (taxonomy, FAQ, email templates); production platform settings.</w:t>
-            </w:r>
-          </w:p>
-        </w:tc>
-        <w:tc>
-          <w:tcPr>
-            <w:tcBorders>
-              <w:top w:color="000000" w:space="0" w:sz="0" w:val="nil"/>
-              <w:left w:color="000000" w:space="0" w:sz="0" w:val="nil"/>
-              <w:bottom w:color="bfbfbf" w:space="0" w:sz="8" w:val="single"/>
-              <w:right w:color="bfbfbf" w:space="0" w:sz="8" w:val="single"/>
-            </w:tcBorders>
-            <w:tcMar>
-              <w:top w:w="20.0" w:type="dxa"/>
-              <w:left w:w="80.0" w:type="dxa"/>
-              <w:bottom w:w="20.0" w:type="dxa"/>
-              <w:right w:w="80.0" w:type="dxa"/>
-            </w:tcMar>
-            <w:vAlign w:val="top"/>
-          </w:tcPr>
-          <w:p>
-            <w:r>
-              <w:t>Database tables</w:t>
-            </w:r>
-          </w:p>
-        </w:tc>
-      </w:tr>
-      <w:tr>
-        <w:trPr>
-          <w:cantSplit w:val="0"/>
-          <w:trHeight w:val="270" w:hRule="atLeast"/>
-          <w:tblHeader w:val="0"/>
-        </w:trPr>
-        <w:tc>
-          <w:tcPr>
-            <w:tcBorders>
-              <w:top w:color="000000" w:space="0" w:sz="0" w:val="nil"/>
-              <w:left w:color="bfbfbf" w:space="0" w:sz="8" w:val="single"/>
-              <w:bottom w:color="bfbfbf" w:space="0" w:sz="8" w:val="single"/>
-              <w:right w:color="bfbfbf" w:space="0" w:sz="8" w:val="single"/>
-            </w:tcBorders>
-            <w:tcMar>
-              <w:top w:w="20.0" w:type="dxa"/>
-              <w:left w:w="80.0" w:type="dxa"/>
-              <w:bottom w:w="20.0" w:type="dxa"/>
-              <w:right w:w="80.0" w:type="dxa"/>
-            </w:tcMar>
-            <w:vAlign w:val="top"/>
-          </w:tcPr>
-          <w:p>
-            <w:pPr>
-              <w:spacing w:after="0" w:line="276" w:lineRule="auto"/>
-              <w:rPr>
-                <w:sz w:val="17"/>
-                <w:szCs w:val="17"/>
-              </w:rPr>
-            </w:pPr>
-            <w:r>
-              <w:rPr>
-                <w:sz w:val="17"/>
-                <w:szCs w:val="17"/>
-                <w:rtl w:val="0"/>
-              </w:rPr>
-              <w:t xml:space="preserve">5</w:t>
-            </w:r>
-          </w:p>
-        </w:tc>
-        <w:tc>
-          <w:tcPr>
-            <w:tcBorders>
-              <w:top w:color="000000" w:space="0" w:sz="0" w:val="nil"/>
-              <w:left w:color="000000" w:space="0" w:sz="0" w:val="nil"/>
-              <w:bottom w:color="bfbfbf" w:space="0" w:sz="8" w:val="single"/>
-              <w:right w:color="bfbfbf" w:space="0" w:sz="8" w:val="single"/>
-            </w:tcBorders>
-            <w:tcMar>
-              <w:top w:w="20.0" w:type="dxa"/>
-              <w:left w:w="80.0" w:type="dxa"/>
-              <w:bottom w:w="20.0" w:type="dxa"/>
-              <w:right w:w="80.0" w:type="dxa"/>
-            </w:tcMar>
-            <w:vAlign w:val="top"/>
-          </w:tcPr>
-          <w:p>
-            <w:pPr>
-              <w:spacing w:after="0" w:line="276" w:lineRule="auto"/>
-              <w:rPr>
-                <w:sz w:val="17"/>
-                <w:szCs w:val="17"/>
-              </w:rPr>
-            </w:pPr>
-            <w:r>
-              <w:rPr>
-                <w:sz w:val="17"/>
-                <w:szCs w:val="17"/>
-                <w:rtl w:val="0"/>
-              </w:rPr>
-              <w:t xml:space="preserve">Build and start</w:t>
-            </w:r>
-          </w:p>
-        </w:tc>
-        <w:tc>
-          <w:tcPr>
-            <w:tcBorders>
-              <w:top w:color="000000" w:space="0" w:sz="0" w:val="nil"/>
-              <w:left w:color="000000" w:space="0" w:sz="0" w:val="nil"/>
-              <w:bottom w:color="bfbfbf" w:space="0" w:sz="8" w:val="single"/>
-              <w:right w:color="bfbfbf" w:space="0" w:sz="8" w:val="single"/>
-            </w:tcBorders>
-            <w:tcMar>
-              <w:top w:w="20.0" w:type="dxa"/>
-              <w:left w:w="80.0" w:type="dxa"/>
-              <w:bottom w:w="20.0" w:type="dxa"/>
-              <w:right w:w="80.0" w:type="dxa"/>
-            </w:tcMar>
-            <w:vAlign w:val="top"/>
-          </w:tcPr>
-          <w:p>
-            <w:pPr>
-              <w:spacing w:after="0" w:line="276" w:lineRule="auto"/>
-              <w:rPr>
-                <w:sz w:val="17"/>
-                <w:szCs w:val="17"/>
-              </w:rPr>
-            </w:pPr>
-            <w:r>
-              <w:rPr>
-                <w:sz w:val="17"/>
-                <w:szCs w:val="17"/>
-                <w:rtl w:val="0"/>
-              </w:rPr>
-              <w:t xml:space="preserve">npm run build, then start under PM2 as placementhub on port 3001.</w:t>
-            </w:r>
-          </w:p>
-        </w:tc>
-        <w:tc>
-          <w:tcPr>
-            <w:tcBorders>
-              <w:top w:color="000000" w:space="0" w:sz="0" w:val="nil"/>
-              <w:left w:color="000000" w:space="0" w:sz="0" w:val="nil"/>
-              <w:bottom w:color="bfbfbf" w:space="0" w:sz="8" w:val="single"/>
-              <w:right w:color="bfbfbf" w:space="0" w:sz="8" w:val="single"/>
-            </w:tcBorders>
-            <w:tcMar>
-              <w:top w:w="20.0" w:type="dxa"/>
-              <w:left w:w="80.0" w:type="dxa"/>
-              <w:bottom w:w="20.0" w:type="dxa"/>
-              <w:right w:w="80.0" w:type="dxa"/>
-            </w:tcMar>
-            <w:vAlign w:val="top"/>
-          </w:tcPr>
-          <w:p>
-            <w:r>
-              <w:t>Build and start</w:t>
-            </w:r>
-          </w:p>
-        </w:tc>
-      </w:tr>
-      <w:tr>
-        <w:trPr>
-          <w:cantSplit w:val="0"/>
-          <w:trHeight w:val="270" w:hRule="atLeast"/>
-          <w:tblHeader w:val="0"/>
-        </w:trPr>
-        <w:tc>
-          <w:tcPr>
-            <w:tcBorders>
-              <w:top w:color="000000" w:space="0" w:sz="0" w:val="nil"/>
-              <w:left w:color="bfbfbf" w:space="0" w:sz="8" w:val="single"/>
-              <w:bottom w:color="bfbfbf" w:space="0" w:sz="8" w:val="single"/>
-              <w:right w:color="bfbfbf" w:space="0" w:sz="8" w:val="single"/>
-            </w:tcBorders>
-            <w:tcMar>
-              <w:top w:w="20.0" w:type="dxa"/>
-              <w:left w:w="80.0" w:type="dxa"/>
-              <w:bottom w:w="20.0" w:type="dxa"/>
-              <w:right w:w="80.0" w:type="dxa"/>
-            </w:tcMar>
-            <w:vAlign w:val="top"/>
-          </w:tcPr>
-          <w:p>
-            <w:pPr>
-              <w:spacing w:after="0" w:line="276" w:lineRule="auto"/>
-              <w:rPr>
-                <w:sz w:val="17"/>
-                <w:szCs w:val="17"/>
-              </w:rPr>
-            </w:pPr>
-            <w:r>
-              <w:rPr>
-                <w:sz w:val="17"/>
-                <w:szCs w:val="17"/>
-                <w:rtl w:val="0"/>
-              </w:rPr>
-              <w:t xml:space="preserve">6</w:t>
-            </w:r>
-          </w:p>
-        </w:tc>
-        <w:tc>
-          <w:tcPr>
-            <w:tcBorders>
-              <w:top w:color="000000" w:space="0" w:sz="0" w:val="nil"/>
-              <w:left w:color="000000" w:space="0" w:sz="0" w:val="nil"/>
-              <w:bottom w:color="bfbfbf" w:space="0" w:sz="8" w:val="single"/>
-              <w:right w:color="bfbfbf" w:space="0" w:sz="8" w:val="single"/>
-            </w:tcBorders>
-            <w:tcMar>
-              <w:top w:w="20.0" w:type="dxa"/>
-              <w:left w:w="80.0" w:type="dxa"/>
-              <w:bottom w:w="20.0" w:type="dxa"/>
-              <w:right w:w="80.0" w:type="dxa"/>
-            </w:tcMar>
-            <w:vAlign w:val="top"/>
-          </w:tcPr>
-          <w:p>
-            <w:pPr>
-              <w:spacing w:after="0" w:line="276" w:lineRule="auto"/>
-              <w:rPr>
-                <w:sz w:val="17"/>
-                <w:szCs w:val="17"/>
-              </w:rPr>
-            </w:pPr>
-            <w:r>
-              <w:rPr>
-                <w:sz w:val="17"/>
-                <w:szCs w:val="17"/>
-                <w:rtl w:val="0"/>
-              </w:rPr>
-              <w:t xml:space="preserve">Go public</w:t>
-            </w:r>
-          </w:p>
-        </w:tc>
-        <w:tc>
-          <w:tcPr>
-            <w:tcBorders>
-              <w:top w:color="000000" w:space="0" w:sz="0" w:val="nil"/>
-              <w:left w:color="000000" w:space="0" w:sz="0" w:val="nil"/>
-              <w:bottom w:color="bfbfbf" w:space="0" w:sz="8" w:val="single"/>
-              <w:right w:color="bfbfbf" w:space="0" w:sz="8" w:val="single"/>
-            </w:tcBorders>
-            <w:tcMar>
-              <w:top w:w="20.0" w:type="dxa"/>
-              <w:left w:w="80.0" w:type="dxa"/>
-              <w:bottom w:w="20.0" w:type="dxa"/>
-              <w:right w:w="80.0" w:type="dxa"/>
-            </w:tcMar>
-            <w:vAlign w:val="top"/>
-          </w:tcPr>
-          <w:p>
-            <w:r>
-              <w:t>DNS for the subdomain only, a second Nginx site, HTTPS for that name. Do not change placementhub.online or www.</w:t>
-            </w:r>
-          </w:p>
-        </w:tc>
-        <w:tc>
-          <w:tcPr>
-            <w:tcBorders>
-              <w:top w:color="000000" w:space="0" w:sz="0" w:val="nil"/>
-              <w:left w:color="000000" w:space="0" w:sz="0" w:val="nil"/>
-              <w:bottom w:color="bfbfbf" w:space="0" w:sz="8" w:val="single"/>
-              <w:right w:color="bfbfbf" w:space="0" w:sz="8" w:val="single"/>
-            </w:tcBorders>
-            <w:tcMar>
-              <w:top w:w="20.0" w:type="dxa"/>
-              <w:left w:w="80.0" w:type="dxa"/>
-              <w:bottom w:w="20.0" w:type="dxa"/>
-              <w:right w:w="80.0" w:type="dxa"/>
-            </w:tcMar>
-            <w:vAlign w:val="top"/>
-          </w:tcPr>
-          <w:p>
-            <w:r>
-              <w:t>DNS and HTTPS</w:t>
-            </w:r>
-          </w:p>
-        </w:tc>
-      </w:tr>
-      <w:tr>
-        <w:trPr>
-          <w:cantSplit w:val="0"/>
-          <w:trHeight w:val="270" w:hRule="atLeast"/>
-          <w:tblHeader w:val="0"/>
-        </w:trPr>
-        <w:tc>
-          <w:tcPr>
-            <w:tcBorders>
-              <w:top w:color="000000" w:space="0" w:sz="0" w:val="nil"/>
-              <w:left w:color="bfbfbf" w:space="0" w:sz="8" w:val="single"/>
-              <w:bottom w:color="bfbfbf" w:space="0" w:sz="8" w:val="single"/>
-              <w:right w:color="bfbfbf" w:space="0" w:sz="8" w:val="single"/>
-            </w:tcBorders>
-            <w:tcMar>
-              <w:top w:w="20.0" w:type="dxa"/>
-              <w:left w:w="80.0" w:type="dxa"/>
-              <w:bottom w:w="20.0" w:type="dxa"/>
-              <w:right w:w="80.0" w:type="dxa"/>
-            </w:tcMar>
-            <w:vAlign w:val="top"/>
-          </w:tcPr>
-          <w:p>
-            <w:pPr>
-              <w:spacing w:after="0" w:line="276" w:lineRule="auto"/>
-              <w:rPr>
-                <w:sz w:val="17"/>
-                <w:szCs w:val="17"/>
-              </w:rPr>
-            </w:pPr>
-            <w:r>
-              <w:rPr>
-                <w:sz w:val="17"/>
-                <w:szCs w:val="17"/>
-                <w:rtl w:val="0"/>
-              </w:rPr>
-              <w:t xml:space="preserve">7</w:t>
-            </w:r>
-          </w:p>
-        </w:tc>
-        <w:tc>
-          <w:tcPr>
-            <w:tcBorders>
-              <w:top w:color="000000" w:space="0" w:sz="0" w:val="nil"/>
-              <w:left w:color="000000" w:space="0" w:sz="0" w:val="nil"/>
-              <w:bottom w:color="bfbfbf" w:space="0" w:sz="8" w:val="single"/>
-              <w:right w:color="bfbfbf" w:space="0" w:sz="8" w:val="single"/>
-            </w:tcBorders>
-            <w:tcMar>
-              <w:top w:w="20.0" w:type="dxa"/>
-              <w:left w:w="80.0" w:type="dxa"/>
-              <w:bottom w:w="20.0" w:type="dxa"/>
-              <w:right w:w="80.0" w:type="dxa"/>
-            </w:tcMar>
-            <w:vAlign w:val="top"/>
-          </w:tcPr>
-          <w:p>
-            <w:pPr>
-              <w:spacing w:after="0" w:line="276" w:lineRule="auto"/>
-              <w:rPr>
-                <w:sz w:val="17"/>
-                <w:szCs w:val="17"/>
-              </w:rPr>
-            </w:pPr>
-            <w:r>
-              <w:rPr>
-                <w:sz w:val="17"/>
-                <w:szCs w:val="17"/>
-                <w:rtl w:val="0"/>
-              </w:rPr>
-              <w:t xml:space="preserve">Survive reboots</w:t>
-            </w:r>
-          </w:p>
-        </w:tc>
-        <w:tc>
-          <w:tcPr>
-            <w:tcBorders>
-              <w:top w:color="000000" w:space="0" w:sz="0" w:val="nil"/>
-              <w:left w:color="000000" w:space="0" w:sz="0" w:val="nil"/>
-              <w:bottom w:color="bfbfbf" w:space="0" w:sz="8" w:val="single"/>
-              <w:right w:color="bfbfbf" w:space="0" w:sz="8" w:val="single"/>
-            </w:tcBorders>
-            <w:tcMar>
-              <w:top w:w="20.0" w:type="dxa"/>
-              <w:left w:w="80.0" w:type="dxa"/>
-              <w:bottom w:w="20.0" w:type="dxa"/>
-              <w:right w:w="80.0" w:type="dxa"/>
-            </w:tcMar>
-            <w:vAlign w:val="top"/>
-          </w:tcPr>
-          <w:p>
-            <w:pPr>
-              <w:spacing w:after="0" w:line="276" w:lineRule="auto"/>
-              <w:rPr>
-                <w:sz w:val="17"/>
-                <w:szCs w:val="17"/>
-              </w:rPr>
-            </w:pPr>
-            <w:r>
-              <w:rPr>
-                <w:sz w:val="17"/>
-                <w:szCs w:val="17"/>
-                <w:rtl w:val="0"/>
-              </w:rPr>
-              <w:t xml:space="preserve">Add placementhub to the PM2 startup service that already exists.</w:t>
-            </w:r>
-          </w:p>
-        </w:tc>
-        <w:tc>
-          <w:tcPr>
-            <w:tcBorders>
-              <w:top w:color="000000" w:space="0" w:sz="0" w:val="nil"/>
-              <w:left w:color="000000" w:space="0" w:sz="0" w:val="nil"/>
-              <w:bottom w:color="bfbfbf" w:space="0" w:sz="8" w:val="single"/>
-              <w:right w:color="bfbfbf" w:space="0" w:sz="8" w:val="single"/>
-            </w:tcBorders>
-            <w:tcMar>
-              <w:top w:w="20.0" w:type="dxa"/>
-              <w:left w:w="80.0" w:type="dxa"/>
-              <w:bottom w:w="20.0" w:type="dxa"/>
-              <w:right w:w="80.0" w:type="dxa"/>
-            </w:tcMar>
-            <w:vAlign w:val="top"/>
-          </w:tcPr>
-          <w:p>
-            <w:r>
-              <w:t>Restart after reboot</w:t>
-            </w:r>
-          </w:p>
-        </w:tc>
-      </w:tr>
-      <w:tr>
-        <w:trPr>
-          <w:cantSplit w:val="0"/>
-          <w:trHeight w:val="270" w:hRule="atLeast"/>
-          <w:tblHeader w:val="0"/>
-        </w:trPr>
-        <w:tc>
-          <w:tcPr>
-            <w:tcBorders>
-              <w:top w:color="000000" w:space="0" w:sz="0" w:val="nil"/>
-              <w:left w:color="bfbfbf" w:space="0" w:sz="8" w:val="single"/>
-              <w:bottom w:color="bfbfbf" w:space="0" w:sz="8" w:val="single"/>
-              <w:right w:color="bfbfbf" w:space="0" w:sz="8" w:val="single"/>
-            </w:tcBorders>
-            <w:tcMar>
-              <w:top w:w="20.0" w:type="dxa"/>
-              <w:left w:w="80.0" w:type="dxa"/>
-              <w:bottom w:w="20.0" w:type="dxa"/>
-              <w:right w:w="80.0" w:type="dxa"/>
-            </w:tcMar>
-            <w:vAlign w:val="top"/>
-          </w:tcPr>
-          <w:p>
-            <w:pPr>
-              <w:spacing w:after="0" w:line="276" w:lineRule="auto"/>
-              <w:rPr>
-                <w:sz w:val="17"/>
-                <w:szCs w:val="17"/>
-              </w:rPr>
-            </w:pPr>
-            <w:r>
-              <w:rPr>
-                <w:sz w:val="17"/>
-                <w:szCs w:val="17"/>
-                <w:rtl w:val="0"/>
-              </w:rPr>
-              <w:t xml:space="preserve">8</w:t>
-            </w:r>
-          </w:p>
-        </w:tc>
-        <w:tc>
-          <w:tcPr>
-            <w:tcBorders>
-              <w:top w:color="000000" w:space="0" w:sz="0" w:val="nil"/>
-              <w:left w:color="000000" w:space="0" w:sz="0" w:val="nil"/>
-              <w:bottom w:color="bfbfbf" w:space="0" w:sz="8" w:val="single"/>
-              <w:right w:color="bfbfbf" w:space="0" w:sz="8" w:val="single"/>
-            </w:tcBorders>
-            <w:tcMar>
-              <w:top w:w="20.0" w:type="dxa"/>
-              <w:left w:w="80.0" w:type="dxa"/>
-              <w:bottom w:w="20.0" w:type="dxa"/>
-              <w:right w:w="80.0" w:type="dxa"/>
-            </w:tcMar>
-            <w:vAlign w:val="top"/>
-          </w:tcPr>
-          <w:p>
-            <w:pPr>
-              <w:spacing w:after="0" w:line="276" w:lineRule="auto"/>
-              <w:rPr>
-                <w:sz w:val="17"/>
-                <w:szCs w:val="17"/>
-              </w:rPr>
-            </w:pPr>
-            <w:r>
-              <w:rPr>
-                <w:sz w:val="17"/>
-                <w:szCs w:val="17"/>
-                <w:rtl w:val="0"/>
-              </w:rPr>
-              <w:t xml:space="preserve">Scheduled job</w:t>
-            </w:r>
-          </w:p>
-        </w:tc>
-        <w:tc>
-          <w:tcPr>
-            <w:tcBorders>
-              <w:top w:color="000000" w:space="0" w:sz="0" w:val="nil"/>
-              <w:left w:color="000000" w:space="0" w:sz="0" w:val="nil"/>
-              <w:bottom w:color="bfbfbf" w:space="0" w:sz="8" w:val="single"/>
-              <w:right w:color="bfbfbf" w:space="0" w:sz="8" w:val="single"/>
-            </w:tcBorders>
-            <w:tcMar>
-              <w:top w:w="20.0" w:type="dxa"/>
-              <w:left w:w="80.0" w:type="dxa"/>
-              <w:bottom w:w="20.0" w:type="dxa"/>
-              <w:right w:w="80.0" w:type="dxa"/>
-            </w:tcMar>
-            <w:vAlign w:val="top"/>
-          </w:tcPr>
-          <w:p>
-            <w:pPr>
-              <w:spacing w:after="0" w:line="276" w:lineRule="auto"/>
-              <w:rPr>
-                <w:sz w:val="17"/>
-                <w:szCs w:val="17"/>
-              </w:rPr>
-            </w:pPr>
-            <w:r>
-              <w:rPr>
-                <w:sz w:val="17"/>
-                <w:szCs w:val="17"/>
-                <w:rtl w:val="0"/>
-              </w:rPr>
-              <w:t xml:space="preserve">Semester rollover cron (it was a Vercel cron before).</w:t>
-            </w:r>
-          </w:p>
-        </w:tc>
-        <w:tc>
-          <w:tcPr>
-            <w:tcBorders>
-              <w:top w:color="000000" w:space="0" w:sz="0" w:val="nil"/>
-              <w:left w:color="000000" w:space="0" w:sz="0" w:val="nil"/>
-              <w:bottom w:color="bfbfbf" w:space="0" w:sz="8" w:val="single"/>
-              <w:right w:color="bfbfbf" w:space="0" w:sz="8" w:val="single"/>
-            </w:tcBorders>
-            <w:tcMar>
-              <w:top w:w="20.0" w:type="dxa"/>
-              <w:left w:w="80.0" w:type="dxa"/>
-              <w:bottom w:w="20.0" w:type="dxa"/>
-              <w:right w:w="80.0" w:type="dxa"/>
-            </w:tcMar>
-            <w:vAlign w:val="top"/>
-          </w:tcPr>
-          <w:p>
-            <w:r>
-              <w:t>Scheduled job</w:t>
-            </w:r>
-          </w:p>
-        </w:tc>
-      </w:tr>
-      <w:tr>
-        <w:trPr>
-          <w:cantSplit w:val="0"/>
-          <w:trHeight w:val="270" w:hRule="atLeast"/>
-          <w:tblHeader w:val="0"/>
-        </w:trPr>
-        <w:tc>
-          <w:tcPr>
-            <w:tcBorders>
-              <w:top w:color="000000" w:space="0" w:sz="0" w:val="nil"/>
-              <w:left w:color="bfbfbf" w:space="0" w:sz="8" w:val="single"/>
-              <w:bottom w:color="bfbfbf" w:space="0" w:sz="8" w:val="single"/>
-              <w:right w:color="bfbfbf" w:space="0" w:sz="8" w:val="single"/>
-            </w:tcBorders>
-            <w:tcMar>
-              <w:top w:w="20.0" w:type="dxa"/>
-              <w:left w:w="80.0" w:type="dxa"/>
-              <w:bottom w:w="20.0" w:type="dxa"/>
-              <w:right w:w="80.0" w:type="dxa"/>
-            </w:tcMar>
-            <w:vAlign w:val="top"/>
-          </w:tcPr>
-          <w:p>
-            <w:pPr>
-              <w:spacing w:after="0" w:line="276" w:lineRule="auto"/>
-              <w:rPr>
-                <w:sz w:val="17"/>
-                <w:szCs w:val="17"/>
-              </w:rPr>
-            </w:pPr>
-            <w:r>
-              <w:rPr>
-                <w:sz w:val="17"/>
-                <w:szCs w:val="17"/>
-                <w:rtl w:val="0"/>
-              </w:rPr>
-              <w:t xml:space="preserve">9</w:t>
-            </w:r>
-          </w:p>
-        </w:tc>
-        <w:tc>
-          <w:tcPr>
-            <w:tcBorders>
-              <w:top w:color="000000" w:space="0" w:sz="0" w:val="nil"/>
-              <w:left w:color="000000" w:space="0" w:sz="0" w:val="nil"/>
-              <w:bottom w:color="bfbfbf" w:space="0" w:sz="8" w:val="single"/>
-              <w:right w:color="bfbfbf" w:space="0" w:sz="8" w:val="single"/>
-            </w:tcBorders>
-            <w:tcMar>
-              <w:top w:w="20.0" w:type="dxa"/>
-              <w:left w:w="80.0" w:type="dxa"/>
-              <w:bottom w:w="20.0" w:type="dxa"/>
-              <w:right w:w="80.0" w:type="dxa"/>
-            </w:tcMar>
-            <w:vAlign w:val="top"/>
-          </w:tcPr>
-          <w:p>
-            <w:pPr>
-              <w:spacing w:after="0" w:line="276" w:lineRule="auto"/>
-              <w:rPr>
-                <w:sz w:val="17"/>
-                <w:szCs w:val="17"/>
-              </w:rPr>
-            </w:pPr>
-            <w:r>
-              <w:rPr>
-                <w:sz w:val="17"/>
-                <w:szCs w:val="17"/>
-                <w:rtl w:val="0"/>
-              </w:rPr>
-              <w:t xml:space="preserve">Backups</w:t>
-            </w:r>
-          </w:p>
-        </w:tc>
-        <w:tc>
-          <w:tcPr>
-            <w:tcBorders>
-              <w:top w:color="000000" w:space="0" w:sz="0" w:val="nil"/>
-              <w:left w:color="000000" w:space="0" w:sz="0" w:val="nil"/>
-              <w:bottom w:color="bfbfbf" w:space="0" w:sz="8" w:val="single"/>
-              <w:right w:color="bfbfbf" w:space="0" w:sz="8" w:val="single"/>
-            </w:tcBorders>
-            <w:tcMar>
-              <w:top w:w="20.0" w:type="dxa"/>
-              <w:left w:w="80.0" w:type="dxa"/>
-              <w:bottom w:w="20.0" w:type="dxa"/>
-              <w:right w:w="80.0" w:type="dxa"/>
-            </w:tcMar>
-            <w:vAlign w:val="top"/>
-          </w:tcPr>
-          <w:p>
-            <w:pPr>
-              <w:spacing w:after="0" w:line="276" w:lineRule="auto"/>
-              <w:rPr>
-                <w:sz w:val="17"/>
-                <w:szCs w:val="17"/>
-              </w:rPr>
-            </w:pPr>
-            <w:r>
-              <w:rPr>
-                <w:sz w:val="17"/>
-                <w:szCs w:val="17"/>
-                <w:rtl w:val="0"/>
-              </w:rPr>
-              <w:t xml:space="preserve">PlacementHub-only backup command.</w:t>
-            </w:r>
-          </w:p>
-        </w:tc>
-        <w:tc>
-          <w:tcPr>
-            <w:tcBorders>
-              <w:top w:color="000000" w:space="0" w:sz="0" w:val="nil"/>
-              <w:left w:color="000000" w:space="0" w:sz="0" w:val="nil"/>
-              <w:bottom w:color="bfbfbf" w:space="0" w:sz="8" w:val="single"/>
-              <w:right w:color="bfbfbf" w:space="0" w:sz="8" w:val="single"/>
-            </w:tcBorders>
-            <w:tcMar>
-              <w:top w:w="20.0" w:type="dxa"/>
-              <w:left w:w="80.0" w:type="dxa"/>
-              <w:bottom w:w="20.0" w:type="dxa"/>
-              <w:right w:w="80.0" w:type="dxa"/>
-            </w:tcMar>
-            <w:vAlign w:val="top"/>
-          </w:tcPr>
-          <w:p>
-            <w:r>
-              <w:t>Backups</w:t>
-            </w:r>
-          </w:p>
-        </w:tc>
-      </w:tr>
-      <w:tr>
-        <w:trPr>
-          <w:cantSplit w:val="0"/>
-          <w:trHeight w:val="270" w:hRule="atLeast"/>
-          <w:tblHeader w:val="0"/>
-        </w:trPr>
-        <w:tc>
-          <w:tcPr>
-            <w:tcBorders>
-              <w:top w:color="000000" w:space="0" w:sz="0" w:val="nil"/>
-              <w:left w:color="bfbfbf" w:space="0" w:sz="8" w:val="single"/>
-              <w:bottom w:color="bfbfbf" w:space="0" w:sz="8" w:val="single"/>
-              <w:right w:color="bfbfbf" w:space="0" w:sz="8" w:val="single"/>
-            </w:tcBorders>
-            <w:tcMar>
-              <w:top w:w="20.0" w:type="dxa"/>
-              <w:left w:w="80.0" w:type="dxa"/>
-              <w:bottom w:w="20.0" w:type="dxa"/>
-              <w:right w:w="80.0" w:type="dxa"/>
-            </w:tcMar>
-            <w:vAlign w:val="top"/>
-          </w:tcPr>
-          <w:p>
-            <w:pPr>
-              <w:spacing w:after="0" w:line="276" w:lineRule="auto"/>
-              <w:rPr>
-                <w:sz w:val="17"/>
-                <w:szCs w:val="17"/>
-              </w:rPr>
-            </w:pPr>
-            <w:r>
-              <w:rPr>
-                <w:sz w:val="17"/>
-                <w:szCs w:val="17"/>
-                <w:rtl w:val="0"/>
-              </w:rPr>
-              <w:t xml:space="preserve">10</w:t>
-            </w:r>
-          </w:p>
-        </w:tc>
-        <w:tc>
-          <w:tcPr>
-            <w:tcBorders>
-              <w:top w:color="000000" w:space="0" w:sz="0" w:val="nil"/>
-              <w:left w:color="000000" w:space="0" w:sz="0" w:val="nil"/>
-              <w:bottom w:color="bfbfbf" w:space="0" w:sz="8" w:val="single"/>
-              <w:right w:color="bfbfbf" w:space="0" w:sz="8" w:val="single"/>
-            </w:tcBorders>
-            <w:tcMar>
-              <w:top w:w="20.0" w:type="dxa"/>
-              <w:left w:w="80.0" w:type="dxa"/>
-              <w:bottom w:w="20.0" w:type="dxa"/>
-              <w:right w:w="80.0" w:type="dxa"/>
-            </w:tcMar>
-            <w:vAlign w:val="top"/>
-          </w:tcPr>
-          <w:p>
-            <w:pPr>
-              <w:spacing w:after="0" w:line="276" w:lineRule="auto"/>
-              <w:rPr>
-                <w:sz w:val="17"/>
-                <w:szCs w:val="17"/>
-              </w:rPr>
-            </w:pPr>
-            <w:r>
-              <w:rPr>
-                <w:sz w:val="17"/>
-                <w:szCs w:val="17"/>
-                <w:rtl w:val="0"/>
-              </w:rPr>
-              <w:t xml:space="preserve">Verify</w:t>
-            </w:r>
-          </w:p>
-        </w:tc>
-        <w:tc>
-          <w:tcPr>
-            <w:tcBorders>
-              <w:top w:color="000000" w:space="0" w:sz="0" w:val="nil"/>
-              <w:left w:color="000000" w:space="0" w:sz="0" w:val="nil"/>
-              <w:bottom w:color="bfbfbf" w:space="0" w:sz="8" w:val="single"/>
-              <w:right w:color="bfbfbf" w:space="0" w:sz="8" w:val="single"/>
-            </w:tcBorders>
-            <w:tcMar>
-              <w:top w:w="20.0" w:type="dxa"/>
-              <w:left w:w="80.0" w:type="dxa"/>
-              <w:bottom w:w="20.0" w:type="dxa"/>
-              <w:right w:w="80.0" w:type="dxa"/>
-            </w:tcMar>
-            <w:vAlign w:val="top"/>
-          </w:tcPr>
-          <w:p>
-            <w:r>
-              <w:t>Subdomain up, homepage unchanged, InternSafar up; SuperAdmin login; real emails; uploads; help content.</w:t>
-            </w:r>
-          </w:p>
-        </w:tc>
-        <w:tc>
-          <w:tcPr>
-            <w:tcBorders>
-              <w:top w:color="000000" w:space="0" w:sz="0" w:val="nil"/>
-              <w:left w:color="000000" w:space="0" w:sz="0" w:val="nil"/>
-              <w:bottom w:color="bfbfbf" w:space="0" w:sz="8" w:val="single"/>
-              <w:right w:color="bfbfbf" w:space="0" w:sz="8" w:val="single"/>
-            </w:tcBorders>
-            <w:tcMar>
-              <w:top w:w="20.0" w:type="dxa"/>
-              <w:left w:w="80.0" w:type="dxa"/>
-              <w:bottom w:w="20.0" w:type="dxa"/>
-              <w:right w:w="80.0" w:type="dxa"/>
-            </w:tcMar>
-            <w:vAlign w:val="top"/>
-          </w:tcPr>
-          <w:p>
-            <w:r>
-              <w:t>Final check</w:t>
-            </w:r>
-          </w:p>
-        </w:tc>
-      </w:tr>
-    </w:tbl>
-    <w:p>
-      <w:pPr>
-        <w:spacing w:after="0" w:line="130.9090909090909" w:lineRule="auto"/>
-        <w:rPr/>
-      </w:pPr>
-      <w:r>
-        <w:rPr>
-          <w:rtl w:val="0"/>
-        </w:rPr>
-        <w:t xml:space="preserve"> </w:t>
-      </w:r>
-    </w:p>
-    <w:p>
-      <w:pPr>
-        <w:spacing w:after="20" w:lineRule="auto"/>
-        <w:ind w:left="660" w:hanging="220"/>
-        <w:rPr/>
-      </w:pPr>
-      <w:r>
-        <w:rPr>
-          <w:rtl w:val="0"/>
-        </w:rPr>
-        <w:t>•  The conditional fixes near the end are only if a step fails. A checklist follows them.</w:t>
-      </w:r>
-    </w:p>
-    <w:p>
-      <w:pPr>
-        <w:spacing w:after="20" w:lineRule="auto"/>
-        <w:ind w:left="660" w:hanging="220"/>
-        <w:rPr/>
-      </w:pPr>
-      <w:r>
-        <w:rPr>
-          <w:rtl w:val="0"/>
-        </w:rPr>
-        <w:t>•  https://placementhub.online/ stays up the whole time. InternSafar stays up. Do not resize or reboot the server.</w:t>
-      </w:r>
-    </w:p>
-    <w:p>
-      <w:pPr>
-        <w:pStyle w:val="Heading1"/>
-        <w:keepNext w:val="0"/>
-        <w:keepLines w:val="0"/>
-        <w:spacing w:after="120" w:lineRule="auto"/>
-        <w:ind w:left="288" w:firstLine="0"/>
-        <w:rPr>
-          <w:rFonts w:ascii="Open Sans" w:cs="Open Sans" w:eastAsia="Open Sans" w:hAnsi="Open Sans"/>
-          <w:color w:val="000000"/>
-          <w:sz w:val="46"/>
-          <w:szCs w:val="46"/>
-        </w:rPr>
-      </w:pPr>
-      <w:bookmarkStart w:colFirst="0" w:colLast="0" w:name="_by9odjw7cn52" w:id="2"/>
-      <w:bookmarkEnd w:id="2"/>
-      <w:r>
-        <w:rPr>
-          <w:rFonts w:ascii="Open Sans" w:cs="Open Sans" w:eastAsia="Open Sans" w:hAnsi="Open Sans"/>
-          <w:color w:val="000000"/>
-          <w:sz w:val="46"/>
-          <w:szCs w:val="46"/>
-          <w:rtl w:val="0"/>
-        </w:rPr>
-        <w:t>3. Where PlacementHub runs</w:t>
-      </w:r>
-    </w:p>
-    <w:p>
-      <w:pPr>
-        <w:spacing w:after="60" w:lineRule="auto"/>
-        <w:rPr/>
-      </w:pPr>
-      <w:r>
-        <w:rPr>
-          <w:rtl w:val="0"/>
-        </w:rPr>
-        <w:t>One place only: the EC2 and the database that already run InternSafar. The table records that choice.</w:t>
-      </w:r>
-    </w:p>
-    <w:tbl>
-      <w:tblPr>
-        <w:tblStyle w:val="Table4"/>
-        <w:tblW w:w="8640.0" w:type="dxa"/>
-        <w:jc w:val="left"/>
-        <w:tblBorders>
-          <w:top w:color="000000" w:space="0" w:sz="0" w:val="nil"/>
-          <w:left w:color="000000" w:space="0" w:sz="0" w:val="nil"/>
-          <w:bottom w:color="000000" w:space="0" w:sz="0" w:val="nil"/>
-          <w:right w:color="000000" w:space="0" w:sz="0" w:val="nil"/>
-          <w:insideH w:color="000000" w:space="0" w:sz="0" w:val="nil"/>
-          <w:insideV w:color="000000" w:space="0" w:sz="0" w:val="nil"/>
-        </w:tblBorders>
-        <w:tblLayout w:type="fixed"/>
-        <w:tblLook w:val="0600"/>
-      </w:tblPr>
-      <w:tblGrid>
-        <w:gridCol w:w="1631.0204081632653"/>
-        <w:gridCol w:w="2527.3469387755104"/>
-        <w:gridCol w:w="2130.612244897959"/>
-        <w:gridCol w:w="2351.0204081632655"/>
-        <w:tblGridChange w:id="0">
-          <w:tblGrid>
-            <w:gridCol w:w="1631.0204081632653"/>
-            <w:gridCol w:w="2527.3469387755104"/>
-            <w:gridCol w:w="2130.612244897959"/>
-            <w:gridCol w:w="2351.0204081632655"/>
-          </w:tblGrid>
-        </w:tblGridChange>
-      </w:tblGrid>
-      <w:tr>
-        <w:trPr>
-          <w:cantSplit w:val="0"/>
-          <w:trHeight w:val="465" w:hRule="atLeast"/>
-          <w:tblHeader w:val="0"/>
-        </w:trPr>
-        <w:tc>
-          <w:tcPr>
-            <w:tcBorders>
-              <w:top w:color="bfbfbf" w:space="0" w:sz="8" w:val="single"/>
-              <w:left w:color="bfbfbf" w:space="0" w:sz="8" w:val="single"/>
-              <w:bottom w:color="bfbfbf" w:space="0" w:sz="8" w:val="single"/>
-              <w:right w:color="bfbfbf" w:space="0" w:sz="8" w:val="single"/>
-            </w:tcBorders>
-            <w:shd w:fill="ede7f6" w:val="clear"/>
-            <w:tcMar>
-              <w:top w:w="20.0" w:type="dxa"/>
-              <w:left w:w="80.0" w:type="dxa"/>
-              <w:bottom w:w="20.0" w:type="dxa"/>
-              <w:right w:w="80.0" w:type="dxa"/>
-            </w:tcMar>
-            <w:vAlign w:val="top"/>
-          </w:tcPr>
-          <w:p>
-            <w:r/>
-          </w:p>
-        </w:tc>
-        <w:tc>
-          <w:tcPr>
-            <w:tcBorders>
-              <w:top w:color="bfbfbf" w:space="0" w:sz="8" w:val="single"/>
-              <w:left w:color="000000" w:space="0" w:sz="0" w:val="nil"/>
-              <w:bottom w:color="bfbfbf" w:space="0" w:sz="8" w:val="single"/>
-              <w:right w:color="bfbfbf" w:space="0" w:sz="8" w:val="single"/>
-            </w:tcBorders>
-            <w:shd w:fill="ede7f6" w:val="clear"/>
-            <w:tcMar>
-              <w:top w:w="20.0" w:type="dxa"/>
-              <w:left w:w="80.0" w:type="dxa"/>
-              <w:bottom w:w="20.0" w:type="dxa"/>
-              <w:right w:w="80.0" w:type="dxa"/>
-            </w:tcMar>
-            <w:vAlign w:val="top"/>
-          </w:tcPr>
-          <w:p>
-            <w:r>
-              <w:t>This setup (locked)</w:t>
-            </w:r>
-          </w:p>
-        </w:tc>
-        <w:tc>
-          <w:tcPr>
-            <w:tcBorders>
-              <w:top w:color="bfbfbf" w:space="0" w:sz="8" w:val="single"/>
-              <w:left w:color="000000" w:space="0" w:sz="0" w:val="nil"/>
-              <w:bottom w:color="bfbfbf" w:space="0" w:sz="8" w:val="single"/>
-              <w:right w:color="bfbfbf" w:space="0" w:sz="8" w:val="single"/>
-            </w:tcBorders>
-            <w:shd w:fill="ede7f6" w:val="clear"/>
-            <w:tcMar>
-              <w:top w:w="20.0" w:type="dxa"/>
-              <w:left w:w="80.0" w:type="dxa"/>
-              <w:bottom w:w="20.0" w:type="dxa"/>
-              <w:right w:w="80.0" w:type="dxa"/>
-            </w:tcMar>
-            <w:vAlign w:val="top"/>
-          </w:tcPr>
-          <w:p>
-            <w:r>
-              <w:t>Not used</w:t>
-            </w:r>
-          </w:p>
-        </w:tc>
-        <w:tc>
-          <w:tcPr>
-            <w:tcBorders>
-              <w:top w:color="bfbfbf" w:space="0" w:sz="8" w:val="single"/>
-              <w:left w:color="000000" w:space="0" w:sz="0" w:val="nil"/>
-              <w:bottom w:color="bfbfbf" w:space="0" w:sz="8" w:val="single"/>
-              <w:right w:color="bfbfbf" w:space="0" w:sz="8" w:val="single"/>
-            </w:tcBorders>
-            <w:shd w:fill="ede7f6" w:val="clear"/>
-            <w:tcMar>
-              <w:top w:w="20.0" w:type="dxa"/>
-              <w:left w:w="80.0" w:type="dxa"/>
-              <w:bottom w:w="20.0" w:type="dxa"/>
-              <w:right w:w="80.0" w:type="dxa"/>
-            </w:tcMar>
-            <w:vAlign w:val="top"/>
-          </w:tcPr>
-          <w:p>
-            <w:r>
-              <w:t>Not used</w:t>
-            </w:r>
-          </w:p>
-        </w:tc>
-      </w:tr>
-      <w:tr>
-        <w:trPr>
-          <w:cantSplit w:val="0"/>
-          <w:trHeight w:val="465" w:hRule="atLeast"/>
-          <w:tblHeader w:val="0"/>
-        </w:trPr>
-        <w:tc>
-          <w:tcPr>
-            <w:tcBorders>
-              <w:top w:color="000000" w:space="0" w:sz="0" w:val="nil"/>
-              <w:left w:color="bfbfbf" w:space="0" w:sz="8" w:val="single"/>
-              <w:bottom w:color="bfbfbf" w:space="0" w:sz="8" w:val="single"/>
-              <w:right w:color="bfbfbf" w:space="0" w:sz="8" w:val="single"/>
-            </w:tcBorders>
-            <w:tcMar>
-              <w:top w:w="20.0" w:type="dxa"/>
-              <w:left w:w="80.0" w:type="dxa"/>
-              <w:bottom w:w="20.0" w:type="dxa"/>
-              <w:right w:w="80.0" w:type="dxa"/>
-            </w:tcMar>
-            <w:vAlign w:val="top"/>
-          </w:tcPr>
-          <w:p>
-            <w:pPr>
-              <w:spacing w:after="0" w:line="276" w:lineRule="auto"/>
-              <w:rPr>
-                <w:sz w:val="17"/>
-                <w:szCs w:val="17"/>
-              </w:rPr>
-            </w:pPr>
-            <w:r>
-              <w:rPr>
-                <w:sz w:val="17"/>
-                <w:szCs w:val="17"/>
-                <w:rtl w:val="0"/>
-              </w:rPr>
-              <w:t xml:space="preserve">EC2 server</w:t>
-            </w:r>
-          </w:p>
-        </w:tc>
-        <w:tc>
-          <w:tcPr>
-            <w:tcBorders>
-              <w:top w:color="000000" w:space="0" w:sz="0" w:val="nil"/>
-              <w:left w:color="000000" w:space="0" w:sz="0" w:val="nil"/>
-              <w:bottom w:color="bfbfbf" w:space="0" w:sz="8" w:val="single"/>
-              <w:right w:color="bfbfbf" w:space="0" w:sz="8" w:val="single"/>
-            </w:tcBorders>
-            <w:tcMar>
-              <w:top w:w="20.0" w:type="dxa"/>
-              <w:left w:w="80.0" w:type="dxa"/>
-              <w:bottom w:w="20.0" w:type="dxa"/>
-              <w:right w:w="80.0" w:type="dxa"/>
-            </w:tcMar>
-            <w:vAlign w:val="top"/>
-          </w:tcPr>
-          <w:p>
-            <w:r>
-              <w:t>Same EC2 as InternSafar</w:t>
-            </w:r>
-          </w:p>
-        </w:tc>
-        <w:tc>
-          <w:tcPr>
-            <w:tcBorders>
-              <w:top w:color="000000" w:space="0" w:sz="0" w:val="nil"/>
-              <w:left w:color="000000" w:space="0" w:sz="0" w:val="nil"/>
-              <w:bottom w:color="bfbfbf" w:space="0" w:sz="8" w:val="single"/>
-              <w:right w:color="bfbfbf" w:space="0" w:sz="8" w:val="single"/>
-            </w:tcBorders>
-            <w:tcMar>
-              <w:top w:w="20.0" w:type="dxa"/>
-              <w:left w:w="80.0" w:type="dxa"/>
-              <w:bottom w:w="20.0" w:type="dxa"/>
-              <w:right w:w="80.0" w:type="dxa"/>
-            </w:tcMar>
-            <w:vAlign w:val="top"/>
-          </w:tcPr>
-          <w:p>
-            <w:r>
-              <w:t>Do not create a new EC2</w:t>
-            </w:r>
-          </w:p>
-        </w:tc>
-        <w:tc>
-          <w:tcPr>
-            <w:tcBorders>
-              <w:top w:color="000000" w:space="0" w:sz="0" w:val="nil"/>
-              <w:left w:color="000000" w:space="0" w:sz="0" w:val="nil"/>
-              <w:bottom w:color="bfbfbf" w:space="0" w:sz="8" w:val="single"/>
-              <w:right w:color="bfbfbf" w:space="0" w:sz="8" w:val="single"/>
-            </w:tcBorders>
-            <w:tcMar>
-              <w:top w:w="20.0" w:type="dxa"/>
-              <w:left w:w="80.0" w:type="dxa"/>
-              <w:bottom w:w="20.0" w:type="dxa"/>
-              <w:right w:w="80.0" w:type="dxa"/>
-            </w:tcMar>
-            <w:vAlign w:val="top"/>
-          </w:tcPr>
-          <w:p>
-            <w:r>
-              <w:t>Do not create a new EC2</w:t>
-            </w:r>
-          </w:p>
-        </w:tc>
-      </w:tr>
-      <w:tr>
-        <w:trPr>
-          <w:cantSplit w:val="0"/>
-          <w:trHeight w:val="465" w:hRule="atLeast"/>
-          <w:tblHeader w:val="0"/>
-        </w:trPr>
-        <w:tc>
-          <w:tcPr>
-            <w:tcBorders>
-              <w:top w:color="000000" w:space="0" w:sz="0" w:val="nil"/>
-              <w:left w:color="bfbfbf" w:space="0" w:sz="8" w:val="single"/>
-              <w:bottom w:color="bfbfbf" w:space="0" w:sz="8" w:val="single"/>
-              <w:right w:color="bfbfbf" w:space="0" w:sz="8" w:val="single"/>
-            </w:tcBorders>
-            <w:tcMar>
-              <w:top w:w="20.0" w:type="dxa"/>
-              <w:left w:w="80.0" w:type="dxa"/>
-              <w:bottom w:w="20.0" w:type="dxa"/>
-              <w:right w:w="80.0" w:type="dxa"/>
-            </w:tcMar>
-            <w:vAlign w:val="top"/>
-          </w:tcPr>
-          <w:p>
-            <w:pPr>
-              <w:spacing w:after="0" w:line="276" w:lineRule="auto"/>
-              <w:rPr>
-                <w:sz w:val="17"/>
-                <w:szCs w:val="17"/>
-              </w:rPr>
-            </w:pPr>
-            <w:r>
-              <w:rPr>
-                <w:sz w:val="17"/>
-                <w:szCs w:val="17"/>
-                <w:rtl w:val="0"/>
-              </w:rPr>
-              <w:t xml:space="preserve">RDS instance</w:t>
-            </w:r>
-          </w:p>
-        </w:tc>
-        <w:tc>
-          <w:tcPr>
-            <w:tcBorders>
-              <w:top w:color="000000" w:space="0" w:sz="0" w:val="nil"/>
-              <w:left w:color="000000" w:space="0" w:sz="0" w:val="nil"/>
-              <w:bottom w:color="bfbfbf" w:space="0" w:sz="8" w:val="single"/>
-              <w:right w:color="bfbfbf" w:space="0" w:sz="8" w:val="single"/>
-            </w:tcBorders>
-            <w:tcMar>
-              <w:top w:w="20.0" w:type="dxa"/>
-              <w:left w:w="80.0" w:type="dxa"/>
-              <w:bottom w:w="20.0" w:type="dxa"/>
-              <w:right w:w="80.0" w:type="dxa"/>
-            </w:tcMar>
-            <w:vAlign w:val="top"/>
-          </w:tcPr>
-          <w:p>
-            <w:r>
-              <w:t>Same RDS instance</w:t>
-            </w:r>
-          </w:p>
-        </w:tc>
-        <w:tc>
-          <w:tcPr>
-            <w:tcBorders>
-              <w:top w:color="000000" w:space="0" w:sz="0" w:val="nil"/>
-              <w:left w:color="000000" w:space="0" w:sz="0" w:val="nil"/>
-              <w:bottom w:color="bfbfbf" w:space="0" w:sz="8" w:val="single"/>
-              <w:right w:color="bfbfbf" w:space="0" w:sz="8" w:val="single"/>
-            </w:tcBorders>
-            <w:tcMar>
-              <w:top w:w="20.0" w:type="dxa"/>
-              <w:left w:w="80.0" w:type="dxa"/>
-              <w:bottom w:w="20.0" w:type="dxa"/>
-              <w:right w:w="80.0" w:type="dxa"/>
-            </w:tcMar>
-            <w:vAlign w:val="top"/>
-          </w:tcPr>
-          <w:p>
-            <w:r>
-              <w:t>Do not create a new RDS</w:t>
-            </w:r>
-          </w:p>
-        </w:tc>
-        <w:tc>
-          <w:tcPr>
-            <w:tcBorders>
-              <w:top w:color="000000" w:space="0" w:sz="0" w:val="nil"/>
-              <w:left w:color="000000" w:space="0" w:sz="0" w:val="nil"/>
-              <w:bottom w:color="bfbfbf" w:space="0" w:sz="8" w:val="single"/>
-              <w:right w:color="bfbfbf" w:space="0" w:sz="8" w:val="single"/>
-            </w:tcBorders>
-            <w:tcMar>
-              <w:top w:w="20.0" w:type="dxa"/>
-              <w:left w:w="80.0" w:type="dxa"/>
-              <w:bottom w:w="20.0" w:type="dxa"/>
-              <w:right w:w="80.0" w:type="dxa"/>
-            </w:tcMar>
-            <w:vAlign w:val="top"/>
-          </w:tcPr>
-          <w:p>
-            <w:r>
-              <w:t>Do not create a new RDS</w:t>
-            </w:r>
-          </w:p>
-        </w:tc>
-      </w:tr>
-      <w:tr>
-        <w:trPr>
-          <w:cantSplit w:val="0"/>
-          <w:trHeight w:val="465" w:hRule="atLeast"/>
-          <w:tblHeader w:val="0"/>
-        </w:trPr>
-        <w:tc>
-          <w:tcPr>
-            <w:tcBorders>
-              <w:top w:color="000000" w:space="0" w:sz="0" w:val="nil"/>
-              <w:left w:color="bfbfbf" w:space="0" w:sz="8" w:val="single"/>
-              <w:bottom w:color="bfbfbf" w:space="0" w:sz="8" w:val="single"/>
-              <w:right w:color="bfbfbf" w:space="0" w:sz="8" w:val="single"/>
-            </w:tcBorders>
-            <w:tcMar>
-              <w:top w:w="20.0" w:type="dxa"/>
-              <w:left w:w="80.0" w:type="dxa"/>
-              <w:bottom w:w="20.0" w:type="dxa"/>
-              <w:right w:w="80.0" w:type="dxa"/>
-            </w:tcMar>
-            <w:vAlign w:val="top"/>
-          </w:tcPr>
-          <w:p>
-            <w:pPr>
-              <w:spacing w:after="0" w:line="276" w:lineRule="auto"/>
-              <w:rPr>
-                <w:sz w:val="17"/>
-                <w:szCs w:val="17"/>
-              </w:rPr>
-            </w:pPr>
-            <w:r>
-              <w:rPr>
-                <w:sz w:val="17"/>
-                <w:szCs w:val="17"/>
-                <w:rtl w:val="0"/>
-              </w:rPr>
-              <w:t xml:space="preserve">Database</w:t>
-            </w:r>
-          </w:p>
-        </w:tc>
-        <w:tc>
-          <w:tcPr>
-            <w:tcBorders>
-              <w:top w:color="000000" w:space="0" w:sz="0" w:val="nil"/>
-              <w:left w:color="000000" w:space="0" w:sz="0" w:val="nil"/>
-              <w:bottom w:color="bfbfbf" w:space="0" w:sz="8" w:val="single"/>
-              <w:right w:color="bfbfbf" w:space="0" w:sz="8" w:val="single"/>
-            </w:tcBorders>
-            <w:tcMar>
-              <w:top w:w="20.0" w:type="dxa"/>
-              <w:left w:w="80.0" w:type="dxa"/>
-              <w:bottom w:w="20.0" w:type="dxa"/>
-              <w:right w:w="80.0" w:type="dxa"/>
-            </w:tcMar>
-            <w:vAlign w:val="top"/>
-          </w:tcPr>
-          <w:p>
-            <w:r>
-              <w:t>Same database InternSafar already uses</w:t>
-            </w:r>
-          </w:p>
-        </w:tc>
-        <w:tc>
-          <w:tcPr>
-            <w:tcBorders>
-              <w:top w:color="000000" w:space="0" w:sz="0" w:val="nil"/>
-              <w:left w:color="000000" w:space="0" w:sz="0" w:val="nil"/>
-              <w:bottom w:color="bfbfbf" w:space="0" w:sz="8" w:val="single"/>
-              <w:right w:color="bfbfbf" w:space="0" w:sz="8" w:val="single"/>
-            </w:tcBorders>
-            <w:tcMar>
-              <w:top w:w="20.0" w:type="dxa"/>
-              <w:left w:w="80.0" w:type="dxa"/>
-              <w:bottom w:w="20.0" w:type="dxa"/>
-              <w:right w:w="80.0" w:type="dxa"/>
-            </w:tcMar>
-            <w:vAlign w:val="top"/>
-          </w:tcPr>
-          <w:p>
-            <w:r>
-              <w:t>Do not create a placementhub database</w:t>
-            </w:r>
-          </w:p>
-        </w:tc>
-        <w:tc>
-          <w:tcPr>
-            <w:tcBorders>
-              <w:top w:color="000000" w:space="0" w:sz="0" w:val="nil"/>
-              <w:left w:color="000000" w:space="0" w:sz="0" w:val="nil"/>
-              <w:bottom w:color="bfbfbf" w:space="0" w:sz="8" w:val="single"/>
-              <w:right w:color="bfbfbf" w:space="0" w:sz="8" w:val="single"/>
-            </w:tcBorders>
-            <w:tcMar>
-              <w:top w:w="20.0" w:type="dxa"/>
-              <w:left w:w="80.0" w:type="dxa"/>
-              <w:bottom w:w="20.0" w:type="dxa"/>
-              <w:right w:w="80.0" w:type="dxa"/>
-            </w:tcMar>
-            <w:vAlign w:val="top"/>
-          </w:tcPr>
-          <w:p>
-            <w:r>
-              <w:t>Do not create a placementhub database</w:t>
-            </w:r>
-          </w:p>
-        </w:tc>
-      </w:tr>
-      <w:tr>
-        <w:trPr>
-          <w:cantSplit w:val="0"/>
-          <w:trHeight w:val="465" w:hRule="atLeast"/>
-          <w:tblHeader w:val="0"/>
-        </w:trPr>
-        <w:tc>
-          <w:tcPr>
-            <w:tcBorders>
-              <w:top w:color="000000" w:space="0" w:sz="0" w:val="nil"/>
-              <w:left w:color="bfbfbf" w:space="0" w:sz="8" w:val="single"/>
-              <w:bottom w:color="bfbfbf" w:space="0" w:sz="8" w:val="single"/>
-              <w:right w:color="bfbfbf" w:space="0" w:sz="8" w:val="single"/>
-            </w:tcBorders>
-            <w:tcMar>
-              <w:top w:w="20.0" w:type="dxa"/>
-              <w:left w:w="80.0" w:type="dxa"/>
-              <w:bottom w:w="20.0" w:type="dxa"/>
-              <w:right w:w="80.0" w:type="dxa"/>
-            </w:tcMar>
-            <w:vAlign w:val="top"/>
-          </w:tcPr>
-          <w:p>
-            <w:pPr>
-              <w:spacing w:after="0" w:line="276" w:lineRule="auto"/>
-              <w:rPr>
-                <w:sz w:val="17"/>
-                <w:szCs w:val="17"/>
-              </w:rPr>
-            </w:pPr>
-            <w:r>
-              <w:rPr>
-                <w:sz w:val="17"/>
-                <w:szCs w:val="17"/>
-                <w:rtl w:val="0"/>
-              </w:rPr>
-              <w:t xml:space="preserve">Extra AWS cost</w:t>
-            </w:r>
-          </w:p>
-        </w:tc>
-        <w:tc>
-          <w:tcPr>
-            <w:tcBorders>
-              <w:top w:color="000000" w:space="0" w:sz="0" w:val="nil"/>
-              <w:left w:color="000000" w:space="0" w:sz="0" w:val="nil"/>
-              <w:bottom w:color="bfbfbf" w:space="0" w:sz="8" w:val="single"/>
-              <w:right w:color="bfbfbf" w:space="0" w:sz="8" w:val="single"/>
-            </w:tcBorders>
-            <w:tcMar>
-              <w:top w:w="20.0" w:type="dxa"/>
-              <w:left w:w="80.0" w:type="dxa"/>
-              <w:bottom w:w="20.0" w:type="dxa"/>
-              <w:right w:w="80.0" w:type="dxa"/>
-            </w:tcMar>
-            <w:vAlign w:val="top"/>
-          </w:tcPr>
-          <w:p>
-            <w:r>
-              <w:t>None</w:t>
-            </w:r>
-          </w:p>
-        </w:tc>
-        <w:tc>
-          <w:tcPr>
-            <w:tcBorders>
-              <w:top w:color="000000" w:space="0" w:sz="0" w:val="nil"/>
-              <w:left w:color="000000" w:space="0" w:sz="0" w:val="nil"/>
-              <w:bottom w:color="bfbfbf" w:space="0" w:sz="8" w:val="single"/>
-              <w:right w:color="bfbfbf" w:space="0" w:sz="8" w:val="single"/>
-            </w:tcBorders>
-            <w:tcMar>
-              <w:top w:w="20.0" w:type="dxa"/>
-              <w:left w:w="80.0" w:type="dxa"/>
-              <w:bottom w:w="20.0" w:type="dxa"/>
-              <w:right w:w="80.0" w:type="dxa"/>
-            </w:tcMar>
-            <w:vAlign w:val="top"/>
-          </w:tcPr>
-          <w:p>
-            <w:r>
-              <w:t>—</w:t>
-            </w:r>
-          </w:p>
-        </w:tc>
-        <w:tc>
-          <w:tcPr>
-            <w:tcBorders>
-              <w:top w:color="000000" w:space="0" w:sz="0" w:val="nil"/>
-              <w:left w:color="000000" w:space="0" w:sz="0" w:val="nil"/>
-              <w:bottom w:color="bfbfbf" w:space="0" w:sz="8" w:val="single"/>
-              <w:right w:color="bfbfbf" w:space="0" w:sz="8" w:val="single"/>
-            </w:tcBorders>
-            <w:tcMar>
-              <w:top w:w="20.0" w:type="dxa"/>
-              <w:left w:w="80.0" w:type="dxa"/>
-              <w:bottom w:w="20.0" w:type="dxa"/>
-              <w:right w:w="80.0" w:type="dxa"/>
-            </w:tcMar>
-            <w:vAlign w:val="top"/>
-          </w:tcPr>
-          <w:p>
-            <w:r>
-              <w:t>—</w:t>
-            </w:r>
-          </w:p>
-        </w:tc>
-      </w:tr>
-      <w:tr>
-        <w:trPr>
-          <w:cantSplit w:val="0"/>
-          <w:trHeight w:val="270" w:hRule="atLeast"/>
-          <w:tblHeader w:val="0"/>
-        </w:trPr>
-        <w:tc>
-          <w:tcPr>
-            <w:tcBorders>
-              <w:top w:color="000000" w:space="0" w:sz="0" w:val="nil"/>
-              <w:left w:color="bfbfbf" w:space="0" w:sz="8" w:val="single"/>
-              <w:bottom w:color="bfbfbf" w:space="0" w:sz="8" w:val="single"/>
-              <w:right w:color="bfbfbf" w:space="0" w:sz="8" w:val="single"/>
-            </w:tcBorders>
-            <w:tcMar>
-              <w:top w:w="20.0" w:type="dxa"/>
-              <w:left w:w="80.0" w:type="dxa"/>
-              <w:bottom w:w="20.0" w:type="dxa"/>
-              <w:right w:w="80.0" w:type="dxa"/>
-            </w:tcMar>
-            <w:vAlign w:val="top"/>
-          </w:tcPr>
-          <w:p>
-            <w:pPr>
-              <w:spacing w:after="0" w:line="276" w:lineRule="auto"/>
-              <w:rPr>
-                <w:sz w:val="17"/>
-                <w:szCs w:val="17"/>
-              </w:rPr>
-            </w:pPr>
-            <w:r>
-              <w:rPr>
-                <w:sz w:val="17"/>
-                <w:szCs w:val="17"/>
-                <w:rtl w:val="0"/>
-              </w:rPr>
-              <w:t xml:space="preserve">InternSafar checks</w:t>
-            </w:r>
-          </w:p>
-        </w:tc>
-        <w:tc>
-          <w:tcPr>
-            <w:tcBorders>
-              <w:top w:color="000000" w:space="0" w:sz="0" w:val="nil"/>
-              <w:left w:color="000000" w:space="0" w:sz="0" w:val="nil"/>
-              <w:bottom w:color="bfbfbf" w:space="0" w:sz="8" w:val="single"/>
-              <w:right w:color="bfbfbf" w:space="0" w:sz="8" w:val="single"/>
-            </w:tcBorders>
-            <w:tcMar>
-              <w:top w:w="20.0" w:type="dxa"/>
-              <w:left w:w="80.0" w:type="dxa"/>
-              <w:bottom w:w="20.0" w:type="dxa"/>
-              <w:right w:w="80.0" w:type="dxa"/>
-            </w:tcMar>
-            <w:vAlign w:val="top"/>
-          </w:tcPr>
-          <w:p>
-            <w:r>
-              <w:t>Yes — InternSafar must stay up, and its data must be unchanged</w:t>
-            </w:r>
-          </w:p>
-        </w:tc>
-        <w:tc>
-          <w:tcPr>
-            <w:tcBorders>
-              <w:top w:color="000000" w:space="0" w:sz="0" w:val="nil"/>
-              <w:left w:color="000000" w:space="0" w:sz="0" w:val="nil"/>
-              <w:bottom w:color="bfbfbf" w:space="0" w:sz="8" w:val="single"/>
-              <w:right w:color="bfbfbf" w:space="0" w:sz="8" w:val="single"/>
-            </w:tcBorders>
-            <w:tcMar>
-              <w:top w:w="20.0" w:type="dxa"/>
-              <w:left w:w="80.0" w:type="dxa"/>
-              <w:bottom w:w="20.0" w:type="dxa"/>
-              <w:right w:w="80.0" w:type="dxa"/>
-            </w:tcMar>
-            <w:vAlign w:val="top"/>
-          </w:tcPr>
-          <w:p>
-            <w:r>
-              <w:t>—</w:t>
-            </w:r>
-          </w:p>
-        </w:tc>
-        <w:tc>
-          <w:tcPr>
-            <w:tcBorders>
-              <w:top w:color="000000" w:space="0" w:sz="0" w:val="nil"/>
-              <w:left w:color="000000" w:space="0" w:sz="0" w:val="nil"/>
-              <w:bottom w:color="bfbfbf" w:space="0" w:sz="8" w:val="single"/>
-              <w:right w:color="bfbfbf" w:space="0" w:sz="8" w:val="single"/>
-            </w:tcBorders>
-            <w:tcMar>
-              <w:top w:w="20.0" w:type="dxa"/>
-              <w:left w:w="80.0" w:type="dxa"/>
-              <w:bottom w:w="20.0" w:type="dxa"/>
-              <w:right w:w="80.0" w:type="dxa"/>
-            </w:tcMar>
-            <w:vAlign w:val="top"/>
-          </w:tcPr>
-          <w:p>
-            <w:r>
-              <w:t>—</w:t>
-            </w:r>
-          </w:p>
-        </w:tc>
-      </w:tr>
-    </w:tbl>
-    <w:p>
-      <w:pPr>
-        <w:spacing w:after="0" w:line="130.9090909090909" w:lineRule="auto"/>
-        <w:rPr/>
-      </w:pPr>
-      <w:r>
-        <w:rPr>
-          <w:rtl w:val="0"/>
-        </w:rPr>
-        <w:t xml:space="preserve"> </w:t>
-      </w:r>
-    </w:p>
-    <w:p>
-      <w:pPr>
-        <w:spacing w:after="60" w:lineRule="auto"/>
-        <w:rPr/>
-      </w:pPr>
-      <w:r>
-        <w:rPr>
-          <w:rtl w:val="0"/>
-        </w:rPr>
-        <w:t>The commands below all use that existing database. The name-clash check and the InternSafar before-and-after check are what keep the two apps apart.</w:t>
-      </w:r>
-    </w:p>
-    <w:p>
-      <w:pPr>
-        <w:pStyle w:val="Heading2"/>
-        <w:keepNext w:val="0"/>
-        <w:keepLines w:val="0"/>
-        <w:spacing w:after="80" w:before="360" w:lineRule="auto"/>
-        <w:ind w:left="288" w:firstLine="0"/>
-        <w:rPr>
-          <w:rFonts w:ascii="Open Sans" w:cs="Open Sans" w:eastAsia="Open Sans" w:hAnsi="Open Sans"/>
-          <w:color w:val="000000"/>
-          <w:sz w:val="34"/>
-          <w:szCs w:val="34"/>
-        </w:rPr>
-      </w:pPr>
-      <w:bookmarkStart w:colFirst="0" w:colLast="0" w:name="_oj1j4sh3acpw" w:id="3"/>
-      <w:bookmarkEnd w:id="3"/>
-      <w:r>
-        <w:rPr>
-          <w:rFonts w:ascii="Open Sans" w:cs="Open Sans" w:eastAsia="Open Sans" w:hAnsi="Open Sans"/>
-          <w:color w:val="000000"/>
-          <w:sz w:val="34"/>
-          <w:szCs w:val="34"/>
-          <w:rtl w:val="0"/>
-        </w:rPr>
-        <w:t>The shared database</w:t>
-      </w:r>
-    </w:p>
-    <w:p>
-      <w:pPr>
-        <w:spacing w:after="60" w:lineRule="auto"/>
-        <w:rPr/>
-      </w:pPr>
-      <w:r>
-        <w:rPr>
-          <w:rtl w:val="0"/>
-        </w:rPr>
-        <w:t>PlacementHub’s tables go into the database InternSafar already uses. The database name is read from InternSafar’s settings later in this guide.</w:t>
-      </w:r>
-    </w:p>
-    <w:p>
-      <w:pPr>
-        <w:spacing w:after="20" w:lineRule="auto"/>
-        <w:ind w:left="660" w:hanging="220"/>
-        <w:rPr/>
-      </w:pPr>
-      <w:r>
-        <w:rPr>
-          <w:rtl w:val="0"/>
-        </w:rPr>
-        <w:t xml:space="preserve">•  Why it works: PlacementHub tables have plain names (users, tenants, job_postings …); every InternSafar table starts with ip_ or ism_. Both sets already coexist in PlacementHub's Supabase database.</w:t>
-      </w:r>
-    </w:p>
-    <w:p>
-      <w:pPr>
-        <w:spacing w:after="20" w:lineRule="auto"/>
-        <w:ind w:left="660" w:hanging="220"/>
-        <w:rPr/>
-      </w:pPr>
-      <w:r>
-        <w:rPr>
-          <w:rtl w:val="0"/>
-        </w:rPr>
-        <w:t>•  How it stays safe: before any table is created, a name-clash check must print nothing. After the tables exist, InternSafar’s table list and user count must match the baseline taken at the start.</w:t>
-      </w:r>
-    </w:p>
-    <w:p>
-      <w:pPr>
-        <w:spacing w:after="20" w:lineRule="auto"/>
-        <w:ind w:left="660" w:hanging="220"/>
-        <w:rPr/>
-      </w:pPr>
-      <w:r>
-        <w:rPr>
-          <w:rtl w:val="0"/>
-        </w:rPr>
-        <w:t xml:space="preserve">•  Trade-off: a wrong hand-typed SQL command could reach InternSafar tables, and a database restore affects both apps.</w:t>
-      </w:r>
-    </w:p>
-    <w:p>
-      <w:pPr>
-        <w:pStyle w:val="Heading1"/>
-        <w:keepNext w:val="0"/>
-        <w:keepLines w:val="0"/>
-        <w:spacing w:after="120" w:lineRule="auto"/>
-        <w:ind w:left="288" w:firstLine="0"/>
-        <w:rPr>
-          <w:rFonts w:ascii="Open Sans" w:cs="Open Sans" w:eastAsia="Open Sans" w:hAnsi="Open Sans"/>
-          <w:color w:val="000000"/>
-          <w:sz w:val="46"/>
-          <w:szCs w:val="46"/>
-        </w:rPr>
-      </w:pPr>
-      <w:bookmarkStart w:colFirst="0" w:colLast="0" w:name="_gfflww74nnmh" w:id="6"/>
-      <w:bookmarkEnd w:id="6"/>
-      <w:r>
-        <w:rPr>
-          <w:rFonts w:ascii="Open Sans" w:cs="Open Sans" w:eastAsia="Open Sans" w:hAnsi="Open Sans"/>
-          <w:color w:val="000000"/>
-          <w:sz w:val="46"/>
-          <w:szCs w:val="46"/>
-          <w:rtl w:val="0"/>
-        </w:rPr>
-        <w:t xml:space="preserve">4. PlacementHub folder structure</w:t>
+        <w:t>PlacementHub folder structure</w:t>
       </w:r>
     </w:p>
     <w:p>
@@ -4125,9 +1709,9 @@
           <w:szCs w:val="16"/>
           <w:rtl w:val="0"/>
         </w:rPr>
-        <w:t xml:space="preserve">├── next.config.mjs, vercel.json</w:t>
+        <w:t>├── next.config.mjs, vercel.json</w:t>
         <w:tab/>
-        <w:t xml:space="preserve">build config; the vercel.json cron moves to Part H</w:t>
+        <w:t>build config; the vercel.json cron is set up in the semester rollover section</w:t>
       </w:r>
     </w:p>
     <w:p>
@@ -4252,7 +1836,7 @@
         </w:rPr>
         <w:t xml:space="preserve">├── placementhub/               </w:t>
         <w:tab/>
-        <w:t xml:space="preserve">PlacementHub app (new, Part B)</w:t>
+        <w:t>PlacementHub app (new)</w:t>
       </w:r>
     </w:p>
     <w:p>
@@ -4411,7 +1995,7 @@
         </w:rPr>
         <w:t xml:space="preserve">├── placementhub-cron.sh        </w:t>
         <w:tab/>
-        <w:t xml:space="preserve">semester rollover script (Part H)</w:t>
+        <w:t>semester rollover script</w:t>
       </w:r>
     </w:p>
     <w:p>
@@ -5052,7 +2636,7 @@
           <w:szCs w:val="46"/>
           <w:rtl w:val="0"/>
         </w:rPr>
-        <w:t xml:space="preserve">5. Compared with InternSafar's first-time setup</w:t>
+        <w:t>Compared with InternSafar's first-time setup</w:t>
       </w:r>
     </w:p>
     <w:p>
@@ -6665,7 +4249,7 @@
           <w:szCs w:val="46"/>
           <w:rtl w:val="0"/>
         </w:rPr>
-        <w:t xml:space="preserve">6. Decisions to confirm before starting</w:t>
+        <w:t>Decisions still open</w:t>
       </w:r>
     </w:p>
     <w:p>
@@ -6677,7 +4261,7 @@
         <w:rPr>
           <w:rtl w:val="0"/>
         </w:rPr>
-        <w:t>The rows marked locked are already decided. Confirm only the rows that still have a choice: starting data, file storage, email, and what happens to the Vercel site.</w:t>
+        <w:t>Confirm these before starting. They are the choices still open.</w:t>
       </w:r>
     </w:p>
     <w:tbl>
@@ -6893,7 +4477,7 @@
                 <w:szCs w:val="17"/>
                 <w:rtl w:val="0"/>
               </w:rPr>
-              <w:t xml:space="preserve">Where to run</w:t>
+              <w:t xml:space="preserve">Starting data</w:t>
             </w:r>
           </w:p>
         </w:tc>
@@ -6914,8 +4498,20 @@
             <w:vAlign w:val="top"/>
           </w:tcPr>
           <w:p>
-            <w:r>
-              <w:t>Same EC2 as InternSafar</w:t>
+            <w:pPr>
+              <w:spacing w:after="0" w:line="276" w:lineRule="auto"/>
+              <w:rPr>
+                <w:sz w:val="17"/>
+                <w:szCs w:val="17"/>
+              </w:rPr>
+            </w:pPr>
+            <w:r>
+              <w:rPr>
+                <w:sz w:val="17"/>
+                <w:szCs w:val="17"/>
+                <w:rtl w:val="0"/>
+              </w:rPr>
+              <w:t xml:space="preserve">Clean start: one SuperAdmin + reference data</w:t>
             </w:r>
           </w:p>
         </w:tc>
@@ -6936,8 +4532,20 @@
             <w:vAlign w:val="top"/>
           </w:tcPr>
           <w:p>
-            <w:r>
-              <w:t>No second server</w:t>
+            <w:pPr>
+              <w:spacing w:after="0" w:line="276" w:lineRule="auto"/>
+              <w:rPr>
+                <w:sz w:val="17"/>
+                <w:szCs w:val="17"/>
+              </w:rPr>
+            </w:pPr>
+            <w:r>
+              <w:rPr>
+                <w:sz w:val="17"/>
+                <w:szCs w:val="17"/>
+                <w:rtl w:val="0"/>
+              </w:rPr>
+              <w:t xml:space="preserve">Copy today's Vercel/Supabase data (not tested)</w:t>
             </w:r>
           </w:p>
         </w:tc>
@@ -6959,7 +4567,7 @@
           </w:tcPr>
           <w:p>
             <w:r>
-              <w:t>Locked</w:t>
+              <w:t>Still a choice</w:t>
             </w:r>
           </w:p>
         </w:tc>
@@ -7000,7 +4608,7 @@
                 <w:szCs w:val="17"/>
                 <w:rtl w:val="0"/>
               </w:rPr>
-              <w:t xml:space="preserve">Database method</w:t>
+              <w:t xml:space="preserve">File storage</w:t>
             </w:r>
           </w:p>
         </w:tc>
@@ -7021,8 +4629,20 @@
             <w:vAlign w:val="top"/>
           </w:tcPr>
           <w:p>
-            <w:r>
-              <w:t>Same database InternSafar already uses</w:t>
+            <w:pPr>
+              <w:spacing w:after="0" w:line="276" w:lineRule="auto"/>
+              <w:rPr>
+                <w:sz w:val="17"/>
+                <w:szCs w:val="17"/>
+              </w:rPr>
+            </w:pPr>
+            <w:r>
+              <w:rPr>
+                <w:sz w:val="17"/>
+                <w:szCs w:val="17"/>
+                <w:rtl w:val="0"/>
+              </w:rPr>
+              <w:t xml:space="preserve">Reuse the S3 bucket the Vercel site uses</w:t>
             </w:r>
           </w:p>
         </w:tc>
@@ -7043,8 +4663,20 @@
             <w:vAlign w:val="top"/>
           </w:tcPr>
           <w:p>
-            <w:r>
-              <w:t>No second database</w:t>
+            <w:pPr>
+              <w:spacing w:after="0" w:line="276" w:lineRule="auto"/>
+              <w:rPr>
+                <w:sz w:val="17"/>
+                <w:szCs w:val="17"/>
+              </w:rPr>
+            </w:pPr>
+            <w:r>
+              <w:rPr>
+                <w:sz w:val="17"/>
+                <w:szCs w:val="17"/>
+                <w:rtl w:val="0"/>
+              </w:rPr>
+              <w:t xml:space="preserve">A new bucket</w:t>
             </w:r>
           </w:p>
         </w:tc>
@@ -7066,7 +4698,138 @@
           </w:tcPr>
           <w:p>
             <w:r>
-              <w:t>Locked</w:t>
+              <w:t>Still a choice</w:t>
+            </w:r>
+          </w:p>
+        </w:tc>
+      </w:tr>
+      <w:tr>
+        <w:trPr>
+          <w:cantSplit w:val="0"/>
+          <w:trHeight w:val="270" w:hRule="atLeast"/>
+          <w:tblHeader w:val="0"/>
+        </w:trPr>
+        <w:tc>
+          <w:tcPr>
+            <w:tcBorders>
+              <w:top w:color="000000" w:space="0" w:sz="0" w:val="nil"/>
+              <w:left w:color="bfbfbf" w:space="0" w:sz="8" w:val="single"/>
+              <w:bottom w:color="bfbfbf" w:space="0" w:sz="8" w:val="single"/>
+              <w:right w:color="bfbfbf" w:space="0" w:sz="8" w:val="single"/>
+            </w:tcBorders>
+            <w:tcMar>
+              <w:top w:w="20.0" w:type="dxa"/>
+              <w:left w:w="80.0" w:type="dxa"/>
+              <w:bottom w:w="20.0" w:type="dxa"/>
+              <w:right w:w="80.0" w:type="dxa"/>
+            </w:tcMar>
+            <w:vAlign w:val="top"/>
+          </w:tcPr>
+          <w:p>
+            <w:pPr>
+              <w:spacing w:after="0" w:line="276" w:lineRule="auto"/>
+              <w:rPr>
+                <w:sz w:val="17"/>
+                <w:szCs w:val="17"/>
+              </w:rPr>
+            </w:pPr>
+            <w:r>
+              <w:rPr>
+                <w:sz w:val="17"/>
+                <w:szCs w:val="17"/>
+                <w:rtl w:val="0"/>
+              </w:rPr>
+              <w:t xml:space="preserve">Email provider</w:t>
+            </w:r>
+          </w:p>
+        </w:tc>
+        <w:tc>
+          <w:tcPr>
+            <w:tcBorders>
+              <w:top w:color="000000" w:space="0" w:sz="0" w:val="nil"/>
+              <w:left w:color="000000" w:space="0" w:sz="0" w:val="nil"/>
+              <w:bottom w:color="bfbfbf" w:space="0" w:sz="8" w:val="single"/>
+              <w:right w:color="bfbfbf" w:space="0" w:sz="8" w:val="single"/>
+            </w:tcBorders>
+            <w:tcMar>
+              <w:top w:w="20.0" w:type="dxa"/>
+              <w:left w:w="80.0" w:type="dxa"/>
+              <w:bottom w:w="20.0" w:type="dxa"/>
+              <w:right w:w="80.0" w:type="dxa"/>
+            </w:tcMar>
+            <w:vAlign w:val="top"/>
+          </w:tcPr>
+          <w:p>
+            <w:pPr>
+              <w:spacing w:after="0" w:line="276" w:lineRule="auto"/>
+              <w:rPr>
+                <w:sz w:val="17"/>
+                <w:szCs w:val="17"/>
+              </w:rPr>
+            </w:pPr>
+            <w:r>
+              <w:rPr>
+                <w:sz w:val="17"/>
+                <w:szCs w:val="17"/>
+                <w:rtl w:val="0"/>
+              </w:rPr>
+              <w:t xml:space="preserve">ZeptoMail</w:t>
+            </w:r>
+          </w:p>
+        </w:tc>
+        <w:tc>
+          <w:tcPr>
+            <w:tcBorders>
+              <w:top w:color="000000" w:space="0" w:sz="0" w:val="nil"/>
+              <w:left w:color="000000" w:space="0" w:sz="0" w:val="nil"/>
+              <w:bottom w:color="bfbfbf" w:space="0" w:sz="8" w:val="single"/>
+              <w:right w:color="bfbfbf" w:space="0" w:sz="8" w:val="single"/>
+            </w:tcBorders>
+            <w:tcMar>
+              <w:top w:w="20.0" w:type="dxa"/>
+              <w:left w:w="80.0" w:type="dxa"/>
+              <w:bottom w:w="20.0" w:type="dxa"/>
+              <w:right w:w="80.0" w:type="dxa"/>
+            </w:tcMar>
+            <w:vAlign w:val="top"/>
+          </w:tcPr>
+          <w:p>
+            <w:pPr>
+              <w:spacing w:after="0" w:line="276" w:lineRule="auto"/>
+              <w:rPr>
+                <w:sz w:val="17"/>
+                <w:szCs w:val="17"/>
+              </w:rPr>
+            </w:pPr>
+            <w:r>
+              <w:rPr>
+                <w:sz w:val="17"/>
+                <w:szCs w:val="17"/>
+                <w:rtl w:val="0"/>
+              </w:rPr>
+              <w:t xml:space="preserve">SMTP</w:t>
+            </w:r>
+          </w:p>
+        </w:tc>
+        <w:tc>
+          <w:tcPr>
+            <w:tcBorders>
+              <w:top w:color="000000" w:space="0" w:sz="0" w:val="nil"/>
+              <w:left w:color="000000" w:space="0" w:sz="0" w:val="nil"/>
+              <w:bottom w:color="bfbfbf" w:space="0" w:sz="8" w:val="single"/>
+              <w:right w:color="bfbfbf" w:space="0" w:sz="8" w:val="single"/>
+            </w:tcBorders>
+            <w:tcMar>
+              <w:top w:w="20.0" w:type="dxa"/>
+              <w:left w:w="80.0" w:type="dxa"/>
+              <w:bottom w:w="20.0" w:type="dxa"/>
+              <w:right w:w="80.0" w:type="dxa"/>
+            </w:tcMar>
+            <w:vAlign w:val="top"/>
+          </w:tcPr>
+          <w:p>
+            <w:r>
+              <w:t>Still a choice</w:t>
             </w:r>
           </w:p>
         </w:tc>
@@ -7107,7 +4870,7 @@
                 <w:szCs w:val="17"/>
                 <w:rtl w:val="0"/>
               </w:rPr>
-              <w:t xml:space="preserve">Starting data</w:t>
+              <w:t xml:space="preserve">Database login</w:t>
             </w:r>
           </w:p>
         </w:tc>
@@ -7141,7 +4904,7 @@
                 <w:szCs w:val="17"/>
                 <w:rtl w:val="0"/>
               </w:rPr>
-              <w:t xml:space="preserve">Clean start: one SuperAdmin + reference data</w:t>
+              <w:t xml:space="preserve">Existing RDS user</w:t>
             </w:r>
           </w:p>
         </w:tc>
@@ -7175,7 +4938,7 @@
                 <w:szCs w:val="17"/>
                 <w:rtl w:val="0"/>
               </w:rPr>
-              <w:t xml:space="preserve">Copy today's Vercel/Supabase data (not tested)</w:t>
+              <w:t xml:space="preserve">Separate PlacementHub-only login (not covered)</w:t>
             </w:r>
           </w:p>
         </w:tc>
@@ -7197,352 +4960,7 @@
           </w:tcPr>
           <w:p>
             <w:r>
-              <w:t>Still a choice</w:t>
-            </w:r>
-          </w:p>
-        </w:tc>
-      </w:tr>
-      <w:tr>
-        <w:trPr>
-          <w:cantSplit w:val="0"/>
-          <w:trHeight w:val="465" w:hRule="atLeast"/>
-          <w:tblHeader w:val="0"/>
-        </w:trPr>
-        <w:tc>
-          <w:tcPr>
-            <w:tcBorders>
-              <w:top w:color="000000" w:space="0" w:sz="0" w:val="nil"/>
-              <w:left w:color="bfbfbf" w:space="0" w:sz="8" w:val="single"/>
-              <w:bottom w:color="bfbfbf" w:space="0" w:sz="8" w:val="single"/>
-              <w:right w:color="bfbfbf" w:space="0" w:sz="8" w:val="single"/>
-            </w:tcBorders>
-            <w:tcMar>
-              <w:top w:w="20.0" w:type="dxa"/>
-              <w:left w:w="80.0" w:type="dxa"/>
-              <w:bottom w:w="20.0" w:type="dxa"/>
-              <w:right w:w="80.0" w:type="dxa"/>
-            </w:tcMar>
-            <w:vAlign w:val="top"/>
-          </w:tcPr>
-          <w:p>
-            <w:pPr>
-              <w:spacing w:after="0" w:line="276" w:lineRule="auto"/>
-              <w:rPr>
-                <w:sz w:val="17"/>
-                <w:szCs w:val="17"/>
-              </w:rPr>
-            </w:pPr>
-            <w:r>
-              <w:rPr>
-                <w:sz w:val="17"/>
-                <w:szCs w:val="17"/>
-                <w:rtl w:val="0"/>
-              </w:rPr>
-              <w:t xml:space="preserve">Server memory</w:t>
-            </w:r>
-          </w:p>
-        </w:tc>
-        <w:tc>
-          <w:tcPr>
-            <w:tcBorders>
-              <w:top w:color="000000" w:space="0" w:sz="0" w:val="nil"/>
-              <w:left w:color="000000" w:space="0" w:sz="0" w:val="nil"/>
-              <w:bottom w:color="bfbfbf" w:space="0" w:sz="8" w:val="single"/>
-              <w:right w:color="bfbfbf" w:space="0" w:sz="8" w:val="single"/>
-            </w:tcBorders>
-            <w:tcMar>
-              <w:top w:w="20.0" w:type="dxa"/>
-              <w:left w:w="80.0" w:type="dxa"/>
-              <w:bottom w:w="20.0" w:type="dxa"/>
-              <w:right w:w="80.0" w:type="dxa"/>
-            </w:tcMar>
-            <w:vAlign w:val="top"/>
-          </w:tcPr>
-          <w:p>
-            <w:r>
-              <w:t>Add 4 GB swap. The machine stays up.</w:t>
-            </w:r>
-          </w:p>
-        </w:tc>
-        <w:tc>
-          <w:tcPr>
-            <w:tcBorders>
-              <w:top w:color="000000" w:space="0" w:sz="0" w:val="nil"/>
-              <w:left w:color="000000" w:space="0" w:sz="0" w:val="nil"/>
-              <w:bottom w:color="bfbfbf" w:space="0" w:sz="8" w:val="single"/>
-              <w:right w:color="bfbfbf" w:space="0" w:sz="8" w:val="single"/>
-            </w:tcBorders>
-            <w:tcMar>
-              <w:top w:w="20.0" w:type="dxa"/>
-              <w:left w:w="80.0" w:type="dxa"/>
-              <w:bottom w:w="20.0" w:type="dxa"/>
-              <w:right w:w="80.0" w:type="dxa"/>
-            </w:tcMar>
-            <w:vAlign w:val="top"/>
-          </w:tcPr>
-          <w:p>
-            <w:r>
-              <w:t>Do not resize. A resize takes the machine offline.</w:t>
-            </w:r>
-          </w:p>
-        </w:tc>
-        <w:tc>
-          <w:tcPr>
-            <w:tcBorders>
-              <w:top w:color="000000" w:space="0" w:sz="0" w:val="nil"/>
-              <w:left w:color="000000" w:space="0" w:sz="0" w:val="nil"/>
-              <w:bottom w:color="bfbfbf" w:space="0" w:sz="8" w:val="single"/>
-              <w:right w:color="bfbfbf" w:space="0" w:sz="8" w:val="single"/>
-            </w:tcBorders>
-            <w:tcMar>
-              <w:top w:w="20.0" w:type="dxa"/>
-              <w:left w:w="80.0" w:type="dxa"/>
-              <w:bottom w:w="20.0" w:type="dxa"/>
-              <w:right w:w="80.0" w:type="dxa"/>
-            </w:tcMar>
-            <w:vAlign w:val="top"/>
-          </w:tcPr>
-          <w:p>
-            <w:r>
-              <w:t>Locked</w:t>
-            </w:r>
-          </w:p>
-        </w:tc>
-      </w:tr>
-      <w:tr>
-        <w:trPr>
-          <w:cantSplit w:val="0"/>
-          <w:trHeight w:val="465" w:hRule="atLeast"/>
-          <w:tblHeader w:val="0"/>
-        </w:trPr>
-        <w:tc>
-          <w:tcPr>
-            <w:tcBorders>
-              <w:top w:color="000000" w:space="0" w:sz="0" w:val="nil"/>
-              <w:left w:color="bfbfbf" w:space="0" w:sz="8" w:val="single"/>
-              <w:bottom w:color="bfbfbf" w:space="0" w:sz="8" w:val="single"/>
-              <w:right w:color="bfbfbf" w:space="0" w:sz="8" w:val="single"/>
-            </w:tcBorders>
-            <w:tcMar>
-              <w:top w:w="20.0" w:type="dxa"/>
-              <w:left w:w="80.0" w:type="dxa"/>
-              <w:bottom w:w="20.0" w:type="dxa"/>
-              <w:right w:w="80.0" w:type="dxa"/>
-            </w:tcMar>
-            <w:vAlign w:val="top"/>
-          </w:tcPr>
-          <w:p>
-            <w:pPr>
-              <w:spacing w:after="0" w:line="276" w:lineRule="auto"/>
-              <w:rPr>
-                <w:sz w:val="17"/>
-                <w:szCs w:val="17"/>
-              </w:rPr>
-            </w:pPr>
-            <w:r>
-              <w:rPr>
-                <w:sz w:val="17"/>
-                <w:szCs w:val="17"/>
-                <w:rtl w:val="0"/>
-              </w:rPr>
-              <w:t xml:space="preserve">Domain and DNS</w:t>
-            </w:r>
-          </w:p>
-        </w:tc>
-        <w:tc>
-          <w:tcPr>
-            <w:tcBorders>
-              <w:top w:color="000000" w:space="0" w:sz="0" w:val="nil"/>
-              <w:left w:color="000000" w:space="0" w:sz="0" w:val="nil"/>
-              <w:bottom w:color="bfbfbf" w:space="0" w:sz="8" w:val="single"/>
-              <w:right w:color="bfbfbf" w:space="0" w:sz="8" w:val="single"/>
-            </w:tcBorders>
-            <w:tcMar>
-              <w:top w:w="20.0" w:type="dxa"/>
-              <w:left w:w="80.0" w:type="dxa"/>
-              <w:bottom w:w="20.0" w:type="dxa"/>
-              <w:right w:w="80.0" w:type="dxa"/>
-            </w:tcMar>
-            <w:vAlign w:val="top"/>
-          </w:tcPr>
-          <w:p>
-            <w:r>
-              <w:t>Subdomain only, such as app.placementhub.online, one DNS record</w:t>
-            </w:r>
-          </w:p>
-        </w:tc>
-        <w:tc>
-          <w:tcPr>
-            <w:tcBorders>
-              <w:top w:color="000000" w:space="0" w:sz="0" w:val="nil"/>
-              <w:left w:color="000000" w:space="0" w:sz="0" w:val="nil"/>
-              <w:bottom w:color="bfbfbf" w:space="0" w:sz="8" w:val="single"/>
-              <w:right w:color="bfbfbf" w:space="0" w:sz="8" w:val="single"/>
-            </w:tcBorders>
-            <w:tcMar>
-              <w:top w:w="20.0" w:type="dxa"/>
-              <w:left w:w="80.0" w:type="dxa"/>
-              <w:bottom w:w="20.0" w:type="dxa"/>
-              <w:right w:w="80.0" w:type="dxa"/>
-            </w:tcMar>
-            <w:vAlign w:val="top"/>
-          </w:tcPr>
-          <w:p>
-            <w:r>
-              <w:t>Do not change placementhub.online or www.placementhub.online</w:t>
-            </w:r>
-          </w:p>
-        </w:tc>
-        <w:tc>
-          <w:tcPr>
-            <w:tcBorders>
-              <w:top w:color="000000" w:space="0" w:sz="0" w:val="nil"/>
-              <w:left w:color="000000" w:space="0" w:sz="0" w:val="nil"/>
-              <w:bottom w:color="bfbfbf" w:space="0" w:sz="8" w:val="single"/>
-              <w:right w:color="bfbfbf" w:space="0" w:sz="8" w:val="single"/>
-            </w:tcBorders>
-            <w:tcMar>
-              <w:top w:w="20.0" w:type="dxa"/>
-              <w:left w:w="80.0" w:type="dxa"/>
-              <w:bottom w:w="20.0" w:type="dxa"/>
-              <w:right w:w="80.0" w:type="dxa"/>
-            </w:tcMar>
-            <w:vAlign w:val="top"/>
-          </w:tcPr>
-          <w:p>
-            <w:r>
-              <w:t>Locked</w:t>
-            </w:r>
-          </w:p>
-        </w:tc>
-      </w:tr>
-      <w:tr>
-        <w:trPr>
-          <w:cantSplit w:val="0"/>
-          <w:trHeight w:val="465" w:hRule="atLeast"/>
-          <w:tblHeader w:val="0"/>
-        </w:trPr>
-        <w:tc>
-          <w:tcPr>
-            <w:tcBorders>
-              <w:top w:color="000000" w:space="0" w:sz="0" w:val="nil"/>
-              <w:left w:color="bfbfbf" w:space="0" w:sz="8" w:val="single"/>
-              <w:bottom w:color="bfbfbf" w:space="0" w:sz="8" w:val="single"/>
-              <w:right w:color="bfbfbf" w:space="0" w:sz="8" w:val="single"/>
-            </w:tcBorders>
-            <w:tcMar>
-              <w:top w:w="20.0" w:type="dxa"/>
-              <w:left w:w="80.0" w:type="dxa"/>
-              <w:bottom w:w="20.0" w:type="dxa"/>
-              <w:right w:w="80.0" w:type="dxa"/>
-            </w:tcMar>
-            <w:vAlign w:val="top"/>
-          </w:tcPr>
-          <w:p>
-            <w:pPr>
-              <w:spacing w:after="0" w:line="276" w:lineRule="auto"/>
-              <w:rPr>
-                <w:sz w:val="17"/>
-                <w:szCs w:val="17"/>
-              </w:rPr>
-            </w:pPr>
-            <w:r>
-              <w:rPr>
-                <w:sz w:val="17"/>
-                <w:szCs w:val="17"/>
-                <w:rtl w:val="0"/>
-              </w:rPr>
-              <w:t xml:space="preserve">File storage</w:t>
-            </w:r>
-          </w:p>
-        </w:tc>
-        <w:tc>
-          <w:tcPr>
-            <w:tcBorders>
-              <w:top w:color="000000" w:space="0" w:sz="0" w:val="nil"/>
-              <w:left w:color="000000" w:space="0" w:sz="0" w:val="nil"/>
-              <w:bottom w:color="bfbfbf" w:space="0" w:sz="8" w:val="single"/>
-              <w:right w:color="bfbfbf" w:space="0" w:sz="8" w:val="single"/>
-            </w:tcBorders>
-            <w:tcMar>
-              <w:top w:w="20.0" w:type="dxa"/>
-              <w:left w:w="80.0" w:type="dxa"/>
-              <w:bottom w:w="20.0" w:type="dxa"/>
-              <w:right w:w="80.0" w:type="dxa"/>
-            </w:tcMar>
-            <w:vAlign w:val="top"/>
-          </w:tcPr>
-          <w:p>
-            <w:pPr>
-              <w:spacing w:after="0" w:line="276" w:lineRule="auto"/>
-              <w:rPr>
-                <w:sz w:val="17"/>
-                <w:szCs w:val="17"/>
-              </w:rPr>
-            </w:pPr>
-            <w:r>
-              <w:rPr>
-                <w:sz w:val="17"/>
-                <w:szCs w:val="17"/>
-                <w:rtl w:val="0"/>
-              </w:rPr>
-              <w:t xml:space="preserve">Reuse the S3 bucket the Vercel site uses</w:t>
-            </w:r>
-          </w:p>
-        </w:tc>
-        <w:tc>
-          <w:tcPr>
-            <w:tcBorders>
-              <w:top w:color="000000" w:space="0" w:sz="0" w:val="nil"/>
-              <w:left w:color="000000" w:space="0" w:sz="0" w:val="nil"/>
-              <w:bottom w:color="bfbfbf" w:space="0" w:sz="8" w:val="single"/>
-              <w:right w:color="bfbfbf" w:space="0" w:sz="8" w:val="single"/>
-            </w:tcBorders>
-            <w:tcMar>
-              <w:top w:w="20.0" w:type="dxa"/>
-              <w:left w:w="80.0" w:type="dxa"/>
-              <w:bottom w:w="20.0" w:type="dxa"/>
-              <w:right w:w="80.0" w:type="dxa"/>
-            </w:tcMar>
-            <w:vAlign w:val="top"/>
-          </w:tcPr>
-          <w:p>
-            <w:pPr>
-              <w:spacing w:after="0" w:line="276" w:lineRule="auto"/>
-              <w:rPr>
-                <w:sz w:val="17"/>
-                <w:szCs w:val="17"/>
-              </w:rPr>
-            </w:pPr>
-            <w:r>
-              <w:rPr>
-                <w:sz w:val="17"/>
-                <w:szCs w:val="17"/>
-                <w:rtl w:val="0"/>
-              </w:rPr>
-              <w:t xml:space="preserve">A new bucket</w:t>
-            </w:r>
-          </w:p>
-        </w:tc>
-        <w:tc>
-          <w:tcPr>
-            <w:tcBorders>
-              <w:top w:color="000000" w:space="0" w:sz="0" w:val="nil"/>
-              <w:left w:color="000000" w:space="0" w:sz="0" w:val="nil"/>
-              <w:bottom w:color="bfbfbf" w:space="0" w:sz="8" w:val="single"/>
-              <w:right w:color="bfbfbf" w:space="0" w:sz="8" w:val="single"/>
-            </w:tcBorders>
-            <w:tcMar>
-              <w:top w:w="20.0" w:type="dxa"/>
-              <w:left w:w="80.0" w:type="dxa"/>
-              <w:bottom w:w="20.0" w:type="dxa"/>
-              <w:right w:w="80.0" w:type="dxa"/>
-            </w:tcMar>
-            <w:vAlign w:val="top"/>
-          </w:tcPr>
-          <w:p>
-            <w:r>
-              <w:t>Still a choice</w:t>
+              <w:t>Existing user</w:t>
             </w:r>
           </w:p>
         </w:tc>
@@ -7583,268 +5001,6 @@
                 <w:szCs w:val="17"/>
                 <w:rtl w:val="0"/>
               </w:rPr>
-              <w:t xml:space="preserve">Email provider</w:t>
-            </w:r>
-          </w:p>
-        </w:tc>
-        <w:tc>
-          <w:tcPr>
-            <w:tcBorders>
-              <w:top w:color="000000" w:space="0" w:sz="0" w:val="nil"/>
-              <w:left w:color="000000" w:space="0" w:sz="0" w:val="nil"/>
-              <w:bottom w:color="bfbfbf" w:space="0" w:sz="8" w:val="single"/>
-              <w:right w:color="bfbfbf" w:space="0" w:sz="8" w:val="single"/>
-            </w:tcBorders>
-            <w:tcMar>
-              <w:top w:w="20.0" w:type="dxa"/>
-              <w:left w:w="80.0" w:type="dxa"/>
-              <w:bottom w:w="20.0" w:type="dxa"/>
-              <w:right w:w="80.0" w:type="dxa"/>
-            </w:tcMar>
-            <w:vAlign w:val="top"/>
-          </w:tcPr>
-          <w:p>
-            <w:pPr>
-              <w:spacing w:after="0" w:line="276" w:lineRule="auto"/>
-              <w:rPr>
-                <w:sz w:val="17"/>
-                <w:szCs w:val="17"/>
-              </w:rPr>
-            </w:pPr>
-            <w:r>
-              <w:rPr>
-                <w:sz w:val="17"/>
-                <w:szCs w:val="17"/>
-                <w:rtl w:val="0"/>
-              </w:rPr>
-              <w:t xml:space="preserve">ZeptoMail</w:t>
-            </w:r>
-          </w:p>
-        </w:tc>
-        <w:tc>
-          <w:tcPr>
-            <w:tcBorders>
-              <w:top w:color="000000" w:space="0" w:sz="0" w:val="nil"/>
-              <w:left w:color="000000" w:space="0" w:sz="0" w:val="nil"/>
-              <w:bottom w:color="bfbfbf" w:space="0" w:sz="8" w:val="single"/>
-              <w:right w:color="bfbfbf" w:space="0" w:sz="8" w:val="single"/>
-            </w:tcBorders>
-            <w:tcMar>
-              <w:top w:w="20.0" w:type="dxa"/>
-              <w:left w:w="80.0" w:type="dxa"/>
-              <w:bottom w:w="20.0" w:type="dxa"/>
-              <w:right w:w="80.0" w:type="dxa"/>
-            </w:tcMar>
-            <w:vAlign w:val="top"/>
-          </w:tcPr>
-          <w:p>
-            <w:pPr>
-              <w:spacing w:after="0" w:line="276" w:lineRule="auto"/>
-              <w:rPr>
-                <w:sz w:val="17"/>
-                <w:szCs w:val="17"/>
-              </w:rPr>
-            </w:pPr>
-            <w:r>
-              <w:rPr>
-                <w:sz w:val="17"/>
-                <w:szCs w:val="17"/>
-                <w:rtl w:val="0"/>
-              </w:rPr>
-              <w:t xml:space="preserve">SMTP</w:t>
-            </w:r>
-          </w:p>
-        </w:tc>
-        <w:tc>
-          <w:tcPr>
-            <w:tcBorders>
-              <w:top w:color="000000" w:space="0" w:sz="0" w:val="nil"/>
-              <w:left w:color="000000" w:space="0" w:sz="0" w:val="nil"/>
-              <w:bottom w:color="bfbfbf" w:space="0" w:sz="8" w:val="single"/>
-              <w:right w:color="bfbfbf" w:space="0" w:sz="8" w:val="single"/>
-            </w:tcBorders>
-            <w:tcMar>
-              <w:top w:w="20.0" w:type="dxa"/>
-              <w:left w:w="80.0" w:type="dxa"/>
-              <w:bottom w:w="20.0" w:type="dxa"/>
-              <w:right w:w="80.0" w:type="dxa"/>
-            </w:tcMar>
-            <w:vAlign w:val="top"/>
-          </w:tcPr>
-          <w:p>
-            <w:r>
-              <w:t>Still a choice</w:t>
-            </w:r>
-          </w:p>
-        </w:tc>
-      </w:tr>
-      <w:tr>
-        <w:trPr>
-          <w:cantSplit w:val="0"/>
-          <w:trHeight w:val="465" w:hRule="atLeast"/>
-          <w:tblHeader w:val="0"/>
-        </w:trPr>
-        <w:tc>
-          <w:tcPr>
-            <w:tcBorders>
-              <w:top w:color="000000" w:space="0" w:sz="0" w:val="nil"/>
-              <w:left w:color="bfbfbf" w:space="0" w:sz="8" w:val="single"/>
-              <w:bottom w:color="bfbfbf" w:space="0" w:sz="8" w:val="single"/>
-              <w:right w:color="bfbfbf" w:space="0" w:sz="8" w:val="single"/>
-            </w:tcBorders>
-            <w:tcMar>
-              <w:top w:w="20.0" w:type="dxa"/>
-              <w:left w:w="80.0" w:type="dxa"/>
-              <w:bottom w:w="20.0" w:type="dxa"/>
-              <w:right w:w="80.0" w:type="dxa"/>
-            </w:tcMar>
-            <w:vAlign w:val="top"/>
-          </w:tcPr>
-          <w:p>
-            <w:pPr>
-              <w:spacing w:after="0" w:line="276" w:lineRule="auto"/>
-              <w:rPr>
-                <w:sz w:val="17"/>
-                <w:szCs w:val="17"/>
-              </w:rPr>
-            </w:pPr>
-            <w:r>
-              <w:rPr>
-                <w:sz w:val="17"/>
-                <w:szCs w:val="17"/>
-                <w:rtl w:val="0"/>
-              </w:rPr>
-              <w:t xml:space="preserve">Database login</w:t>
-            </w:r>
-          </w:p>
-        </w:tc>
-        <w:tc>
-          <w:tcPr>
-            <w:tcBorders>
-              <w:top w:color="000000" w:space="0" w:sz="0" w:val="nil"/>
-              <w:left w:color="000000" w:space="0" w:sz="0" w:val="nil"/>
-              <w:bottom w:color="bfbfbf" w:space="0" w:sz="8" w:val="single"/>
-              <w:right w:color="bfbfbf" w:space="0" w:sz="8" w:val="single"/>
-            </w:tcBorders>
-            <w:tcMar>
-              <w:top w:w="20.0" w:type="dxa"/>
-              <w:left w:w="80.0" w:type="dxa"/>
-              <w:bottom w:w="20.0" w:type="dxa"/>
-              <w:right w:w="80.0" w:type="dxa"/>
-            </w:tcMar>
-            <w:vAlign w:val="top"/>
-          </w:tcPr>
-          <w:p>
-            <w:pPr>
-              <w:spacing w:after="0" w:line="276" w:lineRule="auto"/>
-              <w:rPr>
-                <w:sz w:val="17"/>
-                <w:szCs w:val="17"/>
-              </w:rPr>
-            </w:pPr>
-            <w:r>
-              <w:rPr>
-                <w:sz w:val="17"/>
-                <w:szCs w:val="17"/>
-                <w:rtl w:val="0"/>
-              </w:rPr>
-              <w:t xml:space="preserve">Existing RDS user</w:t>
-            </w:r>
-          </w:p>
-        </w:tc>
-        <w:tc>
-          <w:tcPr>
-            <w:tcBorders>
-              <w:top w:color="000000" w:space="0" w:sz="0" w:val="nil"/>
-              <w:left w:color="000000" w:space="0" w:sz="0" w:val="nil"/>
-              <w:bottom w:color="bfbfbf" w:space="0" w:sz="8" w:val="single"/>
-              <w:right w:color="bfbfbf" w:space="0" w:sz="8" w:val="single"/>
-            </w:tcBorders>
-            <w:tcMar>
-              <w:top w:w="20.0" w:type="dxa"/>
-              <w:left w:w="80.0" w:type="dxa"/>
-              <w:bottom w:w="20.0" w:type="dxa"/>
-              <w:right w:w="80.0" w:type="dxa"/>
-            </w:tcMar>
-            <w:vAlign w:val="top"/>
-          </w:tcPr>
-          <w:p>
-            <w:pPr>
-              <w:spacing w:after="0" w:line="276" w:lineRule="auto"/>
-              <w:rPr>
-                <w:sz w:val="17"/>
-                <w:szCs w:val="17"/>
-              </w:rPr>
-            </w:pPr>
-            <w:r>
-              <w:rPr>
-                <w:sz w:val="17"/>
-                <w:szCs w:val="17"/>
-                <w:rtl w:val="0"/>
-              </w:rPr>
-              <w:t xml:space="preserve">Separate PlacementHub-only login (not covered)</w:t>
-            </w:r>
-          </w:p>
-        </w:tc>
-        <w:tc>
-          <w:tcPr>
-            <w:tcBorders>
-              <w:top w:color="000000" w:space="0" w:sz="0" w:val="nil"/>
-              <w:left w:color="000000" w:space="0" w:sz="0" w:val="nil"/>
-              <w:bottom w:color="bfbfbf" w:space="0" w:sz="8" w:val="single"/>
-              <w:right w:color="bfbfbf" w:space="0" w:sz="8" w:val="single"/>
-            </w:tcBorders>
-            <w:tcMar>
-              <w:top w:w="20.0" w:type="dxa"/>
-              <w:left w:w="80.0" w:type="dxa"/>
-              <w:bottom w:w="20.0" w:type="dxa"/>
-              <w:right w:w="80.0" w:type="dxa"/>
-            </w:tcMar>
-            <w:vAlign w:val="top"/>
-          </w:tcPr>
-          <w:p>
-            <w:r>
-              <w:t>Existing user</w:t>
-            </w:r>
-          </w:p>
-        </w:tc>
-      </w:tr>
-      <w:tr>
-        <w:trPr>
-          <w:cantSplit w:val="0"/>
-          <w:trHeight w:val="270" w:hRule="atLeast"/>
-          <w:tblHeader w:val="0"/>
-        </w:trPr>
-        <w:tc>
-          <w:tcPr>
-            <w:tcBorders>
-              <w:top w:color="000000" w:space="0" w:sz="0" w:val="nil"/>
-              <w:left w:color="bfbfbf" w:space="0" w:sz="8" w:val="single"/>
-              <w:bottom w:color="bfbfbf" w:space="0" w:sz="8" w:val="single"/>
-              <w:right w:color="bfbfbf" w:space="0" w:sz="8" w:val="single"/>
-            </w:tcBorders>
-            <w:tcMar>
-              <w:top w:w="20.0" w:type="dxa"/>
-              <w:left w:w="80.0" w:type="dxa"/>
-              <w:bottom w:w="20.0" w:type="dxa"/>
-              <w:right w:w="80.0" w:type="dxa"/>
-            </w:tcMar>
-            <w:vAlign w:val="top"/>
-          </w:tcPr>
-          <w:p>
-            <w:pPr>
-              <w:spacing w:after="0" w:line="276" w:lineRule="auto"/>
-              <w:rPr>
-                <w:sz w:val="17"/>
-                <w:szCs w:val="17"/>
-              </w:rPr>
-            </w:pPr>
-            <w:r>
-              <w:rPr>
-                <w:sz w:val="17"/>
-                <w:szCs w:val="17"/>
-                <w:rtl w:val="0"/>
-              </w:rPr>
               <w:t xml:space="preserve">Vercel site after go-live</w:t>
             </w:r>
           </w:p>
@@ -7977,7 +5133,7 @@
           <w:szCs w:val="46"/>
           <w:rtl w:val="0"/>
         </w:rPr>
-        <w:t xml:space="preserve">7. Values to fill in</w:t>
+        <w:t>Values to fill in</w:t>
       </w:r>
     </w:p>
     <w:p>
@@ -10239,7 +7395,7 @@
           <w:szCs w:val="46"/>
           <w:rtl w:val="0"/>
         </w:rPr>
-        <w:t xml:space="preserve">Part A — Check the server</w:t>
+        <w:t>Check the server</w:t>
       </w:r>
     </w:p>
     <w:p>
@@ -10293,7 +7449,7 @@
           <w:szCs w:val="34"/>
           <w:rtl w:val="0"/>
         </w:rPr>
-        <w:t xml:space="preserve">Step A1 — Connect</w:t>
+        <w:t>Connect</w:t>
       </w:r>
     </w:p>
     <w:p>
@@ -10361,7 +7517,7 @@
           <w:szCs w:val="34"/>
           <w:rtl w:val="0"/>
         </w:rPr>
-        <w:t xml:space="preserve">Step A2 — Check that InternSafar is healthy before starting</w:t>
+        <w:t>Check that InternSafar is healthy before starting</w:t>
       </w:r>
     </w:p>
     <w:p>
@@ -10471,7 +7627,7 @@
           <w:szCs w:val="34"/>
           <w:rtl w:val="0"/>
         </w:rPr>
-        <w:t xml:space="preserve">Step A3 — Check tools already installed</w:t>
+        <w:t>Check tools already installed</w:t>
       </w:r>
     </w:p>
     <w:p>
@@ -10676,7 +7832,7 @@
           <w:szCs w:val="34"/>
           <w:rtl w:val="0"/>
         </w:rPr>
-        <w:t xml:space="preserve">Step A4 — Memory and disk</w:t>
+        <w:t>Memory and disk</w:t>
       </w:r>
     </w:p>
     <w:p>
@@ -11004,7 +8160,7 @@
           <w:szCs w:val="34"/>
           <w:rtl w:val="0"/>
         </w:rPr>
-        <w:t xml:space="preserve">Step A7 — Read the database InternSafar really uses (password hidden)</w:t>
+        <w:t>Read the database InternSafar really uses (password hidden)</w:t>
       </w:r>
     </w:p>
     <w:p>
@@ -11110,7 +8266,7 @@
           <w:szCs w:val="34"/>
           <w:rtl w:val="0"/>
         </w:rPr>
-        <w:t xml:space="preserve">Step A8 — Install the PostgreSQL 18 client (matches RDS 18.x)</w:t>
+        <w:t>Install the PostgreSQL 18 client (matches RDS 18.x)</w:t>
       </w:r>
     </w:p>
     <w:p>
@@ -11303,7 +8459,7 @@
           <w:szCs w:val="46"/>
           <w:rtl w:val="0"/>
         </w:rPr>
-        <w:t xml:space="preserve">Part B — Upload and install the PlacementHub code</w:t>
+        <w:t>Upload and install the PlacementHub code</w:t>
       </w:r>
     </w:p>
     <w:p>
@@ -11330,7 +8486,7 @@
           <w:szCs w:val="34"/>
           <w:rtl w:val="0"/>
         </w:rPr>
-        <w:t xml:space="preserve">Step B1 — Make the archive on Windows</w:t>
+        <w:t>Make the archive on Windows</w:t>
       </w:r>
     </w:p>
     <w:p>
@@ -11524,7 +8680,7 @@
           <w:szCs w:val="34"/>
           <w:rtl w:val="0"/>
         </w:rPr>
-        <w:t xml:space="preserve">Step B2 — Copy to the server</w:t>
+        <w:t>Copy to the server</w:t>
       </w:r>
     </w:p>
     <w:p>
@@ -11572,7 +8728,7 @@
           <w:szCs w:val="34"/>
           <w:rtl w:val="0"/>
         </w:rPr>
-        <w:t xml:space="preserve">Step B3 — Extract</w:t>
+        <w:t>Extract</w:t>
       </w:r>
     </w:p>
     <w:p>
@@ -11748,7 +8904,7 @@
           <w:szCs w:val="34"/>
           <w:rtl w:val="0"/>
         </w:rPr>
-        <w:t xml:space="preserve">Step B4 — Install dependencies</w:t>
+        <w:t>Install dependencies</w:t>
       </w:r>
     </w:p>
     <w:p>
@@ -11886,7 +9042,7 @@
           <w:szCs w:val="46"/>
           <w:rtl w:val="0"/>
         </w:rPr>
-        <w:t xml:space="preserve">Part C — Production .env and connection test</w:t>
+        <w:t>Production .env and connection test</w:t>
       </w:r>
     </w:p>
     <w:p>
@@ -11913,7 +9069,7 @@
           <w:szCs w:val="34"/>
           <w:rtl w:val="0"/>
         </w:rPr>
-        <w:t xml:space="preserve">Step C1 — Generate new secrets</w:t>
+        <w:t>Generate new secrets</w:t>
       </w:r>
     </w:p>
     <w:p>
@@ -11984,7 +9140,7 @@
           <w:szCs w:val="34"/>
           <w:rtl w:val="0"/>
         </w:rPr>
-        <w:t xml:space="preserve">Step C2 — Create the .env file</w:t>
+        <w:t>Create the .env file</w:t>
       </w:r>
     </w:p>
     <w:p>
@@ -12418,7 +9574,7 @@
           <w:szCs w:val="16"/>
           <w:rtl w:val="0"/>
         </w:rPr>
-        <w:t xml:space="preserve"># ---- Scheduled job (Part H) ----</w:t>
+        <w:t># ---- Scheduled job ----</w:t>
       </w:r>
     </w:p>
     <w:p>
@@ -13165,7 +10321,7 @@
           <w:szCs w:val="34"/>
           <w:rtl w:val="0"/>
         </w:rPr>
-        <w:t xml:space="preserve">Step C3 — Lock the file, check keys, confirm the database target</w:t>
+        <w:t>Lock the file, check keys, confirm the database target</w:t>
       </w:r>
     </w:p>
     <w:p>
@@ -13489,7 +10645,7 @@
           <w:szCs w:val="34"/>
           <w:rtl w:val="0"/>
         </w:rPr>
-        <w:t xml:space="preserve">Step C4 — Connection test (same SSL settings as the app)</w:t>
+        <w:t>Connection test (same SSL settings as the app)</w:t>
       </w:r>
     </w:p>
     <w:p>
@@ -13761,7 +10917,7 @@
           <w:szCs w:val="46"/>
           <w:rtl w:val="0"/>
         </w:rPr>
-        <w:t xml:space="preserve">Part D — Database (PlacementHub tables only)</w:t>
+        <w:t>Database (PlacementHub tables only)</w:t>
       </w:r>
     </w:p>
     <w:p>
@@ -13844,22 +11000,7 @@
         <w:rPr>
           <w:rtl w:val="0"/>
         </w:rPr>
-        <w:t xml:space="preserve">•  </w:t>
-      </w:r>
-      <w:r>
-        <w:rPr>
-          <w:rFonts w:ascii="Consolas" w:cs="Consolas" w:eastAsia="Consolas" w:hAnsi="Consolas"/>
-          <w:sz w:val="16"/>
-          <w:szCs w:val="16"/>
-          <w:rtl w:val="0"/>
-        </w:rPr>
-        <w:t xml:space="preserve">db/migrations</w:t>
-      </w:r>
-      <w:r>
-        <w:rPr>
-          <w:rtl w:val="0"/>
-        </w:rPr>
-        <w:t xml:space="preserve"> (002–116) mix schema with demo data, backfills and destructive clean-ups (Appendix B) — unsafe to replay.</w:t>
+        <w:t>•  db/migrations (002–116) mix schema with demo data, backfills and destructive clean-ups (the migration-file list) — unsafe to replay.</w:t>
       </w:r>
     </w:p>
     <w:p>
@@ -13912,7 +11053,7 @@
           <w:szCs w:val="34"/>
           <w:rtl w:val="0"/>
         </w:rPr>
-        <w:t xml:space="preserve">Step D1 — RDS snapshot before any change</w:t>
+        <w:t>RDS snapshot before any change</w:t>
       </w:r>
     </w:p>
     <w:p>
@@ -14011,7 +11152,7 @@
           <w:szCs w:val="34"/>
           <w:rtl w:val="0"/>
         </w:rPr>
-        <w:t xml:space="preserve">Step D2 — Confirm the PostgreSQL client</w:t>
+        <w:t>Confirm the PostgreSQL client</w:t>
       </w:r>
     </w:p>
     <w:p>
@@ -14073,7 +11214,7 @@
           <w:szCs w:val="34"/>
           <w:rtl w:val="0"/>
         </w:rPr>
-        <w:t xml:space="preserve">Step D3 — Record the InternSafar baseline</w:t>
+        <w:t>Record the InternSafar baseline</w:t>
       </w:r>
     </w:p>
     <w:p>
@@ -14196,7 +11337,7 @@
           <w:szCs w:val="34"/>
           <w:rtl w:val="0"/>
         </w:rPr>
-        <w:t xml:space="preserve">Step D4 — Table-name clash check</w:t>
+        <w:t>Table-name clash check</w:t>
       </w:r>
     </w:p>
     <w:p>
@@ -14935,7 +12076,7 @@
           <w:szCs w:val="34"/>
           <w:rtl w:val="0"/>
         </w:rPr>
-        <w:t xml:space="preserve">Step D5 — Schema dump from the current PlacementHub database</w:t>
+        <w:t>Schema dump from the current PlacementHub database</w:t>
       </w:r>
     </w:p>
     <w:p>
@@ -15329,7 +12470,7 @@
           <w:szCs w:val="34"/>
           <w:rtl w:val="0"/>
         </w:rPr>
-        <w:t xml:space="preserve">Step D6 — Inspect the dump</w:t>
+        <w:t>Inspect the dump</w:t>
       </w:r>
     </w:p>
     <w:p>
@@ -15756,7 +12897,7 @@
           <w:szCs w:val="34"/>
           <w:rtl w:val="0"/>
         </w:rPr>
-        <w:t xml:space="preserve">Step D7 — Replace the Supabase ID function with the built-in one</w:t>
+        <w:t>Replace the Supabase ID function with the built-in one</w:t>
       </w:r>
     </w:p>
     <w:p>
@@ -15911,7 +13052,7 @@
           <w:szCs w:val="34"/>
           <w:rtl w:val="0"/>
         </w:rPr>
-        <w:t xml:space="preserve">Step D8 — Create the trigger function the dump needs</w:t>
+        <w:t>Create the trigger function the dump needs</w:t>
       </w:r>
     </w:p>
     <w:p>
@@ -16310,7 +13451,7 @@
           <w:szCs w:val="34"/>
           <w:rtl w:val="0"/>
         </w:rPr>
-        <w:t xml:space="preserve">Step D9 — Restore the schema (all or nothing)</w:t>
+        <w:t>Restore the schema (all or nothing)</w:t>
       </w:r>
     </w:p>
     <w:p>
@@ -16420,7 +13561,7 @@
           <w:szCs w:val="34"/>
           <w:rtl w:val="0"/>
         </w:rPr>
-        <w:t xml:space="preserve">Step D9b — Create login_support_messages (never applied on the live database)</w:t>
+        <w:t>Create login_support_messages (never applied on the live database)</w:t>
       </w:r>
     </w:p>
     <w:p>
@@ -16545,7 +13686,7 @@
           <w:szCs w:val="34"/>
           <w:rtl w:val="0"/>
         </w:rPr>
-        <w:t xml:space="preserve">Step D10 — Verify</w:t>
+        <w:t>Verify</w:t>
       </w:r>
     </w:p>
     <w:p>
@@ -16851,7 +13992,7 @@
           <w:szCs w:val="34"/>
           <w:rtl w:val="0"/>
         </w:rPr>
-        <w:t xml:space="preserve">Step D11 — Create the first SuperAdmin</w:t>
+        <w:t>Create the first SuperAdmin</w:t>
       </w:r>
     </w:p>
     <w:p>
@@ -17342,7 +14483,7 @@
           <w:szCs w:val="34"/>
           <w:rtl w:val="0"/>
         </w:rPr>
-        <w:t xml:space="preserve">Step D12 — Load reference data</w:t>
+        <w:t>Load reference data</w:t>
       </w:r>
     </w:p>
     <w:p>
@@ -18214,7 +15355,7 @@
           <w:szCs w:val="34"/>
           <w:rtl w:val="0"/>
         </w:rPr>
-        <w:t xml:space="preserve">Step D13 — Reset platform settings to production values</w:t>
+        <w:t>Reset platform settings to production values</w:t>
       </w:r>
     </w:p>
     <w:p>
@@ -18771,7 +15912,7 @@
           <w:szCs w:val="34"/>
           <w:rtl w:val="0"/>
         </w:rPr>
-        <w:t xml:space="preserve">Step D14 — Optional: copy current data instead (owner decision)</w:t>
+        <w:t>Optional: copy current data instead (owner decision)</w:t>
       </w:r>
     </w:p>
     <w:p>
@@ -18888,7 +16029,7 @@
           <w:szCs w:val="46"/>
           <w:rtl w:val="0"/>
         </w:rPr>
-        <w:t xml:space="preserve">Part E — Build and start on port 3001</w:t>
+        <w:t>Build and start on port 3001</w:t>
       </w:r>
     </w:p>
     <w:p>
@@ -18915,7 +16056,7 @@
           <w:szCs w:val="34"/>
           <w:rtl w:val="0"/>
         </w:rPr>
-        <w:t xml:space="preserve">Step E1 — Build</w:t>
+        <w:t>Build</w:t>
       </w:r>
     </w:p>
     <w:p>
@@ -19010,7 +16151,7 @@
           <w:szCs w:val="34"/>
           <w:rtl w:val="0"/>
         </w:rPr>
-        <w:t xml:space="preserve">Step E2 — Start with PM2</w:t>
+        <w:t>Start with PM2</w:t>
       </w:r>
     </w:p>
     <w:p>
@@ -19273,7 +16414,7 @@
           <w:szCs w:val="46"/>
           <w:rtl w:val="0"/>
         </w:rPr>
-        <w:t xml:space="preserve">Part F — DNS, Nginx second site, HTTPS</w:t>
+        <w:t>DNS, Nginx second site, HTTPS</w:t>
       </w:r>
     </w:p>
     <w:p>
@@ -19300,7 +16441,7 @@
           <w:szCs w:val="34"/>
           <w:rtl w:val="0"/>
         </w:rPr>
-        <w:t xml:space="preserve">Step F1 — DNS</w:t>
+        <w:t>DNS</w:t>
       </w:r>
     </w:p>
     <w:p>
@@ -19402,7 +16543,7 @@
           <w:szCs w:val="34"/>
           <w:rtl w:val="0"/>
         </w:rPr>
-        <w:t xml:space="preserve">Step F2 — Nginx site for PlacementHub</w:t>
+        <w:t>Nginx site for PlacementHub</w:t>
       </w:r>
     </w:p>
     <w:p>
@@ -19969,7 +17110,7 @@
           <w:szCs w:val="34"/>
           <w:rtl w:val="0"/>
         </w:rPr>
-        <w:t xml:space="preserve">Step F3 — Test over HTTP</w:t>
+        <w:t>Test over HTTP</w:t>
       </w:r>
     </w:p>
     <w:p>
@@ -20017,7 +17158,7 @@
           <w:szCs w:val="34"/>
           <w:rtl w:val="0"/>
         </w:rPr>
-        <w:t xml:space="preserve">Step F4 — HTTPS certificate (PlacementHub names only)</w:t>
+        <w:t>HTTPS certificate (PlacementHub names only)</w:t>
       </w:r>
     </w:p>
     <w:p>
@@ -20180,7 +17321,7 @@
           <w:szCs w:val="46"/>
           <w:rtl w:val="0"/>
         </w:rPr>
-        <w:t xml:space="preserve">Part G — Restart after reboot</w:t>
+        <w:t>Restart after reboot</w:t>
       </w:r>
     </w:p>
     <w:p>
@@ -20333,7 +17474,7 @@
           <w:szCs w:val="46"/>
           <w:rtl w:val="0"/>
         </w:rPr>
-        <w:t xml:space="preserve">Part H — Scheduled semester rollover</w:t>
+        <w:t>Scheduled semester rollover</w:t>
       </w:r>
     </w:p>
     <w:p>
@@ -20402,7 +17543,7 @@
           <w:szCs w:val="34"/>
           <w:rtl w:val="0"/>
         </w:rPr>
-        <w:t xml:space="preserve">Step H1 — Script</w:t>
+        <w:t>Script</w:t>
       </w:r>
     </w:p>
     <w:p>
@@ -20638,7 +17779,7 @@
           <w:szCs w:val="34"/>
           <w:rtl w:val="0"/>
         </w:rPr>
-        <w:t xml:space="preserve">Step H2 — Schedule</w:t>
+        <w:t>Schedule</w:t>
       </w:r>
     </w:p>
     <w:p>
@@ -20740,7 +17881,7 @@
           <w:szCs w:val="46"/>
           <w:rtl w:val="0"/>
         </w:rPr>
-        <w:t xml:space="preserve">Part I — Conditional fixes</w:t>
+        <w:t>Conditional fixes</w:t>
       </w:r>
     </w:p>
     <w:tbl>
@@ -20877,20 +18018,8 @@
             <w:vAlign w:val="top"/>
           </w:tcPr>
           <w:p>
-            <w:pPr>
-              <w:spacing w:after="0" w:line="276" w:lineRule="auto"/>
-              <w:rPr>
-                <w:sz w:val="17"/>
-                <w:szCs w:val="17"/>
-              </w:rPr>
-            </w:pPr>
-            <w:r>
-              <w:rPr>
-                <w:sz w:val="17"/>
-                <w:szCs w:val="17"/>
-                <w:rtl w:val="0"/>
-              </w:rPr>
-              <w:t xml:space="preserve">I1 Sign-in fails / NO_SECRET / captcha error</w:t>
+            <w:r>
+              <w:t>Sign-in fails / NO_SECRET / captcha error</w:t>
             </w:r>
           </w:p>
         </w:tc>
@@ -20953,20 +18082,8 @@
             <w:vAlign w:val="top"/>
           </w:tcPr>
           <w:p>
-            <w:pPr>
-              <w:spacing w:after="0" w:line="276" w:lineRule="auto"/>
-              <w:rPr>
-                <w:sz w:val="17"/>
-                <w:szCs w:val="17"/>
-              </w:rPr>
-            </w:pPr>
-            <w:r>
-              <w:rPr>
-                <w:sz w:val="17"/>
-                <w:szCs w:val="17"/>
-                <w:rtl w:val="0"/>
-              </w:rPr>
-              <w:t xml:space="preserve">I2 SELF_SIGNED_CERT_IN_CHAIN</w:t>
+            <w:r>
+              <w:t>SELF_SIGNED_CERT_IN_CHAIN</w:t>
             </w:r>
           </w:p>
         </w:tc>
@@ -21029,20 +18146,8 @@
             <w:vAlign w:val="top"/>
           </w:tcPr>
           <w:p>
-            <w:pPr>
-              <w:spacing w:after="0" w:line="276" w:lineRule="auto"/>
-              <w:rPr>
-                <w:sz w:val="17"/>
-                <w:szCs w:val="17"/>
-              </w:rPr>
-            </w:pPr>
-            <w:r>
-              <w:rPr>
-                <w:sz w:val="17"/>
-                <w:szCs w:val="17"/>
-                <w:rtl w:val="0"/>
-              </w:rPr>
-              <w:t xml:space="preserve">I3 relation "x" does not exist</w:t>
+            <w:r>
+              <w:t>relation "x" does not exist</w:t>
             </w:r>
           </w:p>
         </w:tc>
@@ -21092,20 +18197,8 @@
             <w:vAlign w:val="top"/>
           </w:tcPr>
           <w:p>
-            <w:pPr>
-              <w:spacing w:after="0" w:line="276" w:lineRule="auto"/>
-              <w:rPr>
-                <w:sz w:val="17"/>
-                <w:szCs w:val="17"/>
-              </w:rPr>
-            </w:pPr>
-            <w:r>
-              <w:rPr>
-                <w:sz w:val="17"/>
-                <w:szCs w:val="17"/>
-                <w:rtl w:val="0"/>
-              </w:rPr>
-              <w:t xml:space="preserve">I4 502 Bad Gateway on &lt;PH_DOMAIN&gt;</w:t>
+            <w:r>
+              <w:t>502 Bad Gateway on &lt;PH_DOMAIN&gt;</w:t>
             </w:r>
           </w:p>
         </w:tc>
@@ -21167,20 +18260,8 @@
             <w:vAlign w:val="top"/>
           </w:tcPr>
           <w:p>
-            <w:pPr>
-              <w:spacing w:after="0" w:line="276" w:lineRule="auto"/>
-              <w:rPr>
-                <w:sz w:val="17"/>
-                <w:szCs w:val="17"/>
-              </w:rPr>
-            </w:pPr>
-            <w:r>
-              <w:rPr>
-                <w:sz w:val="17"/>
-                <w:szCs w:val="17"/>
-                <w:rtl w:val="0"/>
-              </w:rPr>
-              <w:t xml:space="preserve">I5 Build Killed / heap out of memory</w:t>
+            <w:r>
+              <w:t>Build Killed / heap out of memory</w:t>
             </w:r>
           </w:p>
         </w:tc>
@@ -21230,20 +18311,8 @@
             <w:vAlign w:val="top"/>
           </w:tcPr>
           <w:p>
-            <w:pPr>
-              <w:spacing w:after="0" w:line="276" w:lineRule="auto"/>
-              <w:rPr>
-                <w:sz w:val="17"/>
-                <w:szCs w:val="17"/>
-              </w:rPr>
-            </w:pPr>
-            <w:r>
-              <w:rPr>
-                <w:sz w:val="17"/>
-                <w:szCs w:val="17"/>
-                <w:rtl w:val="0"/>
-              </w:rPr>
-              <w:t xml:space="preserve">I6 413 Request Entity Too Large</w:t>
+            <w:r>
+              <w:t>413 Request Entity Too Large</w:t>
             </w:r>
           </w:p>
         </w:tc>
@@ -21306,20 +18375,8 @@
             <w:vAlign w:val="top"/>
           </w:tcPr>
           <w:p>
-            <w:pPr>
-              <w:spacing w:after="0" w:line="276" w:lineRule="auto"/>
-              <w:rPr>
-                <w:sz w:val="17"/>
-                <w:szCs w:val="17"/>
-              </w:rPr>
-            </w:pPr>
-            <w:r>
-              <w:rPr>
-                <w:sz w:val="17"/>
-                <w:szCs w:val="17"/>
-                <w:rtl w:val="0"/>
-              </w:rPr>
-              <w:t xml:space="preserve">I7 Sign-out or email links go to localhost / Vercel URL</w:t>
+            <w:r>
+              <w:t>Sign-out or email links go to localhost / Vercel URL</w:t>
             </w:r>
           </w:p>
         </w:tc>
@@ -21382,20 +18439,8 @@
             <w:vAlign w:val="top"/>
           </w:tcPr>
           <w:p>
-            <w:pPr>
-              <w:spacing w:after="0" w:line="276" w:lineRule="auto"/>
-              <w:rPr>
-                <w:sz w:val="17"/>
-                <w:szCs w:val="17"/>
-              </w:rPr>
-            </w:pPr>
-            <w:r>
-              <w:rPr>
-                <w:sz w:val="17"/>
-                <w:szCs w:val="17"/>
-                <w:rtl w:val="0"/>
-              </w:rPr>
-              <w:t xml:space="preserve">I8 Demo logins, sandbox banner or screen-ID tags visible</w:t>
+            <w:r>
+              <w:t>Demo logins, sandbox banner or screen-ID tags visible</w:t>
             </w:r>
           </w:p>
         </w:tc>
@@ -21458,20 +18503,8 @@
             <w:vAlign w:val="top"/>
           </w:tcPr>
           <w:p>
-            <w:pPr>
-              <w:spacing w:after="0" w:line="276" w:lineRule="auto"/>
-              <w:rPr>
-                <w:sz w:val="17"/>
-                <w:szCs w:val="17"/>
-              </w:rPr>
-            </w:pPr>
-            <w:r>
-              <w:rPr>
-                <w:sz w:val="17"/>
-                <w:szCs w:val="17"/>
-                <w:rtl w:val="0"/>
-              </w:rPr>
-              <w:t xml:space="preserve">I9 Emails not sent / go to a test inbox</w:t>
+            <w:r>
+              <w:t>Emails not sent / go to a test inbox</w:t>
             </w:r>
           </w:p>
         </w:tc>
@@ -21534,20 +18567,8 @@
             <w:vAlign w:val="top"/>
           </w:tcPr>
           <w:p>
-            <w:pPr>
-              <w:spacing w:after="0" w:line="276" w:lineRule="auto"/>
-              <w:rPr>
-                <w:sz w:val="17"/>
-                <w:szCs w:val="17"/>
-              </w:rPr>
-            </w:pPr>
-            <w:r>
-              <w:rPr>
-                <w:sz w:val="17"/>
-                <w:szCs w:val="17"/>
-                <w:rtl w:val="0"/>
-              </w:rPr>
-              <w:t xml:space="preserve">I10 File upload fails with a CORS error</w:t>
+            <w:r>
+              <w:t>File upload fails with a CORS error</w:t>
             </w:r>
           </w:p>
         </w:tc>
@@ -21597,20 +18618,8 @@
             <w:vAlign w:val="top"/>
           </w:tcPr>
           <w:p>
-            <w:pPr>
-              <w:spacing w:after="0" w:line="276" w:lineRule="auto"/>
-              <w:rPr>
-                <w:sz w:val="17"/>
-                <w:szCs w:val="17"/>
-              </w:rPr>
-            </w:pPr>
-            <w:r>
-              <w:rPr>
-                <w:sz w:val="17"/>
-                <w:szCs w:val="17"/>
-                <w:rtl w:val="0"/>
-              </w:rPr>
-              <w:t xml:space="preserve">I11 Cron returns 401</w:t>
+            <w:r>
+              <w:t>Cron returns 401</w:t>
             </w:r>
           </w:p>
         </w:tc>
@@ -21672,20 +18681,8 @@
             <w:vAlign w:val="top"/>
           </w:tcPr>
           <w:p>
-            <w:pPr>
-              <w:spacing w:after="0" w:line="276" w:lineRule="auto"/>
-              <w:rPr>
-                <w:sz w:val="17"/>
-                <w:szCs w:val="17"/>
-              </w:rPr>
-            </w:pPr>
-            <w:r>
-              <w:rPr>
-                <w:sz w:val="17"/>
-                <w:szCs w:val="17"/>
-                <w:rtl w:val="0"/>
-              </w:rPr>
-              <w:t xml:space="preserve">I12 InternSafar misbehaves</w:t>
+            <w:r>
+              <w:t>InternSafar misbehaves</w:t>
             </w:r>
           </w:p>
         </w:tc>
@@ -21735,20 +18732,8 @@
             <w:vAlign w:val="top"/>
           </w:tcPr>
           <w:p>
-            <w:pPr>
-              <w:spacing w:after="0" w:line="276" w:lineRule="auto"/>
-              <w:rPr>
-                <w:sz w:val="17"/>
-                <w:szCs w:val="17"/>
-              </w:rPr>
-            </w:pPr>
-            <w:r>
-              <w:rPr>
-                <w:sz w:val="17"/>
-                <w:szCs w:val="17"/>
-                <w:rtl w:val="0"/>
-              </w:rPr>
-              <w:t xml:space="preserve">I13 Build says "Couldn't find any pages or app directory" / Permission denied</w:t>
+            <w:r>
+              <w:t>Build says "Couldn't find any pages or app directory" / Permission denied</w:t>
             </w:r>
           </w:p>
         </w:tc>
@@ -21810,20 +18795,8 @@
             <w:vAlign w:val="top"/>
           </w:tcPr>
           <w:p>
-            <w:pPr>
-              <w:spacing w:after="0" w:line="276" w:lineRule="auto"/>
-              <w:rPr>
-                <w:sz w:val="17"/>
-                <w:szCs w:val="17"/>
-              </w:rPr>
-            </w:pPr>
-            <w:r>
-              <w:rPr>
-                <w:sz w:val="17"/>
-                <w:szCs w:val="17"/>
-                <w:rtl w:val="0"/>
-              </w:rPr>
-              <w:t xml:space="preserve">I14 "no pg_hba.conf entry … no encryption"</w:t>
+            <w:r>
+              <w:t>"no pg_hba.conf entry … no encryption"</w:t>
             </w:r>
           </w:p>
         </w:tc>
@@ -21873,20 +18846,8 @@
             <w:vAlign w:val="top"/>
           </w:tcPr>
           <w:p>
-            <w:pPr>
-              <w:spacing w:after="0" w:line="276" w:lineRule="auto"/>
-              <w:rPr>
-                <w:sz w:val="17"/>
-                <w:szCs w:val="17"/>
-              </w:rPr>
-            </w:pPr>
-            <w:r>
-              <w:rPr>
-                <w:sz w:val="17"/>
-                <w:szCs w:val="17"/>
-                <w:rtl w:val="0"/>
-              </w:rPr>
-              <w:t xml:space="preserve">I15 "Cannot find module 'pg'" / 'bcryptjs'</w:t>
+            <w:r>
+              <w:t>"Cannot find module 'pg'" / 'bcryptjs'</w:t>
             </w:r>
           </w:p>
         </w:tc>
@@ -21936,20 +18897,8 @@
             <w:vAlign w:val="top"/>
           </w:tcPr>
           <w:p>
-            <w:pPr>
-              <w:spacing w:after="0" w:line="276" w:lineRule="auto"/>
-              <w:rPr>
-                <w:sz w:val="17"/>
-                <w:szCs w:val="17"/>
-              </w:rPr>
-            </w:pPr>
-            <w:r>
-              <w:rPr>
-                <w:sz w:val="17"/>
-                <w:szCs w:val="17"/>
-                <w:rtl w:val="0"/>
-              </w:rPr>
-              <w:t xml:space="preserve">I16 "Server Reference ID did not match" in PM2 logs</w:t>
+            <w:r>
+              <w:t>"Server Reference ID did not match" in PM2 logs</w:t>
             </w:r>
           </w:p>
         </w:tc>
@@ -22011,20 +18960,8 @@
             <w:vAlign w:val="top"/>
           </w:tcPr>
           <w:p>
-            <w:pPr>
-              <w:spacing w:after="0" w:line="276" w:lineRule="auto"/>
-              <w:rPr>
-                <w:sz w:val="17"/>
-                <w:szCs w:val="17"/>
-              </w:rPr>
-            </w:pPr>
-            <w:r>
-              <w:rPr>
-                <w:sz w:val="17"/>
-                <w:szCs w:val="17"/>
-                <w:rtl w:val="0"/>
-              </w:rPr>
-              <w:t xml:space="preserve">I17 Forgot-password says migrations not applied</w:t>
+            <w:r>
+              <w:t>Forgot-password says migrations not applied</w:t>
             </w:r>
           </w:p>
         </w:tc>
@@ -22088,7 +19025,7 @@
           <w:szCs w:val="46"/>
           <w:rtl w:val="0"/>
         </w:rPr>
-        <w:t xml:space="preserve">Part J — Backups and recovery</w:t>
+        <w:t>Backups and recovery</w:t>
       </w:r>
     </w:p>
     <w:p>
@@ -22251,7 +19188,7 @@
           <w:szCs w:val="46"/>
           <w:rtl w:val="0"/>
         </w:rPr>
-        <w:t xml:space="preserve">Part K — Final verification</w:t>
+        <w:t>Final verification</w:t>
       </w:r>
     </w:p>
     <w:p>
@@ -22678,7 +19615,7 @@
           <w:szCs w:val="46"/>
           <w:rtl w:val="0"/>
         </w:rPr>
-        <w:t xml:space="preserve">Appendix A — PlacementHub table notes (86 tables)</w:t>
+        <w:t>PlacementHub table notes (86 tables)</w:t>
       </w:r>
     </w:p>
     <w:p>
@@ -22729,7 +19666,7 @@
           <w:szCs w:val="46"/>
           <w:rtl w:val="0"/>
         </w:rPr>
-        <w:t xml:space="preserve">Appendix B — Migration files (reference only — do not run on RDS)</w:t>
+        <w:t>Migration files (reference only — do not run on RDS)</w:t>
       </w:r>
     </w:p>
     <w:p>
@@ -23466,7 +20403,7 @@
           <w:szCs w:val="46"/>
           <w:rtl w:val="0"/>
         </w:rPr>
-        <w:t xml:space="preserve">Appendix C — Findings from the source check</w:t>
+        <w:t>Findings from the source check</w:t>
       </w:r>
     </w:p>
     <w:p>
@@ -24487,7 +21424,7 @@
           <w:szCs w:val="46"/>
           <w:rtl w:val="0"/>
         </w:rPr>
-        <w:t xml:space="preserve">Appendix D — Lessons from the earlier InternSafar deployment</w:t>
+        <w:t>Lessons from the earlier InternSafar deployment</w:t>
       </w:r>
     </w:p>
     <w:p>
@@ -25431,7 +22368,7 @@
           <w:szCs w:val="46"/>
           <w:rtl w:val="0"/>
         </w:rPr>
-        <w:t xml:space="preserve">Appendix E — Documents this guide is based on</w:t>
+        <w:t>Documents this guide is based on</w:t>
       </w:r>
     </w:p>
     <w:p>
@@ -25457,7 +22394,7 @@
         <w:rPr>
           <w:rtl w:val="0"/>
         </w:rPr>
-        <w:t xml:space="preserve">•  InternSafar AWS problems log (September 2026) — for the lessons in Appendix D.</w:t>
+        <w:t>•  InternSafar AWS problems log (September 2026) — for the lessons in the InternSafar lessons section.</w:t>
       </w:r>
     </w:p>
     <w:p>

</xml_diff>

<commit_message>
Add Namecheap DNS and a Supabase scan before the data migration.
Co-authored-by: Cursor <cursoragent@cursor.com>
</commit_message>
<xml_diff>
--- a/PlacementHub_AWS_First_Time_Setup_Guide.docx
+++ b/PlacementHub_AWS_First_Time_Setup_Guide.docx
@@ -110,32 +110,37 @@
     </w:p>
     <w:p>
       <w:r>
-        <w:t>5. Add only PlacementHub’s tables to the existing database, and start with a clean production setup unless you later decide to copy today’s data.</w:t>
-      </w:r>
-    </w:p>
-    <w:p>
-      <w:r>
-        <w:t>6. Build it using extra temporary memory on the current server. Do not resize the server, because a resize would take the machine offline.</w:t>
-      </w:r>
-    </w:p>
-    <w:p>
-      <w:r>
-        <w:t>7. Start PlacementHub on its own port, beside InternSafar.</w:t>
-      </w:r>
-    </w:p>
-    <w:p>
-      <w:r>
-        <w:t>8. Add a DNS record for the subdomain only, using one method. Do not change the DNS for placementhub.online or www.</w:t>
-      </w:r>
-    </w:p>
-    <w:p>
-      <w:r>
-        <w:t>9. Serve that subdomain over HTTPS.</w:t>
-      </w:r>
-    </w:p>
-    <w:p>
-      <w:r>
-        <w:t>10. Check three things: the subdomain opens the app, https://placementhub.online/ is still the same homepage, and InternSafar is still up.</w:t>
+        <w:t>5. Create PlacementHub’s tables on the existing database. Do not copy any Supabase rows yet.</w:t>
+      </w:r>
+    </w:p>
+    <w:p>
+      <w:r>
+        <w:t>6. Scan the Supabase data before anything is copied. Migrate the entire Supabase data only when that scan shows the core accounts and no other accounts, and those core accounts have no transactions. The scan and the migration are written later in this guide. If the scan does not pass, stop.</w:t>
+      </w:r>
+    </w:p>
+    <w:p>
+      <w:r>
+        <w:t>7. Build it using extra temporary memory on the current server. Do not resize the server, because a resize would take the machine offline.</w:t>
+      </w:r>
+    </w:p>
+    <w:p>
+      <w:r>
+        <w:t>8. Start PlacementHub on its own port, beside InternSafar.</w:t>
+      </w:r>
+    </w:p>
+    <w:p>
+      <w:r>
+        <w:t>9. In Namecheap, add one DNS record for the subdomain only. Do not change the DNS for placementhub.online or www. The Namecheap section has the exact clicks.</w:t>
+      </w:r>
+    </w:p>
+    <w:p>
+      <w:r>
+        <w:t>10. Serve that subdomain over HTTPS.</w:t>
+      </w:r>
+    </w:p>
+    <w:p>
+      <w:r>
+        <w:t>11. Check three things: the subdomain opens the app, https://placementhub.online/ is still the same homepage, and InternSafar is still up.</w:t>
       </w:r>
     </w:p>
     <w:p>
@@ -4498,20 +4503,8 @@
             <w:vAlign w:val="top"/>
           </w:tcPr>
           <w:p>
-            <w:pPr>
-              <w:spacing w:after="0" w:line="276" w:lineRule="auto"/>
-              <w:rPr>
-                <w:sz w:val="17"/>
-                <w:szCs w:val="17"/>
-              </w:rPr>
-            </w:pPr>
-            <w:r>
-              <w:rPr>
-                <w:sz w:val="17"/>
-                <w:szCs w:val="17"/>
-                <w:rtl w:val="0"/>
-              </w:rPr>
-              <w:t xml:space="preserve">Clean start: one SuperAdmin + reference data</w:t>
+            <w:r>
+              <w:t>Scan Supabase first. Migrate all of it only when only the core accounts remain and they have no transactions.</w:t>
             </w:r>
           </w:p>
         </w:tc>
@@ -4532,20 +4525,8 @@
             <w:vAlign w:val="top"/>
           </w:tcPr>
           <w:p>
-            <w:pPr>
-              <w:spacing w:after="0" w:line="276" w:lineRule="auto"/>
-              <w:rPr>
-                <w:sz w:val="17"/>
-                <w:szCs w:val="17"/>
-              </w:rPr>
-            </w:pPr>
-            <w:r>
-              <w:rPr>
-                <w:sz w:val="17"/>
-                <w:szCs w:val="17"/>
-                <w:rtl w:val="0"/>
-              </w:rPr>
-              <w:t xml:space="preserve">Copy today's Vercel/Supabase data (not tested)</w:t>
+            <w:r>
+              <w:t>If the scan fails, stop. Do not migrate.</w:t>
             </w:r>
           </w:p>
         </w:tc>
@@ -4567,7 +4548,7 @@
           </w:tcPr>
           <w:p>
             <w:r>
-              <w:t>Still a choice</w:t>
+              <w:t>Required</w:t>
             </w:r>
           </w:p>
         </w:tc>
@@ -13970,6 +13951,39 @@
     </w:p>
     <w:p>
       <w:pPr>
+        <w:pStyle w:val="Heading1"/>
+      </w:pPr>
+      <w:r>
+        <w:t>Scan Supabase before any data is copied</w:t>
+      </w:r>
+    </w:p>
+    <w:p>
+      <w:r>
+        <w:t>Do this on the Supabase database, before any of its rows are copied. Use the same Supabase URL already typed for the schema dump ($SRC_URL). If this is a new SSH session and $SRC_URL is empty, type that URL again the same hidden way, then run the scan. The scan only reads. It does not delete or update anything.</w:t>
+      </w:r>
+    </w:p>
+    <w:p>
+      <w:r>
+        <w:t>The owner writes down the core account emails before the scan. The scan passes only when both of these are true: every user printed is one of those core accounts, and every count below is 0. Any other account, or any count above 0, means stop. Do not migrate.</w:t>
+      </w:r>
+    </w:p>
+    <w:p>
+      <w:r>
+        <w:t>psql "$SRC_URL" -v ON_ERROR_STOP=1 -c "select email, role from public.users order by 1"</w:t>
+      </w:r>
+    </w:p>
+    <w:p>
+      <w:r>
+        <w:t>psql "$SRC_URL" -v ON_ERROR_STOP=1 -c "select 'applications' as t, count(*) from public.applications union all select 'offers', count(*) from public.offers union all select 'shortlists', count(*) from public.shortlists union all select 'placement_drives', count(*) from public.placement_drives union all select 'program_applications', count(*) from public.program_applications union all select 'marketplace_orders', count(*) from public.marketplace_orders union all select 'sponsorship_payments', count(*) from public.sponsorship_payments union all select 'startup_funding_payments', count(*) from public.startup_funding_payments union all select 'notifications', count(*) from public.notifications union all select 'mail_delivery_logs', count(*) from public.mail_delivery_logs union all select 'audit_logs', count(*) from public.audit_logs union all select 'student_documents', count(*) from public.student_documents order by 1"</w:t>
+      </w:r>
+    </w:p>
+    <w:p>
+      <w:r>
+        <w:t>Expected: the user list matches the core accounts and nothing else, and every count is 0. Keep the output. The migration step will not run without it.</w:t>
+      </w:r>
+    </w:p>
+    <w:p>
+      <w:pPr>
         <w:pStyle w:val="Heading2"/>
         <w:keepNext w:val="0"/>
         <w:keepLines w:val="0"/>
@@ -14015,7 +14029,7 @@
           <w:color w:val="5C3D00"/>
           <w:rtl w:val="0"/>
         </w:rPr>
-        <w:t>⚠️ Starting data: the default is a clean start. The next three steps create one SuperAdmin and load reference data only. Copying today’s Vercel/Supabase data (demo colleges, students, shared demo passwords) needs an owner decision. Read the optional copy step before you choose that.</w:t>
+        <w:t>⚠️ Do not run the next three steps if the Supabase scan passed. Those accounts, reference rows, and settings come across with the full migration. Run the next three steps only if the scan stopped the migration and the owner then chooses a clean start instead. A passed scan means migrate the entire Supabase data, then still reset platform settings afterwards because the copied settings row is QA data.</w:t>
       </w:r>
     </w:p>
     <w:p>
@@ -15912,7 +15926,7 @@
           <w:szCs w:val="34"/>
           <w:rtl w:val="0"/>
         </w:rPr>
-        <w:t>Optional: copy current data instead (owner decision)</w:t>
+        <w:t>Migrate the entire Supabase data</w:t>
       </w:r>
     </w:p>
     <w:p>
@@ -15935,7 +15949,7 @@
           <w:color w:val="5c3d00"/>
           <w:rtl w:val="0"/>
         </w:rPr>
-        <w:t xml:space="preserve">⚠️ Not the default and not dry-run tested. Only if the owner wants today's Vercel/Supabase data live.</w:t>
+        <w:t>⚠️ Run this only after the Supabase scan has passed. If the scan did not pass, stop. This load has not been dry-run tested. On any error the load rolls back and nothing from it is kept.</w:t>
       </w:r>
     </w:p>
     <w:p>
@@ -15948,22 +15962,7 @@
         <w:rPr>
           <w:rtl w:val="0"/>
         </w:rPr>
-        <w:t xml:space="preserve">•  Would replace D11–D13 with a data-only dump of the 85 source tables (same </w:t>
-      </w:r>
-      <w:r>
-        <w:rPr>
-          <w:rFonts w:ascii="Consolas" w:cs="Consolas" w:eastAsia="Consolas" w:hAnsi="Consolas"/>
-          <w:sz w:val="16"/>
-          <w:szCs w:val="16"/>
-          <w:rtl w:val="0"/>
-        </w:rPr>
-        <w:t xml:space="preserve">$TABLE_ARGS</w:t>
-      </w:r>
-      <w:r>
-        <w:rPr>
-          <w:rtl w:val="0"/>
-        </w:rPr>
-        <w:t xml:space="preserve">) loaded with ON_ERROR_STOP in one transaction.</w:t>
+        <w:t>•  This copies every PlacementHub table that exists on Supabase (the 85-table dump list). It does not copy InternSafar tables. It does not include login_support_messages, which is not on Supabase and was created empty on the server.</w:t>
       </w:r>
     </w:p>
     <w:p>
@@ -15976,7 +15975,7 @@
         <w:rPr>
           <w:rtl w:val="0"/>
         </w:rPr>
-        <w:t xml:space="preserve">•  Demo accounts share known demo passwords — they must be disabled or reset before go-live.</w:t>
+        <w:t>•  The scan is what proves only the core accounts are left and that they have no transactions. Do not migrate while any other account is still listed.</w:t>
       </w:r>
     </w:p>
     <w:p>
@@ -16002,7 +16001,32 @@
         <w:rPr>
           <w:rtl w:val="0"/>
         </w:rPr>
-        <w:t xml:space="preserve">•  Stop writes on the Vercel site during the copy, or new data created there is lost.</w:t>
+        <w:t>•  Stop writes on the Vercel site during the copy, or new data created there is left behind.</w:t>
+      </w:r>
+    </w:p>
+    <w:p>
+      <w:r>
+        <w:t>cd ~/ph-db</w:t>
+      </w:r>
+    </w:p>
+    <w:p>
+      <w:r>
+        <w:t>TABLE_ARGS=$(sed 's/^/-t public./' ph-dump-tables.txt | tr '\n' ' ')</w:t>
+      </w:r>
+    </w:p>
+    <w:p>
+      <w:r>
+        <w:t>pg_dump "$SRC_URL" --data-only --no-owner --no-privileges --strict-names $TABLE_ARGS -f ph_all_data.sql</w:t>
+      </w:r>
+    </w:p>
+    <w:p>
+      <w:r>
+        <w:t>psql "$RDS_PSQL" -v ON_ERROR_STOP=1 --single-transaction -f ph_all_data.sql</w:t>
+      </w:r>
+    </w:p>
+    <w:p>
+      <w:r>
+        <w:t>Expected: the load ends with no error. Then run the platform-settings reset. Do not also create a new SuperAdmin or load the reference-only file.</w:t>
       </w:r>
     </w:p>
     <w:p>
@@ -16393,6 +16417,34 @@
     <w:p>
       <w:pPr>
         <w:pStyle w:val="Heading1"/>
+      </w:pPr>
+      <w:r>
+        <w:t>Namecheap</w:t>
+      </w:r>
+    </w:p>
+    <w:p>
+      <w:r>
+        <w:t>Namecheap is where the subdomain record is added. This is the only DNS change. Do not change nameservers. Do not add this name in Route 53 as well. Do not edit or delete any existing record for @ or for www. Those keep https://placementhub.online/ and https://www.placementhub.online/ on the current homepage.</w:t>
+      </w:r>
+    </w:p>
+    <w:p>
+      <w:r>
+        <w:t>Where: Namecheap → Domain List → Manage next to placementhub.online → Advanced DNS.</w:t>
+      </w:r>
+    </w:p>
+    <w:p>
+      <w:r>
+        <w:t>Add a record. Type: A Record. Host: the subdomain label only, such as app. Do not type the full name app.placementhub.online in Host. Value: &lt;ELASTIC_IP&gt;. TTL: Automatic.</w:t>
+      </w:r>
+    </w:p>
+    <w:p>
+      <w:r>
+        <w:t>Save. Then run the nslookup checks in the DNS section. If placementhub.online or www.placementhub.online answers with &lt;ELASTIC_IP&gt;, stop and put the Namecheap records back before continuing.</w:t>
+      </w:r>
+    </w:p>
+    <w:p>
+      <w:pPr>
+        <w:pStyle w:val="Heading1"/>
         <w:keepNext w:val="0"/>
         <w:keepLines w:val="0"/>
         <w:spacing w:after="120" w:lineRule="auto"/>
@@ -16464,7 +16516,7 @@
           <w:color w:val="5C3D00"/>
           <w:rtl w:val="0"/>
         </w:rPr>
-        <w:t>⚠️ &lt;PH_DOMAIN&gt; is the subdomain only, such as app.placementhub.online. Add one DNS record, at the DNS host that already serves placementhub.online. Use one method. Do not switch the domain to a different DNS service. Do not change any record for placementhub.online or www.placementhub.online.</w:t>
+        <w:t>⚠️ &lt;PH_DOMAIN&gt; is the subdomain only, such as app.placementhub.online. The record is created in Namecheap, in the Namecheap section above. Do not switch the domain to another DNS service. Do not change any record for placementhub.online or www.placementhub.online.</w:t>
       </w:r>
     </w:p>
     <w:p>
@@ -16478,7 +16530,7 @@
           <w:bCs w:val="1"/>
           <w:rtl w:val="0"/>
         </w:rPr>
-        <w:t>Where: the DNS host that already serves placementhub.online</w:t>
+        <w:t>Where: Namecheap → Domain List → Manage next to placementhub.online → Advanced DNS. The clicks are in the Namecheap section.</w:t>
       </w:r>
     </w:p>
     <w:p>
@@ -19406,7 +19458,7 @@
           <w:rFonts w:ascii="Arial Unicode MS" w:cs="Arial Unicode MS" w:eastAsia="Arial Unicode MS" w:hAnsi="Arial Unicode MS"/>
           <w:rtl w:val="0"/>
         </w:rPr>
-        <w:t>•  ☐ Locked choices checked: same EC2, same database, subdomain only, swap rather than a resize, and https://placementhub.online/ left untouched. Remaining choices confirmed: clean start or copy, S3, email.</w:t>
+        <w:t>•  ☐ Locked choices checked: same EC2, same database, subdomain only, Namecheap record only, swap rather than a resize, and https://placementhub.online/ left untouched. Supabase scan passed (core accounts only, no transactions) before the data migration. Remaining choices confirmed: S3 and email.</w:t>
       </w:r>
     </w:p>
     <w:p>
@@ -19560,7 +19612,7 @@
           <w:rFonts w:ascii="Arial Unicode MS" w:cs="Arial Unicode MS" w:eastAsia="Arial Unicode MS" w:hAnsi="Arial Unicode MS"/>
           <w:rtl w:val="0"/>
         </w:rPr>
-        <w:t>•  ☐ Subdomain DNS, Nginx site, and certificate are in place. The subdomain answers. https://placementhub.online/ is still the same homepage. InternSafar is still up.</w:t>
+        <w:t>•  ☐ Namecheap has one new record, for the subdomain only. Nginx and the certificate are in place. The subdomain answers. https://placementhub.online/ is still the same homepage. InternSafar is still up.</w:t>
       </w:r>
     </w:p>
     <w:p>

</xml_diff>

<commit_message>
State in the opening that both sites share one public IP.
Co-authored-by: Cursor <cursoragent@cursor.com>
</commit_message>
<xml_diff>
--- a/PlacementHub_AWS_First_Time_Setup_Guide.docx
+++ b/PlacementHub_AWS_First_Time_Setup_Guide.docx
@@ -67,6 +67,31 @@
     </w:p>
     <w:p>
       <w:r>
+        <w:t>A second public IP is not required. internsafar.com and the PlacementHub subdomain both use the existing EC2 public IP (&lt;ELASTIC_IP&gt;).</w:t>
+      </w:r>
+    </w:p>
+    <w:p>
+      <w:r>
+        <w:t>internsafar.com uses that public IP. Nginx sends it to InternSafar on port 3000.</w:t>
+      </w:r>
+    </w:p>
+    <w:p>
+      <w:r>
+        <w:t>The subdomain, such as app.placementhub.online, uses that same public IP. Nginx sends it to PlacementHub on port 3001.</w:t>
+      </w:r>
+    </w:p>
+    <w:p>
+      <w:r>
+        <w:t>Nginx chooses the app from the name in the request. One public IP is enough for both names.</w:t>
+      </w:r>
+    </w:p>
+    <w:p>
+      <w:r>
+        <w:t>Only one new DNS record is added: an A record for that subdomain, pointing at the same IP. The DNS records for placementhub.online and www.placementhub.online stay unchanged, so the current homepage stays where it is.</w:t>
+      </w:r>
+    </w:p>
+    <w:p>
+      <w:r>
         <w:t>https://placementhub.online/ and https://www.placementhub.online/ stay exactly as they are. They keep showing “PlacementHub — Beyond Placements. Building Industry-Ready Talent.” PlacementHub is an early-stage campus placement platform operated by PlacementHub Solutions, Pune. Built for students, colleges, and employers.</w:t>
       </w:r>
     </w:p>
@@ -100,7 +125,7 @@
     </w:p>
     <w:p>
       <w:r>
-        <w:t>3. Use the server and database that already run InternSafar. Do not create a new server. Do not restart or edit InternSafar.</w:t>
+        <w:t>3. Use the server and database that already run InternSafar. Do not create a new server or a second public IP. Do not restart or edit InternSafar. internsafar.com stays on port 3000. PlacementHub will use port 3001. Nginx on the same public IP sends each name to its own port.</w:t>
       </w:r>
     </w:p>
     <w:p>
@@ -125,12 +150,12 @@
     </w:p>
     <w:p>
       <w:r>
-        <w:t>8. Start PlacementHub on its own port, beside InternSafar.</w:t>
-      </w:r>
-    </w:p>
-    <w:p>
-      <w:r>
-        <w:t>9. In Namecheap, add one DNS record for the subdomain only. Do not change the DNS for placementhub.online or www. The Namecheap section has the exact clicks.</w:t>
+        <w:t>8. Start PlacementHub on port 3001, beside InternSafar on port 3000.</w:t>
+      </w:r>
+    </w:p>
+    <w:p>
+      <w:r>
+        <w:t>9. In Namecheap, add one A record for the subdomain only, pointing at the existing public IP (&lt;ELASTIC_IP&gt;). Do not change the DNS for placementhub.online or www. The Namecheap section has the exact clicks.</w:t>
       </w:r>
     </w:p>
     <w:p>

</xml_diff>

<commit_message>
Add a PlacementHub-only rollback that leaves the homepage and InternSafar up.
Co-authored-by: Cursor <cursoragent@cursor.com>
</commit_message>
<xml_diff>
--- a/PlacementHub_AWS_First_Time_Setup_Guide.docx
+++ b/PlacementHub_AWS_First_Time_Setup_Guide.docx
@@ -170,7 +170,7 @@
     </w:p>
     <w:p>
       <w:r>
-        <w:t>The rest of this document is those steps with the commands. Follow them from top to bottom. There is no second path.</w:t>
+        <w:t>The rest of this document is those steps with the commands. Follow them from top to bottom. There is no second path. If the setup has to be undone, use the Rollback section. It removes only PlacementHub. It does not take down https://placementhub.online/, and it does not restore the whole database.</w:t>
       </w:r>
     </w:p>
     <w:p>
@@ -500,7 +500,7 @@
           </w:tcPr>
           <w:p>
             <w:r>
-              <w:t>Backups and recovery</w:t>
+              <w:t>Backups and rollback</w:t>
             </w:r>
           </w:p>
         </w:tc>
@@ -10369,7 +10369,7 @@
           <w:szCs w:val="16"/>
           <w:rtl w:val="0"/>
         </w:rPr>
-        <w:t xml:space="preserve">grep -E '^(DATABASE_URL|DATABASE_SSL_CA|NEXTAUTH_URL|NEXT_PUBLIC_APP_URL|NEXTAUTH_SECRET|CRON_SECRET)=' ~/placementhub/.env | sed 's/=.*/=&lt;set&gt;/'</w:t>
+        <w:t>grep -E '^(ip_|ism_)' ph-tables.txt &amp;&amp; echo 'STOP: InternSafar name in the list. Do not continue.'</w:t>
       </w:r>
     </w:p>
     <w:p>
@@ -19238,7 +19238,226 @@
         <w:rPr>
           <w:rtl w:val="0"/>
         </w:rPr>
-        <w:t xml:space="preserve">•  Undoing the first-time database step (removing PlacementHub tables) is owner-approved only, never touches ip_/ism_ tables, and is not scripted here.</w:t>
+        <w:t>•  Undoing PlacementHub is the Rollback section below. Do not restore the RDS snapshot to undo PlacementHub. That snapshot includes InternSafar, so restoring it rolls InternSafar back too. That remains a last resort, with the owner’s approval only.</w:t>
+      </w:r>
+    </w:p>
+    <w:p>
+      <w:pPr>
+        <w:pStyle w:val="Heading1"/>
+      </w:pPr>
+      <w:r>
+        <w:t>Rollback</w:t>
+      </w:r>
+    </w:p>
+    <w:p>
+      <w:r>
+        <w:t>Use this only to take PlacementHub off the server. InternSafar stays running. https://placementhub.online/ and https://www.placementhub.online/ stay as they are. Do not reboot the server. Do not run pm2 stop all, pm2 delete all, or pm2 kill. Do not edit the internsafar.com Nginx file. Do not change the Namecheap records for @ or www.</w:t>
+      </w:r>
+    </w:p>
+    <w:p>
+      <w:pPr>
+        <w:pStyle w:val="Heading2"/>
+      </w:pPr>
+      <w:r>
+        <w:t>1. Remove only the subdomain DNS record</w:t>
+      </w:r>
+    </w:p>
+    <w:p>
+      <w:r>
+        <w:t>In Namecheap → Domain List → Manage next to placementhub.online → Advanced DNS, delete the A record whose Host is the subdomain label only, such as app. Do not delete or edit @ or www.</w:t>
+      </w:r>
+    </w:p>
+    <w:p>
+      <w:r>
+        <w:t>From the laptop: nslookup &lt;PH_DOMAIN&gt; must no longer return &lt;ELASTIC_IP&gt;. nslookup placementhub.online and nslookup www.placementhub.online must still not return &lt;ELASTIC_IP&gt;. If either homepage name returns &lt;ELASTIC_IP&gt;, put that record back before doing anything else.</w:t>
+      </w:r>
+    </w:p>
+    <w:p>
+      <w:pPr>
+        <w:pStyle w:val="Heading2"/>
+      </w:pPr>
+      <w:r>
+        <w:t>2. Remove only the PlacementHub Nginx site</w:t>
+      </w:r>
+    </w:p>
+    <w:p>
+      <w:r>
+        <w:t>sudo rm /etc/nginx/sites-enabled/&lt;PH_DOMAIN&gt;</w:t>
+      </w:r>
+    </w:p>
+    <w:p>
+      <w:r>
+        <w:t>sudo nginx -t</w:t>
+      </w:r>
+    </w:p>
+    <w:p>
+      <w:r>
+        <w:t>sudo systemctl reload nginx</w:t>
+      </w:r>
+    </w:p>
+    <w:p>
+      <w:r>
+        <w:t>sudo rm /etc/nginx/sites-available/&lt;PH_DOMAIN&gt;</w:t>
+      </w:r>
+    </w:p>
+    <w:p>
+      <w:r>
+        <w:t>Reload, do not restart. If nginx -t fails, stop and put the site file back. Do not continue.</w:t>
+      </w:r>
+    </w:p>
+    <w:p>
+      <w:r>
+        <w:t>sudo certbot delete --cert-name &lt;PH_DOMAIN&gt;</w:t>
+      </w:r>
+    </w:p>
+    <w:p>
+      <w:r>
+        <w:t>Run that only when the name it offers to delete is the subdomain and not internsafar.com. If the name is anything else, stop.</w:t>
+      </w:r>
+    </w:p>
+    <w:p>
+      <w:pPr>
+        <w:pStyle w:val="Heading2"/>
+      </w:pPr>
+      <w:r>
+        <w:t>3. Stop only the PlacementHub process</w:t>
+      </w:r>
+    </w:p>
+    <w:p>
+      <w:r>
+        <w:t>pm2 stop placementhub</w:t>
+      </w:r>
+    </w:p>
+    <w:p>
+      <w:r>
+        <w:t>pm2 delete placementhub</w:t>
+      </w:r>
+    </w:p>
+    <w:p>
+      <w:r>
+        <w:t>pm2 save</w:t>
+      </w:r>
+    </w:p>
+    <w:p>
+      <w:r>
+        <w:t>pm2 status</w:t>
+      </w:r>
+    </w:p>
+    <w:p>
+      <w:r>
+        <w:t>Expected: internsafar online. placementhub is gone.</w:t>
+      </w:r>
+    </w:p>
+    <w:p>
+      <w:pPr>
+        <w:pStyle w:val="Heading2"/>
+      </w:pPr>
+      <w:r>
+        <w:t>4. Remove only the PlacementHub schedule</w:t>
+      </w:r>
+    </w:p>
+    <w:p>
+      <w:r>
+        <w:t>crontab -e</w:t>
+      </w:r>
+    </w:p>
+    <w:p>
+      <w:r>
+        <w:t>Delete the single line that contains placementhub-cron.sh. Leave every other line.</w:t>
+      </w:r>
+    </w:p>
+    <w:p>
+      <w:pPr>
+        <w:pStyle w:val="Heading2"/>
+      </w:pPr>
+      <w:r>
+        <w:t>5. Keep the code folder until the owner says otherwise</w:t>
+      </w:r>
+    </w:p>
+    <w:p>
+      <w:r>
+        <w:t>mv ~/placementhub ~/placementhub-off-$(date +%Y%m%d-%H%M)</w:t>
+      </w:r>
+    </w:p>
+    <w:p>
+      <w:r>
+        <w:t>This renames the folder. It does not delete the settings file. Do not rm -rf it in this step.</w:t>
+      </w:r>
+    </w:p>
+    <w:p>
+      <w:pPr>
+        <w:pStyle w:val="Heading2"/>
+      </w:pPr>
+      <w:r>
+        <w:t>6. Database: PlacementHub tables only, and only with approval</w:t>
+      </w:r>
+    </w:p>
+    <w:p>
+      <w:r>
+        <w:t>Do not restore the RDS snapshot. To remove PlacementHub tables, the owner must approve it first. The drop list is built only from ph-tables.txt. If any name starts with ip_ or ism_, stop.</w:t>
+      </w:r>
+    </w:p>
+    <w:p>
+      <w:r>
+        <w:t>cd ~/ph-db</w:t>
+      </w:r>
+    </w:p>
+    <w:p>
+      <w:r>
+        <w:t>grep -E '^(ip_|ism_)' ph-tables.txt &amp;&amp; echo 'STOP: InternSafar name in the list. Do not continue.'</w:t>
+      </w:r>
+    </w:p>
+    <w:p>
+      <w:r>
+        <w:t>awk '{printf "DROP TABLE IF EXISTS public.%s CASCADE;\n", $1}' ph-tables.txt &gt; drop_ph_tables.sql</w:t>
+      </w:r>
+    </w:p>
+    <w:p>
+      <w:r>
+        <w:t>wc -l drop_ph_tables.sql ph-tables.txt</w:t>
+      </w:r>
+    </w:p>
+    <w:p>
+      <w:r>
+        <w:t>Read drop_ph_tables.sql before running it. The line counts must match, and every line must be a PlacementHub table. Then:</w:t>
+      </w:r>
+    </w:p>
+    <w:p>
+      <w:r>
+        <w:t>psql "$RDS_PSQL" -v ON_ERROR_STOP=1 --single-transaction -f drop_ph_tables.sql</w:t>
+      </w:r>
+    </w:p>
+    <w:p>
+      <w:r>
+        <w:t>After it commits, the InternSafar table list and ip_users count must still match the baseline taken before PlacementHub was added. If they do not, stop and tell the owner. Do not try to repair InternSafar from this guide.</w:t>
+      </w:r>
+    </w:p>
+    <w:p>
+      <w:pPr>
+        <w:pStyle w:val="Heading2"/>
+      </w:pPr>
+      <w:r>
+        <w:t>7. Confirm the rollback</w:t>
+      </w:r>
+    </w:p>
+    <w:p>
+      <w:r>
+        <w:t>curl -sI https://internsafar.com | head -1</w:t>
+      </w:r>
+    </w:p>
+    <w:p>
+      <w:r>
+        <w:t>curl -sI https://placementhub.online/ | head -1</w:t>
+      </w:r>
+    </w:p>
+    <w:p>
+      <w:r>
+        <w:t>pm2 status</w:t>
+      </w:r>
+    </w:p>
+    <w:p>
+      <w:r>
+        <w:t>Expected: InternSafar still answers. https://placementhub.online/ still shows the same homepage. The subdomain no longer points at &lt;ELASTIC_IP&gt;. pm2 shows internsafar only.</w:t>
       </w:r>
     </w:p>
     <w:p>

</xml_diff>

<commit_message>
Record the shared-server AWS plan and replace the console snapshot with a server backup.
The guide now packs the current main commit, drops the Placement Hub function on rollback, and keeps filled-in values out of the notes.

Co-authored-by: Cursor <cursoragent@cursor.com>
</commit_message>
<xml_diff>
--- a/PlacementHub_AWS_First_Time_Setup_Guide.docx
+++ b/PlacementHub_AWS_First_Time_Setup_Guide.docx
@@ -182,7 +182,7 @@
         <w:rPr>
           <w:rtl w:val="0"/>
         </w:rPr>
-        <w:t xml:space="preserve">PlacementHub source: GitHub sandeepjain2000/campus-placement-multiuser, commit dd6e3a5.</w:t>
+        <w:t>PlacementHub source: GitHub sandeepjain2000/campus-placement-multiuser, branch main. Pack the commit that git log -1 prints on that branch. Do not pack dd6e3a5. That commit is older than the UI updates already on main.</w:t>
       </w:r>
     </w:p>
     <w:p>
@@ -204,7 +204,7 @@
           <w:bCs w:val="1"/>
           <w:rtl w:val="0"/>
         </w:rPr>
-        <w:t>Ctrl+H (Find and Replace) before starting, in your own copy: &lt;ELASTIC_IP&gt;, &lt;PATH_TO_PEM&gt;, &lt;PH_DOMAIN&gt;, &lt;RDS_ID&gt;, &lt;RDS_ENDPOINT&gt;, &lt;RDS_USER&gt;, &lt;RDS_DB_NAME&gt;, &lt;AWS_REGION&gt;, &lt;S3_BUCKET_NAME&gt;, &lt;FROM_EMAIL&gt;, &lt;SUPERADMIN_EMAIL&gt;, &lt;SUPPORT_EMAIL&gt;, &lt;SUPPORT_PHONE&gt;, &lt;PH_VERSION&gt;. Secrets — &lt;RDS_PASSWORD&gt; (URL-encoded), &lt;AWS_ACCESS_KEY_ID&gt;, &lt;AWS_SECRET_ACCESS_KEY&gt;, &lt;ZEPTOMAIL_API_KEY&gt; (or the &lt;SMTP_*&gt; values), &lt;NEW_DEVELOPER_NOTES_PASSWORD&gt; — type straight into the server settings file, or Ctrl+H them only in a private copy. Do not replace &lt;NEXTAUTH_SECRET&gt; / &lt;CRON_SECRET&gt; (you generate those on the server) or &lt;set&gt; (command output). The Supabase URL and SuperAdmin password are typed hidden when asked. &lt;PH_DOMAIN&gt; is the subdomain only, such as app.placementhub.online. &lt;RDS_DB_NAME&gt; is the database name read from InternSafar’s settings (on the live server: postgres). After that, every command is copy-paste as written.</w:t>
+        <w:t>Ctrl+H (Find and Replace) before starting, in your own copy: &lt;ELASTIC_IP&gt;, &lt;PATH_TO_PEM&gt;, &lt;PH_DOMAIN&gt;, &lt;RDS_ID&gt;, &lt;RDS_ENDPOINT&gt;, &lt;RDS_USER&gt;, &lt;RDS_DB_NAME&gt;, &lt;AWS_REGION&gt;, &lt;S3_BUCKET_NAME&gt;, &lt;FROM_EMAIL&gt;, &lt;SUPERADMIN_EMAIL&gt;, &lt;SUPPORT_EMAIL&gt;, &lt;SUPPORT_PHONE&gt;, &lt;PH_VERSION&gt;. Secrets — &lt;RDS_PASSWORD&gt; (URL-encoded), &lt;AWS_ACCESS_KEY_ID&gt;, &lt;AWS_SECRET_ACCESS_KEY&gt;, &lt;ZEPTOMAIL_API_KEY&gt; (or the &lt;SMTP_*&gt; values), &lt;NEW_DEVELOPER_NOTES_PASSWORD&gt; — type straight into the server settings file, or Ctrl+H them only in a private copy. Do not replace &lt;NEXTAUTH_SECRET&gt; / &lt;CRON_SECRET&gt; (you generate those on the server) or &lt;set&gt; (command output). The Supabase URL and SuperAdmin password are typed hidden when asked. &lt;PH_DOMAIN&gt; is app.placementhub.online. The public URL is https://app.placementhub.online/. Do not use placementhub.online or www. &lt;RDS_DB_NAME&gt; is the database name read from InternSafar’s settings (on the live server: postgres). After that, every command is copy-paste as written.</w:t>
       </w:r>
     </w:p>
     <w:p>
@@ -8588,37 +8588,33 @@
         <w:rPr>
           <w:rtl w:val="0"/>
         </w:rPr>
-        <w:t xml:space="preserve">•  </w:t>
-      </w:r>
-      <w:r>
-        <w:rPr>
-          <w:rFonts w:ascii="Consolas" w:cs="Consolas" w:eastAsia="Consolas" w:hAnsi="Consolas"/>
-          <w:sz w:val="16"/>
-          <w:szCs w:val="16"/>
-          <w:rtl w:val="0"/>
-        </w:rPr>
-        <w:t xml:space="preserve">git archive</w:t>
-      </w:r>
-      <w:r>
-        <w:rPr>
-          <w:rtl w:val="0"/>
-        </w:rPr>
-        <w:t xml:space="preserve"> packs the last commit only — confirm </w:t>
-      </w:r>
-      <w:r>
-        <w:rPr>
-          <w:rFonts w:ascii="Consolas" w:cs="Consolas" w:eastAsia="Consolas" w:hAnsi="Consolas"/>
-          <w:sz w:val="16"/>
-          <w:szCs w:val="16"/>
-          <w:rtl w:val="0"/>
-        </w:rPr>
-        <w:t xml:space="preserve">git log -1</w:t>
-      </w:r>
-      <w:r>
-        <w:rPr>
-          <w:rtl w:val="0"/>
-        </w:rPr>
-        <w:t xml:space="preserve"> shows the commit to deploy.</w:t>
+        <w:t>git archive packs the last commit only. Run git log -1 first and pack that commit. Record that hash in the handover notes. dd6e3a5 is not the deploy commit.</w:t>
+      </w:r>
+      <w:r>
+        <w:rPr>
+          <w:rFonts w:ascii="Consolas" w:cs="Consolas" w:eastAsia="Consolas" w:hAnsi="Consolas"/>
+          <w:sz w:val="16"/>
+          <w:szCs w:val="16"/>
+          <w:rtl w:val="0"/>
+        </w:rPr>
+      </w:r>
+      <w:r>
+        <w:rPr>
+          <w:rtl w:val="0"/>
+        </w:rPr>
+      </w:r>
+      <w:r>
+        <w:rPr>
+          <w:rFonts w:ascii="Consolas" w:cs="Consolas" w:eastAsia="Consolas" w:hAnsi="Consolas"/>
+          <w:sz w:val="16"/>
+          <w:szCs w:val="16"/>
+          <w:rtl w:val="0"/>
+        </w:rPr>
+      </w:r>
+      <w:r>
+        <w:rPr>
+          <w:rtl w:val="0"/>
+        </w:rPr>
       </w:r>
     </w:p>
     <w:p>
@@ -9169,7 +9165,7 @@
           <w:color w:val="5C3D00"/>
           <w:rtl w:val="0"/>
         </w:rPr>
-        <w:t>⚠️ Confirm before filling in. DATABASE_URL uses the existing RDS user and ends in /&lt;RDS_DB_NAME&gt;, the database InternSafar already uses. Do not create a database named placementhub. S3: the bucket the Vercel site uses today, or a new bucket. Its CORS must allow https://&lt;PH_DOMAIN&gt; only — the subdomain, not https://placementhub.online. Email: one provider, ZeptoMail or SMTP, not both; verify the sender with the provider.</w:t>
+        <w:t>Confirm before filling in. DATABASE_URL uses the existing RDS user and ends in /&lt;RDS_DB_NAME&gt;, the database InternSafar already uses. Do not create a database named placementhub. S3: use the bucket the current site already uses. Do not create a new bucket. Checked from the server on 2026-10-21: the live bucket has no bucket policy, so s3-student-read.json is not applied, and public access is blocked. It also has no CORS configuration. When CORS is added, add https://app.placementhub.online. Do not remove an origin that is already there, and do not use https://placementhub.online. Email: use the provider already configured for the current site, or SMTP, not both; verify the sender with the provider.</w:t>
       </w:r>
     </w:p>
     <w:p>
@@ -10369,7 +10365,7 @@
           <w:szCs w:val="16"/>
           <w:rtl w:val="0"/>
         </w:rPr>
-        <w:t>grep -E '^(ip_|ism_)' ph-tables.txt &amp;&amp; echo 'STOP: InternSafar name in the list. Do not continue.'</w:t>
+        <w:t>grep -E '^(DATABASE_URL|DATABASE_SSL_CA|NEXTAUTH_URL|NEXT_PUBLIC_APP_URL|NEXTAUTH_SECRET|CRON_SECRET)=' ~/placementhub/.env | sed 's/=.*/=&lt;set&gt;/'</w:t>
       </w:r>
     </w:p>
     <w:p>
@@ -10678,27 +10674,6 @@
     <w:p>
       <w:pPr>
         <w:shd w:fill="f1f3f5" w:val="clear"/>
-        <w:spacing w:after="0" w:before="80" w:line="276" w:lineRule="auto"/>
-        <w:ind w:left="220" w:firstLine="0"/>
-        <w:rPr>
-          <w:rFonts w:ascii="Consolas" w:cs="Consolas" w:eastAsia="Consolas" w:hAnsi="Consolas"/>
-          <w:sz w:val="16"/>
-          <w:szCs w:val="16"/>
-        </w:rPr>
-      </w:pPr>
-      <w:r>
-        <w:rPr>
-          <w:rFonts w:ascii="Consolas" w:cs="Consolas" w:eastAsia="Consolas" w:hAnsi="Consolas"/>
-          <w:sz w:val="16"/>
-          <w:szCs w:val="16"/>
-          <w:rtl w:val="0"/>
-        </w:rPr>
-        <w:t xml:space="preserve">cd ~/placementhub</w:t>
-      </w:r>
-    </w:p>
-    <w:p>
-      <w:pPr>
-        <w:shd w:fill="f1f3f5" w:val="clear"/>
         <w:spacing w:line="276" w:lineRule="auto"/>
         <w:ind w:left="220" w:firstLine="0"/>
         <w:rPr>
@@ -11059,7 +11034,7 @@
           <w:szCs w:val="34"/>
           <w:rtl w:val="0"/>
         </w:rPr>
-        <w:t>RDS snapshot before any change</w:t>
+        <w:t>Server backup before any Placement Hub change</w:t>
       </w:r>
     </w:p>
     <w:p>
@@ -11073,14 +11048,13 @@
           <w:bCs w:val="1"/>
           <w:rtl w:val="0"/>
         </w:rPr>
-        <w:t xml:space="preserve">Where: </w:t>
+        <w:t>mkdir -p ~/db-backups &amp;&amp; chmod 700 ~/db-backups</w:t>
       </w:r>
       <w:r>
         <w:rPr>
           <w:rFonts w:ascii="Arial Unicode MS" w:cs="Arial Unicode MS" w:eastAsia="Arial Unicode MS" w:hAnsi="Arial Unicode MS"/>
           <w:rtl w:val="0"/>
         </w:rPr>
-        <w:t xml:space="preserve">AWS Console → RDS → Databases → &lt;RDS_ID&gt; → Actions → Take snapshot</w:t>
       </w:r>
     </w:p>
     <w:p>
@@ -11093,22 +11067,20 @@
         <w:rPr>
           <w:rtl w:val="0"/>
         </w:rPr>
-        <w:t xml:space="preserve">•  Name: </w:t>
-      </w:r>
-      <w:r>
-        <w:rPr>
-          <w:rFonts w:ascii="Consolas" w:cs="Consolas" w:eastAsia="Consolas" w:hAnsi="Consolas"/>
-          <w:sz w:val="16"/>
-          <w:szCs w:val="16"/>
-          <w:rtl w:val="0"/>
-        </w:rPr>
-        <w:t xml:space="preserve">before-placementhub-&lt;PH_VERSION&gt;</w:t>
-      </w:r>
-      <w:r>
-        <w:rPr>
-          <w:rtl w:val="0"/>
-        </w:rPr>
-        <w:t xml:space="preserve">. Wait until Status = Available.</w:t>
+        <w:t>pg_dump "$RDS_PSQL" -Fc --no-owner --no-privileges -f ~/db-backups/before-placementhub-$(date +%Y%m%d-%H%M).dump</w:t>
+      </w:r>
+      <w:r>
+        <w:rPr>
+          <w:rFonts w:ascii="Consolas" w:cs="Consolas" w:eastAsia="Consolas" w:hAnsi="Consolas"/>
+          <w:sz w:val="16"/>
+          <w:szCs w:val="16"/>
+          <w:rtl w:val="0"/>
+        </w:rPr>
+      </w:r>
+      <w:r>
+        <w:rPr>
+          <w:rtl w:val="0"/>
+        </w:rPr>
       </w:r>
     </w:p>
     <w:p>
@@ -11131,7 +11103,7 @@
           <w:color w:val="5C3D00"/>
           <w:rtl w:val="0"/>
         </w:rPr>
-        <w:t>⚠️ The snapshot covers the whole RDS instance, including InternSafar’s data. Restoring it rolls InternSafar back too. That is a last resort, with the owner’s approval only.</w:t>
+        <w:t>This dump is the baseline of the database as it is now, including InternSafar. Do not take an RDS console snapshot for this setup. Do not restore this dump, or any RDS snapshot, to undo Placement Hub. Restoring either one rolls InternSafar back too.</w:t>
       </w:r>
     </w:p>
     <w:p>
@@ -16541,7 +16513,7 @@
           <w:color w:val="5C3D00"/>
           <w:rtl w:val="0"/>
         </w:rPr>
-        <w:t>⚠️ &lt;PH_DOMAIN&gt; is the subdomain only, such as app.placementhub.online. The record is created in Namecheap, in the Namecheap section above. Do not switch the domain to another DNS service. Do not change any record for placementhub.online or www.placementhub.online.</w:t>
+        <w:t>⚠️ &lt;PH_DOMAIN&gt; is app.placementhub.online. The public URL is https://app.placementhub.online/. Do not use placementhub.online or www. The record is created in Namecheap, in the Namecheap section above. Do not switch the domain to another DNS service. Do not change any record for placementhub.online or www.placementhub.online.</w:t>
       </w:r>
     </w:p>
     <w:p>
@@ -19115,7 +19087,7 @@
         <w:rPr>
           <w:rtl w:val="0"/>
         </w:rPr>
-        <w:t xml:space="preserve">•  RDS automated backups and snapshots cover both apps together. Restoring one rolls back InternSafar too — last resort, owner approval only.</w:t>
+        <w:t>RDS automated backups still exist and cover both apps together. Do not restore one to undo Placement Hub. The backup for this setup is the server dump taken before any Placement Hub change.</w:t>
       </w:r>
     </w:p>
     <w:p>
@@ -19128,7 +19100,7 @@
         <w:rPr>
           <w:rtl w:val="0"/>
         </w:rPr>
-        <w:t xml:space="preserve">•  PlacementHub-only backup (take one before any database change):</w:t>
+        <w:t>PlacementHub-only backup. Take this only after the Placement Hub tables exist, and before loading Supabase data or changing those tables later. Do not run it before the schema step. There is nothing to dump yet.</w:t>
       </w:r>
     </w:p>
     <w:p>
@@ -19238,7 +19210,7 @@
         <w:rPr>
           <w:rtl w:val="0"/>
         </w:rPr>
-        <w:t>•  Undoing PlacementHub is the Rollback section below. Do not restore the RDS snapshot to undo PlacementHub. That snapshot includes InternSafar, so restoring it rolls InternSafar back too. That remains a last resort, with the owner’s approval only.</w:t>
+        <w:t>Undoing PlacementHub is the Rollback section below. Do not restore the server backup or an RDS snapshot to undo Placement Hub. Either restore rolls InternSafar back too. That remains a last resort, with the owner’s approval only.</w:t>
       </w:r>
     </w:p>
     <w:p>
@@ -19367,6 +19339,16 @@
       </w:r>
     </w:p>
     <w:p>
+      <w:r>
+        <w:t>crontab -l | grep placementhub-cron.sh || echo 'PlacementHub schedule is gone'</w:t>
+      </w:r>
+    </w:p>
+    <w:p>
+      <w:r>
+        <w:t>Expected: PlacementHub schedule is gone.</w:t>
+      </w:r>
+    </w:p>
+    <w:p>
       <w:pPr>
         <w:pStyle w:val="Heading2"/>
       </w:pPr>
@@ -19381,7 +19363,7 @@
     </w:p>
     <w:p>
       <w:r>
-        <w:t>This renames the folder. It does not delete the settings file. Do not rm -rf it in this step.</w:t>
+        <w:t>This renames the folder. It does not delete the settings file. Restrict it with chmod 700 ~/placementhub-off-* so only this server user can read it. Do not delete it in this step. Whether to remove it later is a separate decision, after the rollback checks have passed.</w:t>
       </w:r>
     </w:p>
     <w:p>
@@ -19394,7 +19376,7 @@
     </w:p>
     <w:p>
       <w:r>
-        <w:t>Do not restore the RDS snapshot. To remove PlacementHub tables, the owner must approve it first. The drop list is built only from ph-tables.txt. If any name starts with ip_ or ism_, stop.</w:t>
+        <w:t>Do not restore the server backup or an RDS snapshot. The owner must approve any table removal. Do not use DROP TABLE ... CASCADE. CASCADE can remove a constraint or other object that belongs to InternSafar even when the table name itself is not an InternSafar name. First inspect the live dependencies. Stop if any dependency is outside the PlacementHub table list. Then drop only those PlacementHub tables, without CASCADE. Then drop the Placement Hub function sync_job_posting_is_visible if nothing else still uses it.</w:t>
       </w:r>
     </w:p>
     <w:p>
@@ -19409,27 +19391,247 @@
     </w:p>
     <w:p>
       <w:r>
-        <w:t>awk '{printf "DROP TABLE IF EXISTS public.%s CASCADE;\n", $1}' ph-tables.txt &gt; drop_ph_tables.sql</w:t>
-      </w:r>
-    </w:p>
-    <w:p>
-      <w:r>
-        <w:t>wc -l drop_ph_tables.sql ph-tables.txt</w:t>
-      </w:r>
-    </w:p>
-    <w:p>
-      <w:r>
-        <w:t>Read drop_ph_tables.sql before running it. The line counts must match, and every line must be a PlacementHub table. Then:</w:t>
-      </w:r>
-    </w:p>
-    <w:p>
-      <w:r>
-        <w:t>psql "$RDS_PSQL" -v ON_ERROR_STOP=1 --single-transaction -f drop_ph_tables.sql</w:t>
-      </w:r>
-    </w:p>
-    <w:p>
-      <w:r>
-        <w:t>After it commits, the InternSafar table list and ip_users count must still match the baseline taken before PlacementHub was added. If they do not, stop and tell the owner. Do not try to repair InternSafar from this guide.</w:t>
+        <w:t>cat &gt; ph_rollback_drop.sql &lt;&lt; 'SQL'</w:t>
+      </w:r>
+    </w:p>
+    <w:p>
+      <w:r>
+        <w:t>CREATE TEMP TABLE ph_rollback_names (name text);</w:t>
+      </w:r>
+    </w:p>
+    <w:p>
+      <w:r>
+        <w:t>\copy ph_rollback_names FROM 'ph-tables.txt'</w:t>
+      </w:r>
+    </w:p>
+    <w:p>
+      <w:r>
+        <w:t>DO $$</w:t>
+      </w:r>
+    </w:p>
+    <w:p>
+      <w:r>
+        <w:t>DECLARE outside_fk int; outside_view int;</w:t>
+      </w:r>
+    </w:p>
+    <w:p>
+      <w:r>
+        <w:t>BEGIN</w:t>
+      </w:r>
+    </w:p>
+    <w:p>
+      <w:r>
+        <w:t xml:space="preserve">  SELECT count(*) INTO outside_fk</w:t>
+      </w:r>
+    </w:p>
+    <w:p>
+      <w:r>
+        <w:t xml:space="preserve">  FROM pg_constraint c</w:t>
+      </w:r>
+    </w:p>
+    <w:p>
+      <w:r>
+        <w:t xml:space="preserve">  JOIN pg_class src ON src.oid = c.conrelid</w:t>
+      </w:r>
+    </w:p>
+    <w:p>
+      <w:r>
+        <w:t xml:space="preserve">  JOIN pg_namespace src_ns ON src_ns.oid = src.relnamespace</w:t>
+      </w:r>
+    </w:p>
+    <w:p>
+      <w:r>
+        <w:t xml:space="preserve">  JOIN pg_class dst ON dst.oid = c.confrelid</w:t>
+      </w:r>
+    </w:p>
+    <w:p>
+      <w:r>
+        <w:t xml:space="preserve">  JOIN pg_namespace dst_ns ON dst_ns.oid = dst.relnamespace</w:t>
+      </w:r>
+    </w:p>
+    <w:p>
+      <w:r>
+        <w:t xml:space="preserve">  WHERE c.contype = 'f'</w:t>
+      </w:r>
+    </w:p>
+    <w:p>
+      <w:r>
+        <w:t xml:space="preserve">    AND src_ns.nspname = 'public' AND dst_ns.nspname = 'public'</w:t>
+      </w:r>
+    </w:p>
+    <w:p>
+      <w:r>
+        <w:t xml:space="preserve">    AND (</w:t>
+      </w:r>
+    </w:p>
+    <w:p>
+      <w:r>
+        <w:t xml:space="preserve">      (src.relname IN (SELECT name FROM ph_rollback_names) AND dst.relname NOT IN (SELECT name FROM ph_rollback_names))</w:t>
+      </w:r>
+    </w:p>
+    <w:p>
+      <w:r>
+        <w:t xml:space="preserve">      OR</w:t>
+      </w:r>
+    </w:p>
+    <w:p>
+      <w:r>
+        <w:t xml:space="preserve">      (dst.relname IN (SELECT name FROM ph_rollback_names) AND src.relname NOT IN (SELECT name FROM ph_rollback_names))</w:t>
+      </w:r>
+    </w:p>
+    <w:p>
+      <w:r>
+        <w:t xml:space="preserve">    );</w:t>
+      </w:r>
+    </w:p>
+    <w:p>
+      <w:r>
+        <w:t xml:space="preserve">  SELECT count(*) INTO outside_view</w:t>
+      </w:r>
+    </w:p>
+    <w:p>
+      <w:r>
+        <w:t xml:space="preserve">  FROM pg_depend d</w:t>
+      </w:r>
+    </w:p>
+    <w:p>
+      <w:r>
+        <w:t xml:space="preserve">  JOIN pg_rewrite rw ON rw.oid = d.objid</w:t>
+      </w:r>
+    </w:p>
+    <w:p>
+      <w:r>
+        <w:t xml:space="preserve">  JOIN pg_class v ON v.oid = rw.ev_class</w:t>
+      </w:r>
+    </w:p>
+    <w:p>
+      <w:r>
+        <w:t xml:space="preserve">  JOIN pg_class t ON t.oid = d.refobjid</w:t>
+      </w:r>
+    </w:p>
+    <w:p>
+      <w:r>
+        <w:t xml:space="preserve">  JOIN pg_namespace nv ON nv.oid = v.relnamespace</w:t>
+      </w:r>
+    </w:p>
+    <w:p>
+      <w:r>
+        <w:t xml:space="preserve">  JOIN pg_namespace nt ON nt.oid = t.relnamespace</w:t>
+      </w:r>
+    </w:p>
+    <w:p>
+      <w:r>
+        <w:t xml:space="preserve">  WHERE nv.nspname = 'public' AND nt.nspname = 'public'</w:t>
+      </w:r>
+    </w:p>
+    <w:p>
+      <w:r>
+        <w:t xml:space="preserve">    AND t.relname IN (SELECT name FROM ph_rollback_names)</w:t>
+      </w:r>
+    </w:p>
+    <w:p>
+      <w:r>
+        <w:t xml:space="preserve">    AND v.relname NOT IN (SELECT name FROM ph_rollback_names);</w:t>
+      </w:r>
+    </w:p>
+    <w:p>
+      <w:r>
+        <w:t xml:space="preserve">  IF outside_fk &gt; 0 OR outside_view &gt; 0 THEN</w:t>
+      </w:r>
+    </w:p>
+    <w:p>
+      <w:r>
+        <w:t xml:space="preserve">    RAISE EXCEPTION 'STOP: % outside foreign keys and % outside views depend on PlacementHub tables. Do not drop.', outside_fk, outside_view;</w:t>
+      </w:r>
+    </w:p>
+    <w:p>
+      <w:r>
+        <w:t xml:space="preserve">  END IF;</w:t>
+      </w:r>
+    </w:p>
+    <w:p>
+      <w:r>
+        <w:t>END $$;</w:t>
+      </w:r>
+    </w:p>
+    <w:p>
+      <w:r>
+        <w:t>SELECT format('ALTER TABLE public.%I DROP CONSTRAINT %I;', src.relname, c.conname)</w:t>
+      </w:r>
+    </w:p>
+    <w:p>
+      <w:r>
+        <w:t>FROM pg_constraint c</w:t>
+      </w:r>
+    </w:p>
+    <w:p>
+      <w:r>
+        <w:t>JOIN pg_class src ON src.oid = c.conrelid</w:t>
+      </w:r>
+    </w:p>
+    <w:p>
+      <w:r>
+        <w:t>JOIN pg_class dst ON dst.oid = c.confrelid</w:t>
+      </w:r>
+    </w:p>
+    <w:p>
+      <w:r>
+        <w:t>WHERE c.contype = 'f'</w:t>
+      </w:r>
+    </w:p>
+    <w:p>
+      <w:r>
+        <w:t xml:space="preserve">  AND src.relname IN (SELECT name FROM ph_rollback_names)</w:t>
+      </w:r>
+    </w:p>
+    <w:p>
+      <w:r>
+        <w:t xml:space="preserve">  AND dst.relname IN (SELECT name FROM ph_rollback_names);</w:t>
+      </w:r>
+    </w:p>
+    <w:p>
+      <w:r>
+        <w:t>\gexec</w:t>
+      </w:r>
+    </w:p>
+    <w:p>
+      <w:r>
+        <w:t>SELECT format('DROP TABLE IF EXISTS public.%I;', name) FROM ph_rollback_names;</w:t>
+      </w:r>
+    </w:p>
+    <w:p>
+      <w:r>
+        <w:t>\gexec</w:t>
+      </w:r>
+    </w:p>
+    <w:p>
+      <w:r>
+        <w:t>DROP FUNCTION IF EXISTS public.sync_job_posting_is_visible();</w:t>
+      </w:r>
+    </w:p>
+    <w:p>
+      <w:r>
+        <w:t>SQL</w:t>
+      </w:r>
+    </w:p>
+    <w:p>
+      <w:r>
+        <w:t>Read ph_rollback_drop.sql before you run it. It must not contain CASCADE. It must stop if any foreign key or view joins a Placement Hub table to something outside that list. The last statement drops only public.sync_job_posting_is_visible. If that drop fails because something else still uses the function, nothing in the transaction is kept. Do not add CASCADE.</w:t>
+      </w:r>
+    </w:p>
+    <w:p>
+      <w:r>
+        <w:t>psql "$RDS_PSQL" -v ON_ERROR_STOP=1 --single-transaction -f ph_rollback_drop.sql</w:t>
+      </w:r>
+    </w:p>
+    <w:p>
+      <w:r>
+        <w:t>If it stops with the STOP exception, nothing was dropped. Do not write a CASCADE drop to get past it. Tell the owner.</w:t>
+      </w:r>
+    </w:p>
+    <w:p>
+      <w:r>
+        <w:t>After it commits, compare InternSafar with the baseline taken before PlacementHub was added. If the table list or the user count differs, stop and tell the owner. Do not try to repair InternSafar from this guide.</w:t>
       </w:r>
     </w:p>
     <w:p>
@@ -19437,7 +19639,59 @@
         <w:pStyle w:val="Heading2"/>
       </w:pPr>
       <w:r>
-        <w:t>7. Confirm the rollback</w:t>
+        <w:t>7. Leave the swap file</w:t>
+      </w:r>
+    </w:p>
+    <w:p>
+      <w:r>
+        <w:t>Do not run swapoff and do not delete /swapfile. Do not remove its line from /etc/fstab. InternSafar still runs on this server. Removing swap is not part of taking PlacementHub off.</w:t>
+      </w:r>
+    </w:p>
+    <w:p>
+      <w:pPr>
+        <w:pStyle w:val="Heading2"/>
+      </w:pPr>
+      <w:r>
+        <w:t>8. Do not delete the shared file bucket</w:t>
+      </w:r>
+    </w:p>
+    <w:p>
+      <w:r>
+        <w:t>If PlacementHub reused the existing file bucket, do not delete the bucket and do not delete objects that were already there. If the subdomain was added to that bucket’s allowed origins, remove only that origin and leave every other origin. If a new bucket was created only for PlacementHub, leave it until the owner decides. Do not delete it in this step.</w:t>
+      </w:r>
+    </w:p>
+    <w:p>
+      <w:pPr>
+        <w:pStyle w:val="Heading2"/>
+      </w:pPr>
+      <w:r>
+        <w:t>9. Keep the backup until the checks pass</w:t>
+      </w:r>
+    </w:p>
+    <w:p>
+      <w:r>
+        <w:t>Keep the PlacementHub-only database dump, ~/ph-db, and the uploaded archive until the checks below have passed. They are the record of what was removed. Deleting them is a later decision. Do not delete them during this rollback.</w:t>
+      </w:r>
+    </w:p>
+    <w:p>
+      <w:pPr>
+        <w:pStyle w:val="Heading2"/>
+      </w:pPr>
+      <w:r>
+        <w:t>10. Revoke a key only if nothing else uses it</w:t>
+      </w:r>
+    </w:p>
+    <w:p>
+      <w:r>
+        <w:t>If an access key was created only for PlacementHub, and InternSafar and the existing site do not use it, the owner may revoke that key. If a key is shared, do not revoke it. Revoking a shared key would break the service that still uses it.</w:t>
+      </w:r>
+    </w:p>
+    <w:p>
+      <w:pPr>
+        <w:pStyle w:val="Heading2"/>
+      </w:pPr>
+      <w:r>
+        <w:t>11. Confirm the rollback</w:t>
       </w:r>
     </w:p>
     <w:p>
@@ -19457,7 +19711,37 @@
     </w:p>
     <w:p>
       <w:r>
-        <w:t>Expected: InternSafar still answers. https://placementhub.online/ still shows the same homepage. The subdomain no longer points at &lt;ELASTIC_IP&gt;. pm2 shows internsafar only.</w:t>
+        <w:t>cd ~/ph-db</w:t>
+      </w:r>
+    </w:p>
+    <w:p>
+      <w:r>
+        <w:t>psql "$RDS_PSQL" -At -c "select tablename from pg_tables where schemaname='public' and (tablename like 'ip\_%' or tablename like 'ism\_%') order by 1" &gt; ip_tables_after_rollback.txt</w:t>
+      </w:r>
+    </w:p>
+    <w:p>
+      <w:r>
+        <w:t>diff ip_tables_before.txt ip_tables_after_rollback.txt &amp;&amp; echo 'InternSafar table list unchanged'</w:t>
+      </w:r>
+    </w:p>
+    <w:p>
+      <w:r>
+        <w:t>psql "$RDS_PSQL" -At -c "select count(*) from public.ip_users"; cat ip_users_before.txt</w:t>
+      </w:r>
+    </w:p>
+    <w:p>
+      <w:r>
+        <w:t>psql "$RDS_PSQL" -At -c "select tablename from pg_tables where schemaname='public' and tablename in ($(sed "s/.*/'&amp;'/" ph-tables.txt | paste -sd,))"</w:t>
+      </w:r>
+    </w:p>
+    <w:p>
+      <w:r>
+        <w:t>Expected: no PlacementHub table names. The two ip_users numbers match. The diff prints InternSafar table list unchanged.</w:t>
+      </w:r>
+    </w:p>
+    <w:p>
+      <w:r>
+        <w:t>Expected: InternSafar still answers and a sign-in on https://internsafar.com still works. https://placementhub.online/ still shows “PlacementHub — Beyond Placements. Building Industry-Ready Talent.” The subdomain no longer points at &lt;ELASTIC_IP&gt;. pm2 shows internsafar only. The PlacementHub schedule line is gone. No full database restore, server reboot, or InternSafar restart was used.</w:t>
       </w:r>
     </w:p>
     <w:p>
@@ -19638,7 +19922,7 @@
         <w:rPr>
           <w:rtl w:val="0"/>
         </w:rPr>
-        <w:t xml:space="preserve">•  Record in the handover notes: deployed commit, date, archive name, snapshot name.</w:t>
+        <w:t>Record in the handover notes: deployed commit from git log -1, date, archive name, and the server backup file name.</w:t>
       </w:r>
     </w:p>
     <w:p>
@@ -19772,7 +20056,7 @@
           <w:rFonts w:ascii="Arial Unicode MS" w:cs="Arial Unicode MS" w:eastAsia="Arial Unicode MS" w:hAnsi="Arial Unicode MS"/>
           <w:rtl w:val="0"/>
         </w:rPr>
-        <w:t xml:space="preserve">•  ☐ RDS snapshot taken.</w:t>
+        <w:t>Server backup of the current database taken before any Placement Hub change. No RDS console snapshot.</w:t>
       </w:r>
     </w:p>
     <w:p>
@@ -22703,7 +22987,7 @@
         <w:rPr>
           <w:rtl w:val="0"/>
         </w:rPr>
-        <w:t xml:space="preserve">•  PlacementHub source code (GitHub sandeepjain2000/campus-placement-multiuser, commit dd6e3a5) and a read-only check of its current Supabase database — for everything PlacementHub-specific.</w:t>
+        <w:t>PlacementHub source code (GitHub sandeepjain2000/campus-placement-multiuser, branch main, the commit git log -1 prints) and a read-only check of its current Supabase database — for everything PlacementHub-specific. dd6e3a5 is not the deploy commit.</w:t>
       </w:r>
     </w:p>
     <w:p>

</xml_diff>